<commit_message>
fix(docs): refine report layout to eliminate page spillover and blank pages
</commit_message>
<xml_diff>
--- a/รายงาน_Mini_Project_Database_ร้านขาย_E-Book_2026.docx
+++ b/รายงาน_Mini_Project_Database_ร้านขาย_E-Book_2026.docx
@@ -4,7 +4,7 @@
   <w:body>
     <w:p>
       <w:pPr>
-        <w:spacing w:before="160" w:after="280"/>
+        <w:spacing w:after="120"/>
         <w:jc w:val="center"/>
         <w:rPr>
           <w:rFonts w:hint="eastAsia"/>
@@ -15,8 +15,8 @@
           <w:noProof/>
         </w:rPr>
         <w:drawing>
-          <wp:inline distT="0" distB="0" distL="0" distR="0" wp14:anchorId="59BBA671" wp14:editId="0EED1579">
-            <wp:extent cx="1600200" cy="2748344"/>
+          <wp:inline distT="0" distB="0" distL="0" distR="0" wp14:anchorId="357AF34F" wp14:editId="48D4E15C">
+            <wp:extent cx="1234440" cy="2120151"/>
             <wp:effectExtent l="0" t="0" r="0" b="0"/>
             <wp:docPr id="1" name="Picture 1"/>
             <wp:cNvGraphicFramePr>
@@ -38,7 +38,7 @@
                   <pic:spPr>
                     <a:xfrm>
                       <a:off x="0" y="0"/>
-                      <a:ext cx="1600200" cy="2748344"/>
+                      <a:ext cx="1234440" cy="2120151"/>
                     </a:xfrm>
                     <a:prstGeom prst="rect">
                       <a:avLst/>
@@ -53,7 +53,7 @@
     </w:p>
     <w:p>
       <w:pPr>
-        <w:spacing w:after="80"/>
+        <w:spacing w:after="40"/>
         <w:jc w:val="center"/>
         <w:rPr>
           <w:rFonts w:hint="eastAsia"/>
@@ -64,14 +64,13 @@
           <w:rFonts w:eastAsia="TH Sarabun New" w:cs="TH Sarabun New"/>
           <w:b/>
           <w:color w:val="1E3A8A"/>
-          <w:sz w:val="44"/>
+          <w:sz w:val="40"/>
         </w:rPr>
         <w:t>รายงานโครงงานพัฒนาระบบฐานข้อมูล (Mini Project Report)</w:t>
       </w:r>
     </w:p>
     <w:p>
       <w:pPr>
-        <w:spacing w:after="400"/>
         <w:jc w:val="center"/>
         <w:rPr>
           <w:rFonts w:hint="eastAsia"/>
@@ -82,7 +81,7 @@
           <w:rFonts w:eastAsia="TH Sarabun New" w:cs="TH Sarabun New"/>
           <w:b/>
           <w:color w:val="B45309"/>
-          <w:sz w:val="52"/>
+          <w:sz w:val="48"/>
         </w:rPr>
         <w:t>ระบบร้านขายหนังสือและอีบุ๊กออนไลน์</w:t>
       </w:r>
@@ -91,7 +90,7 @@
           <w:rFonts w:eastAsia="TH Sarabun New" w:cs="TH Sarabun New"/>
           <w:b/>
           <w:color w:val="B45309"/>
-          <w:sz w:val="52"/>
+          <w:sz w:val="48"/>
         </w:rPr>
         <w:br/>
         <w:t>(Lampara Books E-Book Store)</w:t>
@@ -99,7 +98,7 @@
     </w:p>
     <w:p>
       <w:pPr>
-        <w:spacing w:after="600"/>
+        <w:spacing w:after="280"/>
         <w:jc w:val="center"/>
         <w:rPr>
           <w:rFonts w:hint="eastAsia"/>
@@ -109,7 +108,7 @@
         <w:rPr>
           <w:rFonts w:eastAsia="TH Sarabun New" w:cs="TH Sarabun New"/>
           <w:color w:val="475569"/>
-          <w:sz w:val="31"/>
+          <w:sz w:val="29"/>
         </w:rPr>
         <w:t>รายวิชา: [31-407-102-301] ระบบฐานข้อมูล (Database Systems)</w:t>
       </w:r>
@@ -117,7 +116,7 @@
         <w:rPr>
           <w:rFonts w:eastAsia="TH Sarabun New" w:cs="TH Sarabun New"/>
           <w:color w:val="475569"/>
-          <w:sz w:val="31"/>
+          <w:sz w:val="29"/>
         </w:rPr>
         <w:br/>
       </w:r>
@@ -125,7 +124,7 @@
         <w:rPr>
           <w:rFonts w:eastAsia="TH Sarabun New" w:cs="TH Sarabun New"/>
           <w:color w:val="475569"/>
-          <w:sz w:val="31"/>
+          <w:sz w:val="29"/>
         </w:rPr>
         <w:t>หลักสูตรวิศวกรรมคอมพิวเตอร์ (ECP) ชั้นปีที่ 3 ห้อง ECP 321</w:t>
       </w:r>
@@ -133,7 +132,7 @@
         <w:rPr>
           <w:rFonts w:eastAsia="TH Sarabun New" w:cs="TH Sarabun New"/>
           <w:color w:val="475569"/>
-          <w:sz w:val="31"/>
+          <w:sz w:val="29"/>
         </w:rPr>
         <w:br/>
       </w:r>
@@ -141,7 +140,7 @@
         <w:rPr>
           <w:rFonts w:eastAsia="TH Sarabun New" w:cs="TH Sarabun New"/>
           <w:color w:val="475569"/>
-          <w:sz w:val="31"/>
+          <w:sz w:val="29"/>
         </w:rPr>
         <w:t>คณะวิศวกรรมศาสตร์และเทคโนโลยี มหาวิทยาลัยเทคโนโลยีราชมงคลอีสาน</w:t>
       </w:r>
@@ -149,7 +148,7 @@
         <w:rPr>
           <w:rFonts w:eastAsia="TH Sarabun New" w:cs="TH Sarabun New"/>
           <w:color w:val="475569"/>
-          <w:sz w:val="31"/>
+          <w:sz w:val="29"/>
         </w:rPr>
         <w:br/>
         <w:t>ภาคการศึกษาที่ 1 ปีการศึกษา 2569</w:t>
@@ -157,7 +156,7 @@
     </w:p>
     <w:p>
       <w:pPr>
-        <w:spacing w:after="480"/>
+        <w:spacing w:after="240"/>
         <w:jc w:val="center"/>
         <w:rPr>
           <w:rFonts w:hint="eastAsia"/>
@@ -167,7 +166,6 @@
         <w:rPr>
           <w:rFonts w:eastAsia="TH Sarabun New" w:cs="TH Sarabun New"/>
           <w:b/>
-          <w:sz w:val="32"/>
         </w:rPr>
         <w:t>อาจารย์ผู้สอน</w:t>
       </w:r>
@@ -175,7 +173,6 @@
         <w:rPr>
           <w:rFonts w:eastAsia="TH Sarabun New" w:cs="TH Sarabun New"/>
           <w:b/>
-          <w:sz w:val="32"/>
         </w:rPr>
         <w:br/>
       </w:r>
@@ -184,14 +181,14 @@
           <w:rFonts w:eastAsia="TH Sarabun New" w:cs="TH Sarabun New"/>
           <w:b/>
           <w:color w:val="0F172A"/>
-          <w:sz w:val="36"/>
+          <w:sz w:val="34"/>
         </w:rPr>
         <w:t>อาจารย์ประภาส ผ่องสนาม</w:t>
       </w:r>
     </w:p>
     <w:p>
       <w:pPr>
-        <w:spacing w:after="720"/>
+        <w:spacing w:after="280"/>
         <w:jc w:val="center"/>
         <w:rPr>
           <w:rFonts w:hint="eastAsia"/>
@@ -201,7 +198,6 @@
         <w:rPr>
           <w:rFonts w:eastAsia="TH Sarabun New" w:cs="TH Sarabun New"/>
           <w:b/>
-          <w:sz w:val="32"/>
         </w:rPr>
         <w:t>จัดทำโดย</w:t>
       </w:r>
@@ -209,7 +205,6 @@
         <w:rPr>
           <w:rFonts w:eastAsia="TH Sarabun New" w:cs="TH Sarabun New"/>
           <w:b/>
-          <w:sz w:val="32"/>
         </w:rPr>
         <w:br/>
       </w:r>
@@ -218,7 +213,7 @@
           <w:rFonts w:eastAsia="TH Sarabun New" w:cs="TH Sarabun New"/>
           <w:b/>
           <w:color w:val="0F172A"/>
-          <w:sz w:val="36"/>
+          <w:sz w:val="34"/>
         </w:rPr>
         <w:t>นายกานต์นิธิ ยะโส</w:t>
       </w:r>
@@ -227,19 +222,21 @@
           <w:rFonts w:eastAsia="TH Sarabun New" w:cs="TH Sarabun New"/>
           <w:b/>
           <w:color w:val="0F172A"/>
-          <w:sz w:val="36"/>
+          <w:sz w:val="34"/>
         </w:rPr>
         <w:br/>
       </w:r>
       <w:r>
         <w:rPr>
           <w:rFonts w:eastAsia="TH Sarabun New" w:cs="TH Sarabun New"/>
+          <w:sz w:val="28"/>
         </w:rPr>
         <w:t>รหัสนักศึกษา: 67332110223-9  กลุ่มเรียน: ECP3N</w:t>
       </w:r>
     </w:p>
     <w:p>
       <w:pPr>
+        <w:spacing w:after="0"/>
         <w:jc w:val="center"/>
         <w:rPr>
           <w:rFonts w:hint="eastAsia"/>
@@ -249,16 +246,15 @@
         <w:rPr>
           <w:rFonts w:eastAsia="TH Sarabun New" w:cs="TH Sarabun New"/>
           <w:color w:val="64748B"/>
-          <w:sz w:val="28"/>
-        </w:rPr>
-        <w:lastRenderedPageBreak/>
+          <w:sz w:val="26"/>
+        </w:rPr>
         <w:t>ภาควิชาวิศวกรรมคอมพิวเตอร์ คณะวิศวกรรมศาสตร์และเทคโนโลยี</w:t>
       </w:r>
       <w:r>
         <w:rPr>
           <w:rFonts w:eastAsia="TH Sarabun New" w:cs="TH Sarabun New"/>
           <w:color w:val="64748B"/>
-          <w:sz w:val="28"/>
+          <w:sz w:val="26"/>
         </w:rPr>
         <w:br/>
       </w:r>
@@ -266,7 +262,7 @@
         <w:rPr>
           <w:rFonts w:eastAsia="TH Sarabun New" w:cs="TH Sarabun New"/>
           <w:color w:val="64748B"/>
-          <w:sz w:val="28"/>
+          <w:sz w:val="26"/>
         </w:rPr>
         <w:t>มหาวิทยาลัยเทคโนโลยีราชมงคลอีสาน นครราชสีมา</w:t>
       </w:r>
@@ -1596,15 +1592,7 @@
           <w:sz w:val="40"/>
         </w:rPr>
         <w:lastRenderedPageBreak/>
-        <w:t xml:space="preserve">บทที่ 1: </w:t>
-      </w:r>
-      <w:r>
-        <w:rPr>
-          <w:rFonts w:ascii="TH Sarabun New" w:eastAsia="TH Sarabun New" w:hAnsi="TH Sarabun New" w:cs="TH Sarabun New"/>
-          <w:color w:val="1E3A8A"/>
-          <w:sz w:val="40"/>
-        </w:rPr>
-        <w:t>บทนำและวัตถุประสงค์ของโครงงาน</w:t>
+        <w:t>บทที่ 1: บทนำและวัตถุประสงค์ของโครงงาน</w:t>
       </w:r>
     </w:p>
     <w:p>
@@ -13419,7 +13407,7 @@
     </w:tbl>
     <w:p>
       <w:pPr>
-        <w:spacing w:after="80"/>
+        <w:spacing w:after="40"/>
         <w:rPr>
           <w:rFonts w:hint="eastAsia"/>
         </w:rPr>
@@ -13729,14 +13717,7 @@
           <w:rFonts w:eastAsia="TH Sarabun New" w:cs="TH Sarabun New"/>
           <w:color w:val="1E293B"/>
         </w:rPr>
-        <w:t xml:space="preserve">คำสั่ง SQL Query (JOIN, GROUP BY, SUM, COUNT, AVG, </w:t>
-      </w:r>
-      <w:r>
-        <w:rPr>
-          <w:rFonts w:eastAsia="TH Sarabun New" w:cs="TH Sarabun New"/>
-          <w:color w:val="1E293B"/>
-        </w:rPr>
-        <w:t>TO_CHAR):</w:t>
+        <w:t>คำสั่ง SQL Query (JOIN, GROUP BY, SUM, COUNT, AVG, TO_CHAR):</w:t>
       </w:r>
     </w:p>
     <w:tbl>
@@ -13846,13 +13827,6 @@
                 <w:sz w:val="19"/>
               </w:rPr>
               <w:br/>
-            </w:r>
-            <w:r>
-              <w:rPr>
-                <w:rFonts w:ascii="Consolas" w:eastAsia="Consolas" w:hAnsi="Consolas" w:cs="Consolas"/>
-                <w:color w:val="0F172A"/>
-                <w:sz w:val="19"/>
-              </w:rPr>
               <w:t>GROUP BY TO_CHAR(o.created_at, 'YYYY-MM')</w:t>
             </w:r>
             <w:r>
@@ -13870,7 +13844,7 @@
     </w:tbl>
     <w:p>
       <w:pPr>
-        <w:spacing w:after="80"/>
+        <w:spacing w:after="40"/>
         <w:rPr>
           <w:rFonts w:hint="eastAsia"/>
         </w:rPr>
@@ -14640,15 +14614,7 @@
           <w:b/>
           <w:color w:val="1E293B"/>
         </w:rPr>
-        <w:t xml:space="preserve">คำถามทางธุรกิจ: E-Book ใดขายได้มากที่สุด 5 </w:t>
-      </w:r>
-      <w:r>
-        <w:rPr>
-          <w:rFonts w:eastAsia="TH Sarabun New" w:cs="TH Sarabun New"/>
-          <w:b/>
-          <w:color w:val="1E293B"/>
-        </w:rPr>
-        <w:t>อันดับแรกตามจำนวนเล่มและยอดขายรวม?</w:t>
+        <w:t>คำถามทางธุรกิจ: E-Book ใดขายได้มากที่สุด 5 อันดับแรกตามจำนวนเล่มและยอดขายรวม?</w:t>
       </w:r>
     </w:p>
     <w:p>
@@ -14884,7 +14850,7 @@
     </w:tbl>
     <w:p>
       <w:pPr>
-        <w:spacing w:after="80"/>
+        <w:spacing w:after="40"/>
         <w:rPr>
           <w:rFonts w:hint="eastAsia"/>
         </w:rPr>
@@ -15353,7 +15319,15 @@
                 <w:color w:val="1E293B"/>
                 <w:sz w:val="19"/>
               </w:rPr>
-              <w:t>The Quiet Algorithm</w:t>
+              <w:t xml:space="preserve">The Quiet </w:t>
+            </w:r>
+            <w:r>
+              <w:rPr>
+                <w:rFonts w:eastAsia="TH Sarabun New" w:cs="TH Sarabun New"/>
+                <w:color w:val="1E293B"/>
+                <w:sz w:val="19"/>
+              </w:rPr>
+              <w:t>Algorithm</w:t>
             </w:r>
           </w:p>
         </w:tc>
@@ -16121,7 +16095,15 @@
           <w:b/>
           <w:color w:val="1E293B"/>
         </w:rPr>
-        <w:t>คำถามทางธุรกิจ: หมวดหมู่ใดสร้างยอดขายและจำนวนรายการสั่งซื้อได้สูงสุด?</w:t>
+        <w:t xml:space="preserve">คำถามทางธุรกิจ: </w:t>
+      </w:r>
+      <w:r>
+        <w:rPr>
+          <w:rFonts w:eastAsia="TH Sarabun New" w:cs="TH Sarabun New"/>
+          <w:b/>
+          <w:color w:val="1E293B"/>
+        </w:rPr>
+        <w:t>หมวดหมู่ใดสร้างยอดขายและจำนวนรายการสั่งซื้อได้สูงสุด?</w:t>
       </w:r>
     </w:p>
     <w:p>
@@ -16306,7 +16288,7 @@
     </w:tbl>
     <w:p>
       <w:pPr>
-        <w:spacing w:after="80"/>
+        <w:spacing w:after="40"/>
         <w:rPr>
           <w:rFonts w:hint="eastAsia"/>
         </w:rPr>
@@ -17617,7 +17599,7 @@
     </w:tbl>
     <w:p>
       <w:pPr>
-        <w:spacing w:after="80"/>
+        <w:spacing w:after="40"/>
         <w:rPr>
           <w:rFonts w:hint="eastAsia"/>
         </w:rPr>
@@ -19034,7 +19016,7 @@
     </w:tbl>
     <w:p>
       <w:pPr>
-        <w:spacing w:after="240"/>
+        <w:spacing w:after="120"/>
         <w:rPr>
           <w:rFonts w:hint="eastAsia"/>
         </w:rPr>
@@ -19071,7 +19053,6 @@
         </w:rPr>
       </w:pPr>
       <w:r>
-        <w:lastRenderedPageBreak/>
         <w:br w:type="page"/>
       </w:r>
     </w:p>
@@ -19136,7 +19117,8 @@
     </w:p>
     <w:p>
       <w:pPr>
-        <w:spacing w:before="160" w:after="80"/>
+        <w:keepNext/>
+        <w:spacing w:before="80" w:after="40"/>
         <w:jc w:val="center"/>
         <w:rPr>
           <w:rFonts w:hint="eastAsia"/>
@@ -19147,8 +19129,8 @@
           <w:noProof/>
         </w:rPr>
         <w:drawing>
-          <wp:inline distT="0" distB="0" distL="0" distR="0" wp14:anchorId="385D73F6" wp14:editId="74367643">
-            <wp:extent cx="5120640" cy="2586990"/>
+          <wp:inline distT="0" distB="0" distL="0" distR="0" wp14:anchorId="29D66116" wp14:editId="20575A97">
+            <wp:extent cx="4297680" cy="2171224"/>
             <wp:effectExtent l="0" t="0" r="0" b="0"/>
             <wp:docPr id="2" name="Picture 2"/>
             <wp:cNvGraphicFramePr>
@@ -19170,7 +19152,7 @@
                   <pic:spPr>
                     <a:xfrm>
                       <a:off x="0" y="0"/>
-                      <a:ext cx="5120640" cy="2586990"/>
+                      <a:ext cx="4297680" cy="2171224"/>
                     </a:xfrm>
                     <a:prstGeom prst="rect">
                       <a:avLst/>
@@ -19185,7 +19167,7 @@
     </w:p>
     <w:p>
       <w:pPr>
-        <w:spacing w:before="40" w:after="240"/>
+        <w:spacing w:before="40" w:after="160"/>
         <w:jc w:val="center"/>
         <w:rPr>
           <w:rFonts w:hint="eastAsia"/>
@@ -19196,7 +19178,7 @@
           <w:rFonts w:eastAsia="TH Sarabun New" w:cs="TH Sarabun New"/>
           <w:b/>
           <w:color w:val="475569"/>
-          <w:sz w:val="25"/>
+          <w:sz w:val="23"/>
         </w:rPr>
         <w:t>ภาพที่ 5.1: หน้าต่างเข้าสู่ระบบและสมัครสมาชิกแบบ Email &amp; Password พร้อมปุ่มสลับบทบาททดสอบด่วน</w:t>
       </w:r>
@@ -19261,7 +19243,8 @@
     </w:p>
     <w:p>
       <w:pPr>
-        <w:spacing w:before="160" w:after="80"/>
+        <w:keepNext/>
+        <w:spacing w:before="80" w:after="40"/>
         <w:jc w:val="center"/>
         <w:rPr>
           <w:rFonts w:hint="eastAsia"/>
@@ -19273,8 +19256,8 @@
         </w:rPr>
         <w:lastRenderedPageBreak/>
         <w:drawing>
-          <wp:inline distT="0" distB="0" distL="0" distR="0" wp14:anchorId="6863D6A2" wp14:editId="592DED13">
-            <wp:extent cx="5120640" cy="2586990"/>
+          <wp:inline distT="0" distB="0" distL="0" distR="0" wp14:anchorId="523B2547" wp14:editId="4211E724">
+            <wp:extent cx="4297680" cy="2171224"/>
             <wp:effectExtent l="0" t="0" r="0" b="0"/>
             <wp:docPr id="3" name="Picture 3"/>
             <wp:cNvGraphicFramePr>
@@ -19296,7 +19279,7 @@
                   <pic:spPr>
                     <a:xfrm>
                       <a:off x="0" y="0"/>
-                      <a:ext cx="5120640" cy="2586990"/>
+                      <a:ext cx="4297680" cy="2171224"/>
                     </a:xfrm>
                     <a:prstGeom prst="rect">
                       <a:avLst/>
@@ -19311,7 +19294,7 @@
     </w:p>
     <w:p>
       <w:pPr>
-        <w:spacing w:before="40" w:after="240"/>
+        <w:spacing w:before="40" w:after="160"/>
         <w:jc w:val="center"/>
         <w:rPr>
           <w:rFonts w:hint="eastAsia"/>
@@ -19322,7 +19305,7 @@
           <w:rFonts w:eastAsia="TH Sarabun New" w:cs="TH Sarabun New"/>
           <w:b/>
           <w:color w:val="475569"/>
-          <w:sz w:val="25"/>
+          <w:sz w:val="23"/>
         </w:rPr>
         <w:t>ภาพที่ 5.2: หน้าต่างแก้ไขข้อมูลพื้นฐานและระบุบัญชีธนาคารสำหรับยืนยันตัวตน (Profile Settings Modal)</w:t>
       </w:r>
@@ -19366,7 +19349,8 @@
     </w:p>
     <w:p>
       <w:pPr>
-        <w:spacing w:before="160" w:after="80"/>
+        <w:keepNext/>
+        <w:spacing w:before="80" w:after="40"/>
         <w:jc w:val="center"/>
         <w:rPr>
           <w:rFonts w:hint="eastAsia"/>
@@ -19377,8 +19361,8 @@
           <w:noProof/>
         </w:rPr>
         <w:drawing>
-          <wp:inline distT="0" distB="0" distL="0" distR="0" wp14:anchorId="51ECE524" wp14:editId="081F7DDC">
-            <wp:extent cx="5120640" cy="2586990"/>
+          <wp:inline distT="0" distB="0" distL="0" distR="0" wp14:anchorId="43DD1B75" wp14:editId="14732701">
+            <wp:extent cx="4389120" cy="2217420"/>
             <wp:effectExtent l="0" t="0" r="0" b="0"/>
             <wp:docPr id="4" name="Picture 4"/>
             <wp:cNvGraphicFramePr>
@@ -19400,7 +19384,7 @@
                   <pic:spPr>
                     <a:xfrm>
                       <a:off x="0" y="0"/>
-                      <a:ext cx="5120640" cy="2586990"/>
+                      <a:ext cx="4389120" cy="2217420"/>
                     </a:xfrm>
                     <a:prstGeom prst="rect">
                       <a:avLst/>
@@ -19415,7 +19399,7 @@
     </w:p>
     <w:p>
       <w:pPr>
-        <w:spacing w:before="40" w:after="240"/>
+        <w:spacing w:before="40" w:after="160"/>
         <w:jc w:val="center"/>
         <w:rPr>
           <w:rFonts w:hint="eastAsia"/>
@@ -19426,7 +19410,7 @@
           <w:rFonts w:eastAsia="TH Sarabun New" w:cs="TH Sarabun New"/>
           <w:b/>
           <w:color w:val="475569"/>
-          <w:sz w:val="25"/>
+          <w:sz w:val="23"/>
         </w:rPr>
         <w:t>ภาพที่ 5.3: แถบเมนูด้านบนของผู้ใช้ทั่วไป (Customer) ที่ซ่อนปุ่ม 'หลังบ้าน' อย่างมิดชิด</w:t>
       </w:r>
@@ -19448,7 +19432,8 @@
     </w:p>
     <w:p>
       <w:pPr>
-        <w:spacing w:before="160" w:after="80"/>
+        <w:keepNext/>
+        <w:spacing w:before="80" w:after="40"/>
         <w:jc w:val="center"/>
         <w:rPr>
           <w:rFonts w:hint="eastAsia"/>
@@ -19460,8 +19445,8 @@
         </w:rPr>
         <w:lastRenderedPageBreak/>
         <w:drawing>
-          <wp:inline distT="0" distB="0" distL="0" distR="0" wp14:anchorId="3B2C03FD" wp14:editId="22A1DB0D">
-            <wp:extent cx="5120640" cy="2586990"/>
+          <wp:inline distT="0" distB="0" distL="0" distR="0" wp14:anchorId="20AC207D" wp14:editId="06672E0F">
+            <wp:extent cx="4297680" cy="2171224"/>
             <wp:effectExtent l="0" t="0" r="0" b="0"/>
             <wp:docPr id="5" name="Picture 5"/>
             <wp:cNvGraphicFramePr>
@@ -19483,7 +19468,7 @@
                   <pic:spPr>
                     <a:xfrm>
                       <a:off x="0" y="0"/>
-                      <a:ext cx="5120640" cy="2586990"/>
+                      <a:ext cx="4297680" cy="2171224"/>
                     </a:xfrm>
                     <a:prstGeom prst="rect">
                       <a:avLst/>
@@ -19498,7 +19483,7 @@
     </w:p>
     <w:p>
       <w:pPr>
-        <w:spacing w:before="40" w:after="240"/>
+        <w:spacing w:before="40" w:after="160"/>
         <w:jc w:val="center"/>
         <w:rPr>
           <w:rFonts w:hint="eastAsia"/>
@@ -19509,7 +19494,7 @@
           <w:rFonts w:eastAsia="TH Sarabun New" w:cs="TH Sarabun New"/>
           <w:b/>
           <w:color w:val="475569"/>
-          <w:sz w:val="25"/>
+          <w:sz w:val="23"/>
         </w:rPr>
         <w:t>ภาพที่ 5.4: ระบบความปลอดภัย Route Guard แสดงหน้า 403 Forbidden Access Denied เมื่อตรวจพบว่าไม่ใช่แอดมิน</w:t>
       </w:r>
@@ -19531,7 +19516,8 @@
     </w:p>
     <w:p>
       <w:pPr>
-        <w:spacing w:before="160" w:after="80"/>
+        <w:keepNext/>
+        <w:spacing w:before="80" w:after="40"/>
         <w:jc w:val="center"/>
         <w:rPr>
           <w:rFonts w:hint="eastAsia"/>
@@ -19542,8 +19528,8 @@
           <w:noProof/>
         </w:rPr>
         <w:drawing>
-          <wp:inline distT="0" distB="0" distL="0" distR="0" wp14:anchorId="365D48E8" wp14:editId="33C2B530">
-            <wp:extent cx="5120640" cy="2586990"/>
+          <wp:inline distT="0" distB="0" distL="0" distR="0" wp14:anchorId="3F5EB656" wp14:editId="2F85E69F">
+            <wp:extent cx="4389120" cy="2217420"/>
             <wp:effectExtent l="0" t="0" r="0" b="0"/>
             <wp:docPr id="6" name="Picture 6"/>
             <wp:cNvGraphicFramePr>
@@ -19565,7 +19551,7 @@
                   <pic:spPr>
                     <a:xfrm>
                       <a:off x="0" y="0"/>
-                      <a:ext cx="5120640" cy="2586990"/>
+                      <a:ext cx="4389120" cy="2217420"/>
                     </a:xfrm>
                     <a:prstGeom prst="rect">
                       <a:avLst/>
@@ -19580,7 +19566,7 @@
     </w:p>
     <w:p>
       <w:pPr>
-        <w:spacing w:before="40" w:after="240"/>
+        <w:spacing w:before="40" w:after="160"/>
         <w:jc w:val="center"/>
         <w:rPr>
           <w:rFonts w:hint="eastAsia"/>
@@ -19591,7 +19577,7 @@
           <w:rFonts w:eastAsia="TH Sarabun New" w:cs="TH Sarabun New"/>
           <w:b/>
           <w:color w:val="475569"/>
-          <w:sz w:val="25"/>
+          <w:sz w:val="23"/>
         </w:rPr>
         <w:t>ภาพที่ 5.5: แถบเมนูด้านบนของสิทธิ์ผู้ดูแลระบบ (Admin) ที่แสดงปุ่ม 'หลังบ้าน' พร้อมสถานะสิทธิ์</w:t>
       </w:r>
@@ -19635,7 +19621,8 @@
     </w:p>
     <w:p>
       <w:pPr>
-        <w:spacing w:before="160" w:after="80"/>
+        <w:keepNext/>
+        <w:spacing w:before="80" w:after="40"/>
         <w:jc w:val="center"/>
         <w:rPr>
           <w:rFonts w:hint="eastAsia"/>
@@ -19647,8 +19634,8 @@
         </w:rPr>
         <w:lastRenderedPageBreak/>
         <w:drawing>
-          <wp:inline distT="0" distB="0" distL="0" distR="0" wp14:anchorId="4FADC229" wp14:editId="57FE82EC">
-            <wp:extent cx="5120640" cy="2586990"/>
+          <wp:inline distT="0" distB="0" distL="0" distR="0" wp14:anchorId="3EED3263" wp14:editId="2CB2C487">
+            <wp:extent cx="4297680" cy="2171224"/>
             <wp:effectExtent l="0" t="0" r="0" b="0"/>
             <wp:docPr id="7" name="Picture 7"/>
             <wp:cNvGraphicFramePr>
@@ -19670,7 +19657,7 @@
                   <pic:spPr>
                     <a:xfrm>
                       <a:off x="0" y="0"/>
-                      <a:ext cx="5120640" cy="2586990"/>
+                      <a:ext cx="4297680" cy="2171224"/>
                     </a:xfrm>
                     <a:prstGeom prst="rect">
                       <a:avLst/>
@@ -19685,7 +19672,7 @@
     </w:p>
     <w:p>
       <w:pPr>
-        <w:spacing w:before="40" w:after="240"/>
+        <w:spacing w:before="40" w:after="160"/>
         <w:jc w:val="center"/>
         <w:rPr>
           <w:rFonts w:hint="eastAsia"/>
@@ -19696,7 +19683,7 @@
           <w:rFonts w:eastAsia="TH Sarabun New" w:cs="TH Sarabun New"/>
           <w:b/>
           <w:color w:val="475569"/>
-          <w:sz w:val="25"/>
+          <w:sz w:val="23"/>
         </w:rPr>
         <w:t>ภาพที่ 5.6: หน้าต่างจัดการหมวดหมู่หนังสือในระบบหลังบ้าน (Category Management Modal)</w:t>
       </w:r>
@@ -19740,7 +19727,8 @@
     </w:p>
     <w:p>
       <w:pPr>
-        <w:spacing w:before="160" w:after="80"/>
+        <w:keepNext/>
+        <w:spacing w:before="80" w:after="40"/>
         <w:jc w:val="center"/>
         <w:rPr>
           <w:rFonts w:hint="eastAsia"/>
@@ -19751,8 +19739,8 @@
           <w:noProof/>
         </w:rPr>
         <w:drawing>
-          <wp:inline distT="0" distB="0" distL="0" distR="0" wp14:anchorId="59F18461" wp14:editId="2170659E">
-            <wp:extent cx="5120640" cy="2586990"/>
+          <wp:inline distT="0" distB="0" distL="0" distR="0" wp14:anchorId="612A2A3C" wp14:editId="29A32CAB">
+            <wp:extent cx="4297680" cy="2171224"/>
             <wp:effectExtent l="0" t="0" r="0" b="0"/>
             <wp:docPr id="8" name="Picture 8"/>
             <wp:cNvGraphicFramePr>
@@ -19774,7 +19762,7 @@
                   <pic:spPr>
                     <a:xfrm>
                       <a:off x="0" y="0"/>
-                      <a:ext cx="5120640" cy="2586990"/>
+                      <a:ext cx="4297680" cy="2171224"/>
                     </a:xfrm>
                     <a:prstGeom prst="rect">
                       <a:avLst/>
@@ -19789,7 +19777,7 @@
     </w:p>
     <w:p>
       <w:pPr>
-        <w:spacing w:before="40" w:after="240"/>
+        <w:spacing w:before="40" w:after="160"/>
         <w:jc w:val="center"/>
         <w:rPr>
           <w:rFonts w:hint="eastAsia"/>
@@ -19800,7 +19788,7 @@
           <w:rFonts w:eastAsia="TH Sarabun New" w:cs="TH Sarabun New"/>
           <w:b/>
           <w:color w:val="475569"/>
-          <w:sz w:val="25"/>
+          <w:sz w:val="23"/>
         </w:rPr>
         <w:t xml:space="preserve">ภาพที่ 5.7: </w:t>
       </w:r>
@@ -19809,7 +19797,7 @@
           <w:rFonts w:eastAsia="TH Sarabun New" w:cs="TH Sarabun New"/>
           <w:b/>
           <w:color w:val="475569"/>
-          <w:sz w:val="25"/>
+          <w:sz w:val="23"/>
         </w:rPr>
         <w:t>หน้าจอรายงานวิเคราะห์ธุรกิจ 4 ด้าน พร้อมปุ่ม Export CSV ที่อัปเดตข้อมูลสดตามการซื้อขายจริง</w:t>
       </w:r>
@@ -20337,23 +20325,7 @@
                 <w:color w:val="1E293B"/>
                 <w:sz w:val="19"/>
               </w:rPr>
-              <w:t xml:space="preserve">รหัสผ่าน '123' </w:t>
-            </w:r>
-            <w:r>
-              <w:rPr>
-                <w:rFonts w:eastAsia="TH Sarabun New" w:cs="TH Sarabun New"/>
-                <w:color w:val="1E293B"/>
-                <w:sz w:val="19"/>
-              </w:rPr>
-              <w:t>(</w:t>
-            </w:r>
-            <w:r>
-              <w:rPr>
-                <w:rFonts w:eastAsia="TH Sarabun New" w:cs="TH Sarabun New"/>
-                <w:color w:val="1E293B"/>
-                <w:sz w:val="19"/>
-              </w:rPr>
-              <w:t>น้อยกว่า 6 ตัวอักษร)</w:t>
+              <w:t>รหัสผ่าน '123' (น้อยกว่า 6 ตัวอักษร)</w:t>
             </w:r>
           </w:p>
         </w:tc>
@@ -20744,7 +20716,15 @@
                 <w:color w:val="1E293B"/>
                 <w:sz w:val="19"/>
               </w:rPr>
-              <w:t>ไม่อนุญาตให้ดาวน์โหลด แสดงสถานะรอตรวจสอบ</w:t>
+              <w:t xml:space="preserve">ไม่อนุญาตให้ดาวน์โหลด </w:t>
+            </w:r>
+            <w:r>
+              <w:rPr>
+                <w:rFonts w:eastAsia="TH Sarabun New" w:cs="TH Sarabun New"/>
+                <w:color w:val="1E293B"/>
+                <w:sz w:val="19"/>
+              </w:rPr>
+              <w:t>แสดงสถานะรอตรวจสอบ</w:t>
             </w:r>
           </w:p>
         </w:tc>
@@ -20773,15 +20753,7 @@
                 <w:color w:val="1E293B"/>
                 <w:sz w:val="19"/>
               </w:rPr>
-              <w:t xml:space="preserve">ปุ่มดาวน์โหลดถูกล็อก </w:t>
-            </w:r>
-            <w:r>
-              <w:rPr>
-                <w:rFonts w:eastAsia="TH Sarabun New" w:cs="TH Sarabun New"/>
-                <w:color w:val="1E293B"/>
-                <w:sz w:val="19"/>
-              </w:rPr>
-              <w:t>และขึ้นข้อความรอแอดมิน</w:t>
+              <w:t>ปุ่มดาวน์โหลดถูกล็อก และขึ้นข้อความรอแอดมิน</w:t>
             </w:r>
           </w:p>
         </w:tc>
@@ -21290,7 +21262,15 @@
                 <w:color w:val="1E293B"/>
                 <w:sz w:val="19"/>
               </w:rPr>
-              <w:t>ลูกค้าพิมพ์ URL http://localhost:3000/admin</w:t>
+              <w:t xml:space="preserve">ลูกค้าพิมพ์ URL </w:t>
+            </w:r>
+            <w:r>
+              <w:rPr>
+                <w:rFonts w:eastAsia="TH Sarabun New" w:cs="TH Sarabun New"/>
+                <w:color w:val="1E293B"/>
+                <w:sz w:val="19"/>
+              </w:rPr>
+              <w:t>http://localhost:3000/admin</w:t>
             </w:r>
           </w:p>
         </w:tc>
@@ -21348,23 +21328,7 @@
                 <w:color w:val="1E293B"/>
                 <w:sz w:val="19"/>
               </w:rPr>
-              <w:t xml:space="preserve">ระบบตัดเข้าหน้า 403 Access </w:t>
-            </w:r>
-            <w:r>
-              <w:rPr>
-                <w:rFonts w:eastAsia="TH Sarabun New" w:cs="TH Sarabun New"/>
-                <w:color w:val="1E293B"/>
-                <w:sz w:val="19"/>
-              </w:rPr>
-              <w:t xml:space="preserve">Denied </w:t>
-            </w:r>
-            <w:r>
-              <w:rPr>
-                <w:rFonts w:eastAsia="TH Sarabun New" w:cs="TH Sarabun New"/>
-                <w:color w:val="1E293B"/>
-                <w:sz w:val="19"/>
-              </w:rPr>
-              <w:t>ทันที</w:t>
+              <w:t>ระบบตัดเข้าหน้า 403 Access Denied ทันที</w:t>
             </w:r>
           </w:p>
         </w:tc>
@@ -21545,7 +21509,15 @@
                 <w:color w:val="1E293B"/>
                 <w:sz w:val="19"/>
               </w:rPr>
-              <w:t>ได้ไฟล์ CSV พร้อม UTF-8 BOM อ่านไทยได้ 100%</w:t>
+              <w:t xml:space="preserve">ได้ไฟล์ CSV พร้อม UTF-8 BOM </w:t>
+            </w:r>
+            <w:r>
+              <w:rPr>
+                <w:rFonts w:eastAsia="TH Sarabun New" w:cs="TH Sarabun New"/>
+                <w:color w:val="1E293B"/>
+                <w:sz w:val="19"/>
+              </w:rPr>
+              <w:t>อ่านไทยได้ 100%</w:t>
             </w:r>
           </w:p>
         </w:tc>
@@ -21602,15 +21574,7 @@
           <w:sz w:val="40"/>
         </w:rPr>
         <w:lastRenderedPageBreak/>
-        <w:t xml:space="preserve">บทที่ 7: </w:t>
-      </w:r>
-      <w:r>
-        <w:rPr>
-          <w:rFonts w:ascii="TH Sarabun New" w:eastAsia="TH Sarabun New" w:hAnsi="TH Sarabun New" w:cs="TH Sarabun New"/>
-          <w:color w:val="1E3A8A"/>
-          <w:sz w:val="40"/>
-        </w:rPr>
-        <w:t>การประยุกต์ใช้ปัญญาประดิษฐ์อย่างรับผิดชอบ (AI Usage Log)</w:t>
+        <w:t>บทที่ 7: การประยุกต์ใช้ปัญญาประดิษฐ์อย่างรับผิดชอบ (AI Usage Log)</w:t>
       </w:r>
     </w:p>
     <w:p>
@@ -21625,7 +21589,14 @@
           <w:rFonts w:eastAsia="TH Sarabun New" w:cs="TH Sarabun New"/>
           <w:color w:val="1E293B"/>
         </w:rPr>
-        <w:t>ตามข้อกำหนดใบงานข้อ 12 นักศึกษาได้บันทึกการประยุกต์ใช้ AI เพื่อเป็นหลักฐานความโปร่งใสและแสดงการตรวจทานด้วยตนเองดังนี้:</w:t>
+        <w:t xml:space="preserve">ตามข้อกำหนดใบงานข้อ 12 นักศึกษาได้บันทึกการประยุกต์ใช้ AI </w:t>
+      </w:r>
+      <w:r>
+        <w:rPr>
+          <w:rFonts w:eastAsia="TH Sarabun New" w:cs="TH Sarabun New"/>
+          <w:color w:val="1E293B"/>
+        </w:rPr>
+        <w:t>เพื่อเป็นหลักฐานความโปร่งใสและแสดงการตรวจทานด้วยตนเองดังนี้:</w:t>
       </w:r>
     </w:p>
     <w:tbl>
@@ -21906,7 +21877,15 @@
                 <w:color w:val="1E293B"/>
                 <w:sz w:val="20"/>
               </w:rPr>
-              <w:t>ช่วยออกแบบ ERD และโครงสร้าง 9 ตารางสำหรับร้านขาย E-Book ให้ตรงหลัก 3NF และมี Foreign Key ครบถ้วน</w:t>
+              <w:t xml:space="preserve">ช่วยออกแบบ ERD และโครงสร้าง 9 ตารางสำหรับร้านขาย E-Book </w:t>
+            </w:r>
+            <w:r>
+              <w:rPr>
+                <w:rFonts w:eastAsia="TH Sarabun New" w:cs="TH Sarabun New"/>
+                <w:color w:val="1E293B"/>
+                <w:sz w:val="20"/>
+              </w:rPr>
+              <w:t>ให้ตรงหลัก 3NF และมี Foreign Key ครบถ้วน</w:t>
             </w:r>
           </w:p>
         </w:tc>
@@ -21935,15 +21914,7 @@
                 <w:color w:val="1E293B"/>
                 <w:sz w:val="20"/>
               </w:rPr>
-              <w:t xml:space="preserve">นำโครงร่าง DDL </w:t>
-            </w:r>
-            <w:r>
-              <w:rPr>
-                <w:rFonts w:eastAsia="TH Sarabun New" w:cs="TH Sarabun New"/>
-                <w:color w:val="1E293B"/>
-                <w:sz w:val="20"/>
-              </w:rPr>
-              <w:t>และความสัมพันธ์ของตารางมาใช้เป็นจุดเริ่มต้น</w:t>
+              <w:t>นำโครงร่าง DDL และความสัมพันธ์ของตารางมาใช้เป็นจุดเริ่มต้น</w:t>
             </w:r>
           </w:p>
         </w:tc>
@@ -22074,7 +22045,7 @@
                 <w:color w:val="1E293B"/>
                 <w:sz w:val="20"/>
               </w:rPr>
-              <w:t xml:space="preserve">ช่วยเขียน SQL Query รายงาน 4 ด้านตามเกณฑ์อาจารย์ประภาส ที่ใช้ JOIN, GROUP BY, </w:t>
+              <w:t xml:space="preserve">ช่วยเขียน SQL Query รายงาน 4 </w:t>
             </w:r>
             <w:r>
               <w:rPr>
@@ -22082,7 +22053,7 @@
                 <w:color w:val="1E293B"/>
                 <w:sz w:val="20"/>
               </w:rPr>
-              <w:t>HAVING, CASE WHEN, SUM, COUNT, AVG, LIMIT</w:t>
+              <w:t>ด้านตามเกณฑ์อาจารย์ประภาส ที่ใช้ JOIN, GROUP BY, HAVING, CASE WHEN, SUM, COUNT, AVG, LIMIT</w:t>
             </w:r>
           </w:p>
         </w:tc>
@@ -22213,7 +22184,15 @@
                 <w:color w:val="1E293B"/>
                 <w:sz w:val="20"/>
               </w:rPr>
-              <w:t>Claude / Antigravity</w:t>
+              <w:t xml:space="preserve">Claude / </w:t>
+            </w:r>
+            <w:r>
+              <w:rPr>
+                <w:rFonts w:eastAsia="TH Sarabun New" w:cs="TH Sarabun New"/>
+                <w:color w:val="1E293B"/>
+                <w:sz w:val="20"/>
+              </w:rPr>
+              <w:t>Antigravity</w:t>
             </w:r>
           </w:p>
         </w:tc>
@@ -22347,7 +22326,14 @@
           <w:rFonts w:eastAsia="TH Sarabun New" w:cs="TH Sarabun New"/>
           <w:color w:val="1E293B"/>
         </w:rPr>
-        <w:t>การเก็บข้อมูลสลิปเป็น Base64 String ในตาราง payments: AI เสนอให้แปลงไฟล์สลิปเป็น Base64 แล้วเซฟลงฐานข้อมูลตรงๆ แต่นักศึกษาปฏิเสธเนื่องจากจะทำให้ฐานข้อมูลบวม (Database Bloat) และส่งผลเสียต่อ Performance อย่างรุนแรง โดยเลือกเก็บเป็น URL ชี้ไปยัง Cloud Storage แทน</w:t>
+        <w:t xml:space="preserve">การเก็บข้อมูลสลิปเป็น Base64 String ในตาราง payments: AI เสนอให้แปลงไฟล์สลิปเป็น Base64 แล้วเซฟลงฐานข้อมูลตรงๆ </w:t>
+      </w:r>
+      <w:r>
+        <w:rPr>
+          <w:rFonts w:eastAsia="TH Sarabun New" w:cs="TH Sarabun New"/>
+          <w:color w:val="1E293B"/>
+        </w:rPr>
+        <w:t>แต่นักศึกษาปฏิเสธเนื่องจากจะทำให้ฐานข้อมูลบวม (Database Bloat) และส่งผลเสียต่อ Performance อย่างรุนแรง โดยเลือกเก็บเป็น URL ชี้ไปยัง Cloud Storage แทน</w:t>
       </w:r>
     </w:p>
     <w:p>
@@ -22490,14 +22476,7 @@
           <w:rFonts w:eastAsia="TH Sarabun New" w:cs="TH Sarabun New"/>
           <w:color w:val="1E293B"/>
         </w:rPr>
-        <w:t xml:space="preserve">โครงงานพัฒนาระบบฐานข้อมูลร้านขายหนังสือและอีบุ๊กออนไลน์ (Lampara Books) บรรลุผลตามเกณฑ์การประเมิน 100 คะแนนของรายวิชาระบบฐานข้อมูลครบทุกข้อ </w:t>
-      </w:r>
-      <w:r>
-        <w:rPr>
-          <w:rFonts w:eastAsia="TH Sarabun New" w:cs="TH Sarabun New"/>
-          <w:color w:val="1E293B"/>
-        </w:rPr>
-        <w:t>โครงสร้างฐานข้อมูลมีความสมบูรณ์ตามหลัก 3NF ปราศจากข้อมูลซ้ำซ้อน มีระบบรักษาความปลอดภัยการดาวน์โหลดไฟล์ และมีรายงานเชิงวิเคราะห์ที่ช่วยสนับสนุนการตัดสินใจทางธุรกิจได้อย่างมีประสิทธิภาพ</w:t>
+        <w:t>โครงงานพัฒนาระบบฐานข้อมูลร้านขายหนังสือและอีบุ๊กออนไลน์ (Lampara Books) บรรลุผลตามเกณฑ์การประเมิน 100 คะแนนของรายวิชาระบบฐานข้อมูลครบทุกข้อ โครงสร้างฐานข้อมูลมีความสมบูรณ์ตามหลัก 3NF ปราศจากข้อมูลซ้ำซ้อน มีระบบรักษาความปลอดภัยการดาวน์โหลดไฟล์ และมีรายงานเชิงวิเคราะห์ที่ช่วยสนับสนุนการตัดสินใจทางธุรกิจได้อย่างมีประสิทธิภาพ</w:t>
       </w:r>
     </w:p>
     <w:p>
@@ -23163,31 +23142,31 @@
       </w:rPr>
     </w:lvl>
   </w:abstractNum>
-  <w:num w:numId="1" w16cid:durableId="1469394709">
+  <w:num w:numId="1" w16cid:durableId="529563286">
     <w:abstractNumId w:val="8"/>
   </w:num>
-  <w:num w:numId="2" w16cid:durableId="291055490">
+  <w:num w:numId="2" w16cid:durableId="1151865939">
     <w:abstractNumId w:val="6"/>
   </w:num>
-  <w:num w:numId="3" w16cid:durableId="1558392694">
+  <w:num w:numId="3" w16cid:durableId="2121027916">
     <w:abstractNumId w:val="5"/>
   </w:num>
-  <w:num w:numId="4" w16cid:durableId="510801003">
+  <w:num w:numId="4" w16cid:durableId="416054286">
     <w:abstractNumId w:val="4"/>
   </w:num>
-  <w:num w:numId="5" w16cid:durableId="929922952">
+  <w:num w:numId="5" w16cid:durableId="1188057224">
     <w:abstractNumId w:val="7"/>
   </w:num>
-  <w:num w:numId="6" w16cid:durableId="1961690760">
+  <w:num w:numId="6" w16cid:durableId="662315250">
     <w:abstractNumId w:val="3"/>
   </w:num>
-  <w:num w:numId="7" w16cid:durableId="968439568">
+  <w:num w:numId="7" w16cid:durableId="1445923578">
     <w:abstractNumId w:val="2"/>
   </w:num>
-  <w:num w:numId="8" w16cid:durableId="167333187">
+  <w:num w:numId="8" w16cid:durableId="685641102">
     <w:abstractNumId w:val="1"/>
   </w:num>
-  <w:num w:numId="9" w16cid:durableId="2123065806">
+  <w:num w:numId="9" w16cid:durableId="254361459">
     <w:abstractNumId w:val="0"/>
   </w:num>
 </w:numbering>

</xml_diff>

<commit_message>
docs(report): update university campus to RMUTI Khon Kaen in report docs
</commit_message>
<xml_diff>
--- a/รายงาน_Mini_Project_Database_ร้านขาย_E-Book_2026.docx
+++ b/รายงาน_Mini_Project_Database_ร้านขาย_E-Book_2026.docx
@@ -15,7 +15,7 @@
           <w:noProof/>
         </w:rPr>
         <w:drawing>
-          <wp:inline distT="0" distB="0" distL="0" distR="0" wp14:anchorId="357AF34F" wp14:editId="48D4E15C">
+          <wp:inline distT="0" distB="0" distL="0" distR="0" wp14:anchorId="02ECF9ED" wp14:editId="583CBBEF">
             <wp:extent cx="1234440" cy="2120151"/>
             <wp:effectExtent l="0" t="0" r="0" b="0"/>
             <wp:docPr id="1" name="Picture 1"/>
@@ -142,7 +142,7 @@
           <w:color w:val="475569"/>
           <w:sz w:val="29"/>
         </w:rPr>
-        <w:t>คณะวิศวกรรมศาสตร์และเทคโนโลยี มหาวิทยาลัยเทคโนโลยีราชมงคลอีสาน</w:t>
+        <w:t>คณะวิศวกรรมศาสตร์ มหาวิทยาลัยเทคโนโลยีราชมงคลอีสาน วิทยาเขตขอนแก่น</w:t>
       </w:r>
       <w:r>
         <w:rPr>
@@ -248,7 +248,7 @@
           <w:color w:val="64748B"/>
           <w:sz w:val="26"/>
         </w:rPr>
-        <w:t>ภาควิชาวิศวกรรมคอมพิวเตอร์ คณะวิศวกรรมศาสตร์และเทคโนโลยี</w:t>
+        <w:t>สาขาวิชาวิศวกรรมคอมพิวเตอร์ คณะวิศวกรรมศาสตร์</w:t>
       </w:r>
       <w:r>
         <w:rPr>
@@ -264,7 +264,7 @@
           <w:color w:val="64748B"/>
           <w:sz w:val="26"/>
         </w:rPr>
-        <w:t>มหาวิทยาลัยเทคโนโลยีราชมงคลอีสาน นครราชสีมา</w:t>
+        <w:t>มหาวิทยาลัยเทคโนโลยีราชมงคลอีสาน วิทยาเขตขอนแก่น</w:t>
       </w:r>
     </w:p>
     <w:p>
@@ -19129,7 +19129,7 @@
           <w:noProof/>
         </w:rPr>
         <w:drawing>
-          <wp:inline distT="0" distB="0" distL="0" distR="0" wp14:anchorId="29D66116" wp14:editId="20575A97">
+          <wp:inline distT="0" distB="0" distL="0" distR="0" wp14:anchorId="2D029A91" wp14:editId="57F075E1">
             <wp:extent cx="4297680" cy="2171224"/>
             <wp:effectExtent l="0" t="0" r="0" b="0"/>
             <wp:docPr id="2" name="Picture 2"/>
@@ -19256,7 +19256,7 @@
         </w:rPr>
         <w:lastRenderedPageBreak/>
         <w:drawing>
-          <wp:inline distT="0" distB="0" distL="0" distR="0" wp14:anchorId="523B2547" wp14:editId="4211E724">
+          <wp:inline distT="0" distB="0" distL="0" distR="0" wp14:anchorId="3EE72456" wp14:editId="4469CACA">
             <wp:extent cx="4297680" cy="2171224"/>
             <wp:effectExtent l="0" t="0" r="0" b="0"/>
             <wp:docPr id="3" name="Picture 3"/>
@@ -19361,7 +19361,7 @@
           <w:noProof/>
         </w:rPr>
         <w:drawing>
-          <wp:inline distT="0" distB="0" distL="0" distR="0" wp14:anchorId="43DD1B75" wp14:editId="14732701">
+          <wp:inline distT="0" distB="0" distL="0" distR="0" wp14:anchorId="29956F2A" wp14:editId="64D6788B">
             <wp:extent cx="4389120" cy="2217420"/>
             <wp:effectExtent l="0" t="0" r="0" b="0"/>
             <wp:docPr id="4" name="Picture 4"/>
@@ -19445,7 +19445,7 @@
         </w:rPr>
         <w:lastRenderedPageBreak/>
         <w:drawing>
-          <wp:inline distT="0" distB="0" distL="0" distR="0" wp14:anchorId="20AC207D" wp14:editId="06672E0F">
+          <wp:inline distT="0" distB="0" distL="0" distR="0" wp14:anchorId="12DB67FB" wp14:editId="0630C8DA">
             <wp:extent cx="4297680" cy="2171224"/>
             <wp:effectExtent l="0" t="0" r="0" b="0"/>
             <wp:docPr id="5" name="Picture 5"/>
@@ -19528,7 +19528,7 @@
           <w:noProof/>
         </w:rPr>
         <w:drawing>
-          <wp:inline distT="0" distB="0" distL="0" distR="0" wp14:anchorId="3F5EB656" wp14:editId="2F85E69F">
+          <wp:inline distT="0" distB="0" distL="0" distR="0" wp14:anchorId="1895FD4F" wp14:editId="4D237652">
             <wp:extent cx="4389120" cy="2217420"/>
             <wp:effectExtent l="0" t="0" r="0" b="0"/>
             <wp:docPr id="6" name="Picture 6"/>
@@ -19634,7 +19634,7 @@
         </w:rPr>
         <w:lastRenderedPageBreak/>
         <w:drawing>
-          <wp:inline distT="0" distB="0" distL="0" distR="0" wp14:anchorId="3EED3263" wp14:editId="2CB2C487">
+          <wp:inline distT="0" distB="0" distL="0" distR="0" wp14:anchorId="647F1196" wp14:editId="79D2939C">
             <wp:extent cx="4297680" cy="2171224"/>
             <wp:effectExtent l="0" t="0" r="0" b="0"/>
             <wp:docPr id="7" name="Picture 7"/>
@@ -19739,7 +19739,7 @@
           <w:noProof/>
         </w:rPr>
         <w:drawing>
-          <wp:inline distT="0" distB="0" distL="0" distR="0" wp14:anchorId="612A2A3C" wp14:editId="29A32CAB">
+          <wp:inline distT="0" distB="0" distL="0" distR="0" wp14:anchorId="1E75CBFF" wp14:editId="281FC716">
             <wp:extent cx="4297680" cy="2171224"/>
             <wp:effectExtent l="0" t="0" r="0" b="0"/>
             <wp:docPr id="8" name="Picture 8"/>
@@ -22786,7 +22786,7 @@
           <w:rFonts w:eastAsia="TH Sarabun New" w:cs="TH Sarabun New"/>
           <w:color w:val="1E293B"/>
         </w:rPr>
-        <w:t>ตามประกาศของ อ.ดร.ปิยะนุช ตั้งกิตติพล ในวิชาวิศวกรรมซอฟต์แวร์ โครงงานฝั่งฐานข้อมูลนี้ได้รับการจัดเก็บแยกเป็น Repository ใหม่บน GitHub โดยเฉพาะ เพื่อส่งให้อาจารย์ประภาส ผ่องสนาม และเชื่อมโยงข้ามไปยัง Repository โครงงาน Inventory System ของวิชา SWE ด้วยลิงก์อ้างอิงข้ามหากันในไฟล์ README.md และ PROJECT.md อย่างถูกต้องตามแนวทางปฏิบัติของหลักสูตรวิศวกรรมคอมพิวเตอร์ มทร.อีสาน</w:t>
+        <w:t>ตามประกาศของ อ.ดร.ปิยะนุช ตั้งกิตติพล ในวิชาวิศวกรรมซอฟต์แวร์ โครงงานฝั่งฐานข้อมูลนี้ได้รับการจัดเก็บแยกเป็น Repository ใหม่บน GitHub โดยเฉพาะ เพื่อส่งให้อาจารย์ประภาส ผ่องสนาม และเชื่อมโยงข้ามไปยัง Repository โครงงาน Inventory System ของวิชา SWE ด้วยลิงก์อ้างอิงข้ามหากันในไฟล์ README.md และ PROJECT.md อย่างถูกต้องตามแนวทางปฏิบัติของหลักสูตรวิศวกรรมคอมพิวเตอร์ มทร.อีสาน วิทยาเขตขอนแก่น</w:t>
       </w:r>
     </w:p>
     <w:sectPr>
@@ -22963,7 +22963,16 @@
         <w:color w:val="94A3B8"/>
         <w:sz w:val="20"/>
       </w:rPr>
-      <w:t>โครงงานระบบฐานข้อมูลร้านขายหนังสือและอีบุ๊กออนไลน์ (Lampara Books) | มหาวิทยาลัยเทคโนโลยีราชมงคลอีสาน</w:t>
+      <w:t xml:space="preserve">โครงงานระบบฐานข้อมูลร้านขายหนังสือและอีบุ๊กออนไลน์ (Lampara Books) | </w:t>
+    </w:r>
+    <w:r>
+      <w:rPr>
+        <w:rFonts w:eastAsia="TH Sarabun New" w:cs="TH Sarabun New"/>
+        <w:i/>
+        <w:color w:val="94A3B8"/>
+        <w:sz w:val="20"/>
+      </w:rPr>
+      <w:t>มหาวิทยาลัยเทคโนโลยีราชมงคลอีสาน วิทยาเขตขอนแก่น</w:t>
     </w:r>
   </w:p>
 </w:hdr>
@@ -23142,31 +23151,31 @@
       </w:rPr>
     </w:lvl>
   </w:abstractNum>
-  <w:num w:numId="1" w16cid:durableId="529563286">
+  <w:num w:numId="1" w16cid:durableId="351880367">
     <w:abstractNumId w:val="8"/>
   </w:num>
-  <w:num w:numId="2" w16cid:durableId="1151865939">
+  <w:num w:numId="2" w16cid:durableId="1443957336">
     <w:abstractNumId w:val="6"/>
   </w:num>
-  <w:num w:numId="3" w16cid:durableId="2121027916">
+  <w:num w:numId="3" w16cid:durableId="274489206">
     <w:abstractNumId w:val="5"/>
   </w:num>
-  <w:num w:numId="4" w16cid:durableId="416054286">
+  <w:num w:numId="4" w16cid:durableId="1174420953">
     <w:abstractNumId w:val="4"/>
   </w:num>
-  <w:num w:numId="5" w16cid:durableId="1188057224">
+  <w:num w:numId="5" w16cid:durableId="2049259433">
     <w:abstractNumId w:val="7"/>
   </w:num>
-  <w:num w:numId="6" w16cid:durableId="662315250">
+  <w:num w:numId="6" w16cid:durableId="304436416">
     <w:abstractNumId w:val="3"/>
   </w:num>
-  <w:num w:numId="7" w16cid:durableId="1445923578">
+  <w:num w:numId="7" w16cid:durableId="2124496649">
     <w:abstractNumId w:val="2"/>
   </w:num>
-  <w:num w:numId="8" w16cid:durableId="685641102">
+  <w:num w:numId="8" w16cid:durableId="971517822">
     <w:abstractNumId w:val="1"/>
   </w:num>
-  <w:num w:numId="9" w16cid:durableId="254361459">
+  <w:num w:numId="9" w16cid:durableId="1480146713">
     <w:abstractNumId w:val="0"/>
   </w:num>
 </w:numbering>

</xml_diff>

<commit_message>
docs(cover): update cover page layout to engineering project standard
</commit_message>
<xml_diff>
--- a/รายงาน_Mini_Project_Database_ร้านขาย_E-Book_2026.docx
+++ b/รายงาน_Mini_Project_Database_ร้านขาย_E-Book_2026.docx
@@ -4,7 +4,7 @@
   <w:body>
     <w:p>
       <w:pPr>
-        <w:spacing w:after="120"/>
+        <w:spacing w:before="200" w:after="400"/>
         <w:jc w:val="center"/>
         <w:rPr>
           <w:rFonts w:hint="eastAsia"/>
@@ -15,8 +15,8 @@
           <w:noProof/>
         </w:rPr>
         <w:drawing>
-          <wp:inline distT="0" distB="0" distL="0" distR="0" wp14:anchorId="02ECF9ED" wp14:editId="583CBBEF">
-            <wp:extent cx="1234440" cy="2120151"/>
+          <wp:inline distT="0" distB="0" distL="0" distR="0" wp14:anchorId="46DFF8B4" wp14:editId="1954EB62">
+            <wp:extent cx="1463040" cy="2512771"/>
             <wp:effectExtent l="0" t="0" r="0" b="0"/>
             <wp:docPr id="1" name="Picture 1"/>
             <wp:cNvGraphicFramePr>
@@ -38,7 +38,7 @@
                   <pic:spPr>
                     <a:xfrm>
                       <a:off x="0" y="0"/>
-                      <a:ext cx="1234440" cy="2120151"/>
+                      <a:ext cx="1463040" cy="2512771"/>
                     </a:xfrm>
                     <a:prstGeom prst="rect">
                       <a:avLst/>
@@ -53,7 +53,7 @@
     </w:p>
     <w:p>
       <w:pPr>
-        <w:spacing w:after="40"/>
+        <w:spacing w:after="0" w:line="300" w:lineRule="auto"/>
         <w:jc w:val="center"/>
         <w:rPr>
           <w:rFonts w:hint="eastAsia"/>
@@ -63,14 +63,39 @@
         <w:rPr>
           <w:rFonts w:eastAsia="TH Sarabun New" w:cs="TH Sarabun New"/>
           <w:b/>
-          <w:color w:val="1E3A8A"/>
           <w:sz w:val="40"/>
         </w:rPr>
-        <w:t>รายงานโครงงานพัฒนาระบบฐานข้อมูล (Mini Project Report)</w:t>
+        <w:t>การวิเคราะห์และพัฒนาระบบร้านขายหนังสือและอีบุ๊กออนไลน์</w:t>
+      </w:r>
+      <w:r>
+        <w:rPr>
+          <w:rFonts w:eastAsia="TH Sarabun New" w:cs="TH Sarabun New"/>
+          <w:b/>
+          <w:sz w:val="40"/>
+        </w:rPr>
+        <w:br/>
+        <w:t>(Lampara Books E-Book Store)</w:t>
+      </w:r>
+      <w:r>
+        <w:rPr>
+          <w:rFonts w:eastAsia="TH Sarabun New" w:cs="TH Sarabun New"/>
+          <w:b/>
+          <w:sz w:val="40"/>
+        </w:rPr>
+        <w:br/>
+      </w:r>
+      <w:r>
+        <w:rPr>
+          <w:rFonts w:eastAsia="TH Sarabun New" w:cs="TH Sarabun New"/>
+          <w:b/>
+          <w:sz w:val="40"/>
+        </w:rPr>
+        <w:t>โครงงานพัฒนาระบบฐานข้อมูล (Mini Project)</w:t>
       </w:r>
     </w:p>
     <w:p>
       <w:pPr>
+        <w:spacing w:before="2400" w:after="0" w:line="288" w:lineRule="auto"/>
         <w:jc w:val="center"/>
         <w:rPr>
           <w:rFonts w:hint="eastAsia"/>
@@ -79,26 +104,27 @@
       <w:r>
         <w:rPr>
           <w:rFonts w:eastAsia="TH Sarabun New" w:cs="TH Sarabun New"/>
-          <w:b/>
-          <w:color w:val="B45309"/>
-          <w:sz w:val="48"/>
-        </w:rPr>
-        <w:t>ระบบร้านขายหนังสือและอีบุ๊กออนไลน์</w:t>
+          <w:sz w:val="36"/>
+        </w:rPr>
+        <w:t>นายกานต์นิธิ ยะโส</w:t>
       </w:r>
       <w:r>
         <w:rPr>
           <w:rFonts w:eastAsia="TH Sarabun New" w:cs="TH Sarabun New"/>
-          <w:b/>
-          <w:color w:val="B45309"/>
-          <w:sz w:val="48"/>
+          <w:sz w:val="36"/>
         </w:rPr>
         <w:br/>
-        <w:t>(Lampara Books E-Book Store)</w:t>
+      </w:r>
+      <w:r>
+        <w:rPr>
+          <w:rFonts w:eastAsia="TH Sarabun New" w:cs="TH Sarabun New"/>
+        </w:rPr>
+        <w:t>รหัสนักศึกษา 67332110223-9</w:t>
       </w:r>
     </w:p>
     <w:p>
       <w:pPr>
-        <w:spacing w:after="280"/>
+        <w:spacing w:before="2400" w:after="0" w:line="300" w:lineRule="auto"/>
         <w:jc w:val="center"/>
         <w:rPr>
           <w:rFonts w:hint="eastAsia"/>
@@ -107,164 +133,41 @@
       <w:r>
         <w:rPr>
           <w:rFonts w:eastAsia="TH Sarabun New" w:cs="TH Sarabun New"/>
-          <w:color w:val="475569"/>
-          <w:sz w:val="29"/>
-        </w:rPr>
-        <w:t>รายวิชา: [31-407-102-301] ระบบฐานข้อมูล (Database Systems)</w:t>
+        </w:rPr>
+        <w:t xml:space="preserve">โครงงานนี้เป็นส่วนหนึ่งของการศึกษารายวิชา [31-407-102-301] </w:t>
       </w:r>
       <w:r>
         <w:rPr>
           <w:rFonts w:eastAsia="TH Sarabun New" w:cs="TH Sarabun New"/>
-          <w:color w:val="475569"/>
-          <w:sz w:val="29"/>
+        </w:rPr>
+        <w:t>ระบบฐานข้อมูล</w:t>
+      </w:r>
+      <w:r>
+        <w:rPr>
+          <w:rFonts w:eastAsia="TH Sarabun New" w:cs="TH Sarabun New"/>
+        </w:rPr>
+        <w:br/>
+        <w:t>สาขาวิชาวิศวกรรมคอมพิวเตอร์ คณะวิศวกรรมศาสตร์</w:t>
+      </w:r>
+      <w:r>
+        <w:rPr>
+          <w:rFonts w:eastAsia="TH Sarabun New" w:cs="TH Sarabun New"/>
         </w:rPr>
         <w:br/>
       </w:r>
       <w:r>
         <w:rPr>
           <w:rFonts w:eastAsia="TH Sarabun New" w:cs="TH Sarabun New"/>
-          <w:color w:val="475569"/>
-          <w:sz w:val="29"/>
-        </w:rPr>
-        <w:t>หลักสูตรวิศวกรรมคอมพิวเตอร์ (ECP) ชั้นปีที่ 3 ห้อง ECP 321</w:t>
+        </w:rPr>
+        <w:lastRenderedPageBreak/>
+        <w:t>มหาวิทยาลัยเทคโนโลยีราชมงคลอีสาน วิทยาเขตขอนแก่น พ.ศ. 2569</w:t>
       </w:r>
       <w:r>
         <w:rPr>
           <w:rFonts w:eastAsia="TH Sarabun New" w:cs="TH Sarabun New"/>
-          <w:color w:val="475569"/>
-          <w:sz w:val="29"/>
         </w:rPr>
         <w:br/>
-      </w:r>
-      <w:r>
-        <w:rPr>
-          <w:rFonts w:eastAsia="TH Sarabun New" w:cs="TH Sarabun New"/>
-          <w:color w:val="475569"/>
-          <w:sz w:val="29"/>
-        </w:rPr>
-        <w:t>คณะวิศวกรรมศาสตร์ มหาวิทยาลัยเทคโนโลยีราชมงคลอีสาน วิทยาเขตขอนแก่น</w:t>
-      </w:r>
-      <w:r>
-        <w:rPr>
-          <w:rFonts w:eastAsia="TH Sarabun New" w:cs="TH Sarabun New"/>
-          <w:color w:val="475569"/>
-          <w:sz w:val="29"/>
-        </w:rPr>
-        <w:br/>
-        <w:t>ภาคการศึกษาที่ 1 ปีการศึกษา 2569</w:t>
-      </w:r>
-    </w:p>
-    <w:p>
-      <w:pPr>
-        <w:spacing w:after="240"/>
-        <w:jc w:val="center"/>
-        <w:rPr>
-          <w:rFonts w:hint="eastAsia"/>
-        </w:rPr>
-      </w:pPr>
-      <w:r>
-        <w:rPr>
-          <w:rFonts w:eastAsia="TH Sarabun New" w:cs="TH Sarabun New"/>
-          <w:b/>
-        </w:rPr>
-        <w:t>อาจารย์ผู้สอน</w:t>
-      </w:r>
-      <w:r>
-        <w:rPr>
-          <w:rFonts w:eastAsia="TH Sarabun New" w:cs="TH Sarabun New"/>
-          <w:b/>
-        </w:rPr>
-        <w:br/>
-      </w:r>
-      <w:r>
-        <w:rPr>
-          <w:rFonts w:eastAsia="TH Sarabun New" w:cs="TH Sarabun New"/>
-          <w:b/>
-          <w:color w:val="0F172A"/>
-          <w:sz w:val="34"/>
-        </w:rPr>
-        <w:t>อาจารย์ประภาส ผ่องสนาม</w:t>
-      </w:r>
-    </w:p>
-    <w:p>
-      <w:pPr>
-        <w:spacing w:after="280"/>
-        <w:jc w:val="center"/>
-        <w:rPr>
-          <w:rFonts w:hint="eastAsia"/>
-        </w:rPr>
-      </w:pPr>
-      <w:r>
-        <w:rPr>
-          <w:rFonts w:eastAsia="TH Sarabun New" w:cs="TH Sarabun New"/>
-          <w:b/>
-        </w:rPr>
-        <w:t>จัดทำโดย</w:t>
-      </w:r>
-      <w:r>
-        <w:rPr>
-          <w:rFonts w:eastAsia="TH Sarabun New" w:cs="TH Sarabun New"/>
-          <w:b/>
-        </w:rPr>
-        <w:br/>
-      </w:r>
-      <w:r>
-        <w:rPr>
-          <w:rFonts w:eastAsia="TH Sarabun New" w:cs="TH Sarabun New"/>
-          <w:b/>
-          <w:color w:val="0F172A"/>
-          <w:sz w:val="34"/>
-        </w:rPr>
-        <w:t>นายกานต์นิธิ ยะโส</w:t>
-      </w:r>
-      <w:r>
-        <w:rPr>
-          <w:rFonts w:eastAsia="TH Sarabun New" w:cs="TH Sarabun New"/>
-          <w:b/>
-          <w:color w:val="0F172A"/>
-          <w:sz w:val="34"/>
-        </w:rPr>
-        <w:br/>
-      </w:r>
-      <w:r>
-        <w:rPr>
-          <w:rFonts w:eastAsia="TH Sarabun New" w:cs="TH Sarabun New"/>
-          <w:sz w:val="28"/>
-        </w:rPr>
-        <w:t>รหัสนักศึกษา: 67332110223-9  กลุ่มเรียน: ECP3N</w:t>
-      </w:r>
-    </w:p>
-    <w:p>
-      <w:pPr>
-        <w:spacing w:after="0"/>
-        <w:jc w:val="center"/>
-        <w:rPr>
-          <w:rFonts w:hint="eastAsia"/>
-        </w:rPr>
-      </w:pPr>
-      <w:r>
-        <w:rPr>
-          <w:rFonts w:eastAsia="TH Sarabun New" w:cs="TH Sarabun New"/>
-          <w:color w:val="64748B"/>
-          <w:sz w:val="26"/>
-        </w:rPr>
-        <w:t>สาขาวิชาวิศวกรรมคอมพิวเตอร์ คณะวิศวกรรมศาสตร์</w:t>
-      </w:r>
-      <w:r>
-        <w:rPr>
-          <w:rFonts w:eastAsia="TH Sarabun New" w:cs="TH Sarabun New"/>
-          <w:color w:val="64748B"/>
-          <w:sz w:val="26"/>
-        </w:rPr>
-        <w:br/>
-      </w:r>
-      <w:r>
-        <w:rPr>
-          <w:rFonts w:eastAsia="TH Sarabun New" w:cs="TH Sarabun New"/>
-          <w:color w:val="64748B"/>
-          <w:sz w:val="26"/>
-        </w:rPr>
-        <w:t>มหาวิทยาลัยเทคโนโลยีราชมงคลอีสาน วิทยาเขตขอนแก่น</w:t>
+        <w:t>ลิขสิทธิ์ของคณะวิศวกรรมศาสตร์ มหาวิทยาลัยเทคโนโลยีราชมงคลอีสาน</w:t>
       </w:r>
     </w:p>
     <w:p>
@@ -570,15 +473,7 @@
                 <w:color w:val="1E293B"/>
                 <w:sz w:val="23"/>
               </w:rPr>
-              <w:t xml:space="preserve">ที่มา, ความสำคัญ, </w:t>
-            </w:r>
-            <w:r>
-              <w:rPr>
-                <w:rFonts w:eastAsia="TH Sarabun New" w:cs="TH Sarabun New"/>
-                <w:color w:val="1E293B"/>
-                <w:sz w:val="23"/>
-              </w:rPr>
-              <w:t>วัตถุประสงค์ 5 ข้อ, ขอบเขตลูกค้า/แอดมิน, เทคโนโลยี</w:t>
+              <w:t>ที่มา, ความสำคัญ, วัตถุประสงค์ 5 ข้อ, ขอบเขตลูกค้า/แอดมิน, เทคโนโลยี</w:t>
             </w:r>
           </w:p>
         </w:tc>
@@ -672,7 +567,23 @@
                 <w:color w:val="1E293B"/>
                 <w:sz w:val="23"/>
               </w:rPr>
-              <w:t>ผังความสัมพันธ์ (ERD), กฎ Normalization (3NF), Data Dictionary 9 ตาราง</w:t>
+              <w:t xml:space="preserve">ผังความสัมพันธ์ (ERD), กฎ </w:t>
+            </w:r>
+            <w:r>
+              <w:rPr>
+                <w:rFonts w:eastAsia="TH Sarabun New" w:cs="TH Sarabun New"/>
+                <w:color w:val="1E293B"/>
+                <w:sz w:val="23"/>
+              </w:rPr>
+              <w:t xml:space="preserve">Normalization (3NF), Data Dictionary 9 </w:t>
+            </w:r>
+            <w:r>
+              <w:rPr>
+                <w:rFonts w:eastAsia="TH Sarabun New" w:cs="TH Sarabun New"/>
+                <w:color w:val="1E293B"/>
+                <w:sz w:val="23"/>
+              </w:rPr>
+              <w:t>ตาราง</w:t>
             </w:r>
           </w:p>
         </w:tc>
@@ -766,15 +677,7 @@
                 <w:color w:val="1E293B"/>
                 <w:sz w:val="23"/>
               </w:rPr>
-              <w:t xml:space="preserve">SQL Schema DDL, Integrity Constraints, RLS, </w:t>
-            </w:r>
-            <w:r>
-              <w:rPr>
-                <w:rFonts w:eastAsia="TH Sarabun New" w:cs="TH Sarabun New"/>
-                <w:color w:val="1E293B"/>
-                <w:sz w:val="23"/>
-              </w:rPr>
-              <w:t xml:space="preserve">Indexes, </w:t>
+              <w:t xml:space="preserve">SQL Schema DDL, Integrity Constraints, RLS, Indexes, </w:t>
             </w:r>
             <w:r>
               <w:rPr>
@@ -876,7 +779,15 @@
                 <w:color w:val="1E293B"/>
                 <w:sz w:val="23"/>
               </w:rPr>
-              <w:t>ยอดขายรายเดือน, สินค้าขายดี 5 อันดับ, ยอดขายตามหมวดหมู่, ลูกค้า VIP</w:t>
+              <w:t xml:space="preserve">ยอดขายรายเดือน, สินค้าขายดี 5 อันดับ, </w:t>
+            </w:r>
+            <w:r>
+              <w:rPr>
+                <w:rFonts w:eastAsia="TH Sarabun New" w:cs="TH Sarabun New"/>
+                <w:color w:val="1E293B"/>
+                <w:sz w:val="23"/>
+              </w:rPr>
+              <w:t>ยอดขายตามหมวดหมู่, ลูกค้า VIP</w:t>
             </w:r>
           </w:p>
         </w:tc>
@@ -1129,7 +1040,15 @@
                 <w:color w:val="1E293B"/>
                 <w:sz w:val="23"/>
               </w:rPr>
-              <w:t>บทที่ 7: การประยุกต์ใช้ AI และจริยธรรมข้อมูล</w:t>
+              <w:t xml:space="preserve">บทที่ 7: </w:t>
+            </w:r>
+            <w:r>
+              <w:rPr>
+                <w:rFonts w:eastAsia="TH Sarabun New" w:cs="TH Sarabun New"/>
+                <w:color w:val="1E293B"/>
+                <w:sz w:val="23"/>
+              </w:rPr>
+              <w:t>การประยุกต์ใช้ AI และจริยธรรมข้อมูล</w:t>
             </w:r>
           </w:p>
         </w:tc>
@@ -1223,15 +1142,7 @@
                 <w:color w:val="1E293B"/>
                 <w:sz w:val="23"/>
               </w:rPr>
-              <w:t xml:space="preserve">บทที่ 8: </w:t>
-            </w:r>
-            <w:r>
-              <w:rPr>
-                <w:rFonts w:eastAsia="TH Sarabun New" w:cs="TH Sarabun New"/>
-                <w:color w:val="1E293B"/>
-                <w:sz w:val="23"/>
-              </w:rPr>
-              <w:t>สรุปผลการดำเนินงานและข้อเสนอแนะ</w:t>
+              <w:t>บทที่ 8: สรุปผลการดำเนินงานและข้อเสนอแนะ</w:t>
             </w:r>
           </w:p>
         </w:tc>
@@ -1523,14 +1434,21 @@
           <w:rFonts w:eastAsia="TH Sarabun New" w:cs="TH Sarabun New"/>
           <w:color w:val="1E293B"/>
         </w:rPr>
-        <w:t xml:space="preserve">โครงงานพัฒนาระบบฐานข้อมูล "ร้านขายหนังสือและอีบุ๊กออนไลน์ (Lampara Books)" </w:t>
+        <w:t xml:space="preserve">โครงงานพัฒนาระบบฐานข้อมูล </w:t>
       </w:r>
       <w:r>
         <w:rPr>
           <w:rFonts w:eastAsia="TH Sarabun New" w:cs="TH Sarabun New"/>
           <w:color w:val="1E293B"/>
         </w:rPr>
-        <w:t>จัดทำขึ้นเพื่อประยุกต์ใช้ทฤษฎีการออกแบบและการบริหารจัดการระบบฐานข้อมูลเชิงสัมพันธ์ (Relational Database Management Systems: RDBMS) ภายใต้เกณฑ์มาตรฐานของรายวิชาระบบฐานข้อมูล [31-407-102-301] โดยเน้นการพัฒนาระบบจำหน่ายหนังสือดิจิทัลที่มีความรัดกุม ถูกต้องตามหลักการจัดรูปแบบบรรทัดฐานที่ 3 (Third Normal Form: 3NF) และมีความปลอดภัยในการส่งมอบสินค้าดิจิทัลในระดับข้อมูลจริง</w:t>
+        <w:t>"</w:t>
+      </w:r>
+      <w:r>
+        <w:rPr>
+          <w:rFonts w:eastAsia="TH Sarabun New" w:cs="TH Sarabun New"/>
+          <w:color w:val="1E293B"/>
+        </w:rPr>
+        <w:t>ร้านขายหนังสือและอีบุ๊กออนไลน์ (Lampara Books)" จัดทำขึ้นเพื่อประยุกต์ใช้ทฤษฎีการออกแบบและการบริหารจัดการระบบฐานข้อมูลเชิงสัมพันธ์ (Relational Database Management Systems: RDBMS) ภายใต้เกณฑ์มาตรฐานของรายวิชาระบบฐานข้อมูล [31-407-102-301] โดยเน้นการพัฒนาระบบจำหน่ายหนังสือดิจิทัลที่มีความรัดกุม ถูกต้องตามหลักการจัดรูปแบบบรรทัดฐานที่ 3 (Third Normal Form: 3NF) และมีความปลอดภัยในการส่งมอบสินค้าดิจิทัลในระดับข้อมูลจริง</w:t>
       </w:r>
     </w:p>
     <w:p>
@@ -1867,7 +1785,14 @@
           <w:rFonts w:eastAsia="TH Sarabun New" w:cs="TH Sarabun New"/>
           <w:color w:val="1E293B"/>
         </w:rPr>
-        <w:t>ระบบสมาชิก: สมัครสมาชิก, เข้าสู่ระบบ, แก้ไขข้อมูลพื้นฐาน (ชื่อ, เบอร์โทร, อีเมล) และระบุบัญชีธนาคารเพื่อยืนยันตัวตน</w:t>
+        <w:t xml:space="preserve">ระบบสมาชิก: สมัครสมาชิก, เข้าสู่ระบบ, </w:t>
+      </w:r>
+      <w:r>
+        <w:rPr>
+          <w:rFonts w:eastAsia="TH Sarabun New" w:cs="TH Sarabun New"/>
+          <w:color w:val="1E293B"/>
+        </w:rPr>
+        <w:t>แก้ไขข้อมูลพื้นฐาน (ชื่อ, เบอร์โทร, อีเมล) และระบุบัญชีธนาคารเพื่อยืนยันตัวตน</w:t>
       </w:r>
     </w:p>
     <w:p>
@@ -19129,7 +19054,7 @@
           <w:noProof/>
         </w:rPr>
         <w:drawing>
-          <wp:inline distT="0" distB="0" distL="0" distR="0" wp14:anchorId="2D029A91" wp14:editId="57F075E1">
+          <wp:inline distT="0" distB="0" distL="0" distR="0" wp14:anchorId="69D6C7D8" wp14:editId="6FBDA0FA">
             <wp:extent cx="4297680" cy="2171224"/>
             <wp:effectExtent l="0" t="0" r="0" b="0"/>
             <wp:docPr id="2" name="Picture 2"/>
@@ -19256,7 +19181,7 @@
         </w:rPr>
         <w:lastRenderedPageBreak/>
         <w:drawing>
-          <wp:inline distT="0" distB="0" distL="0" distR="0" wp14:anchorId="3EE72456" wp14:editId="4469CACA">
+          <wp:inline distT="0" distB="0" distL="0" distR="0" wp14:anchorId="58D58C28" wp14:editId="136EC5C2">
             <wp:extent cx="4297680" cy="2171224"/>
             <wp:effectExtent l="0" t="0" r="0" b="0"/>
             <wp:docPr id="3" name="Picture 3"/>
@@ -19361,7 +19286,7 @@
           <w:noProof/>
         </w:rPr>
         <w:drawing>
-          <wp:inline distT="0" distB="0" distL="0" distR="0" wp14:anchorId="29956F2A" wp14:editId="64D6788B">
+          <wp:inline distT="0" distB="0" distL="0" distR="0" wp14:anchorId="1BA5542F" wp14:editId="309B4519">
             <wp:extent cx="4389120" cy="2217420"/>
             <wp:effectExtent l="0" t="0" r="0" b="0"/>
             <wp:docPr id="4" name="Picture 4"/>
@@ -19445,7 +19370,7 @@
         </w:rPr>
         <w:lastRenderedPageBreak/>
         <w:drawing>
-          <wp:inline distT="0" distB="0" distL="0" distR="0" wp14:anchorId="12DB67FB" wp14:editId="0630C8DA">
+          <wp:inline distT="0" distB="0" distL="0" distR="0" wp14:anchorId="4FB6A87F" wp14:editId="2D6AF6DD">
             <wp:extent cx="4297680" cy="2171224"/>
             <wp:effectExtent l="0" t="0" r="0" b="0"/>
             <wp:docPr id="5" name="Picture 5"/>
@@ -19528,7 +19453,7 @@
           <w:noProof/>
         </w:rPr>
         <w:drawing>
-          <wp:inline distT="0" distB="0" distL="0" distR="0" wp14:anchorId="1895FD4F" wp14:editId="4D237652">
+          <wp:inline distT="0" distB="0" distL="0" distR="0" wp14:anchorId="7B8D573F" wp14:editId="7858F95B">
             <wp:extent cx="4389120" cy="2217420"/>
             <wp:effectExtent l="0" t="0" r="0" b="0"/>
             <wp:docPr id="6" name="Picture 6"/>
@@ -19634,7 +19559,7 @@
         </w:rPr>
         <w:lastRenderedPageBreak/>
         <w:drawing>
-          <wp:inline distT="0" distB="0" distL="0" distR="0" wp14:anchorId="647F1196" wp14:editId="79D2939C">
+          <wp:inline distT="0" distB="0" distL="0" distR="0" wp14:anchorId="08630070" wp14:editId="59147D36">
             <wp:extent cx="4297680" cy="2171224"/>
             <wp:effectExtent l="0" t="0" r="0" b="0"/>
             <wp:docPr id="7" name="Picture 7"/>
@@ -19739,7 +19664,7 @@
           <w:noProof/>
         </w:rPr>
         <w:drawing>
-          <wp:inline distT="0" distB="0" distL="0" distR="0" wp14:anchorId="1E75CBFF" wp14:editId="281FC716">
+          <wp:inline distT="0" distB="0" distL="0" distR="0" wp14:anchorId="02146720" wp14:editId="63C4D651">
             <wp:extent cx="4297680" cy="2171224"/>
             <wp:effectExtent l="0" t="0" r="0" b="0"/>
             <wp:docPr id="8" name="Picture 8"/>
@@ -23151,31 +23076,31 @@
       </w:rPr>
     </w:lvl>
   </w:abstractNum>
-  <w:num w:numId="1" w16cid:durableId="351880367">
+  <w:num w:numId="1" w16cid:durableId="1777283424">
     <w:abstractNumId w:val="8"/>
   </w:num>
-  <w:num w:numId="2" w16cid:durableId="1443957336">
+  <w:num w:numId="2" w16cid:durableId="921376069">
     <w:abstractNumId w:val="6"/>
   </w:num>
-  <w:num w:numId="3" w16cid:durableId="274489206">
+  <w:num w:numId="3" w16cid:durableId="1639608254">
     <w:abstractNumId w:val="5"/>
   </w:num>
-  <w:num w:numId="4" w16cid:durableId="1174420953">
+  <w:num w:numId="4" w16cid:durableId="2060738636">
     <w:abstractNumId w:val="4"/>
   </w:num>
-  <w:num w:numId="5" w16cid:durableId="2049259433">
+  <w:num w:numId="5" w16cid:durableId="1889682285">
     <w:abstractNumId w:val="7"/>
   </w:num>
-  <w:num w:numId="6" w16cid:durableId="304436416">
+  <w:num w:numId="6" w16cid:durableId="1920212378">
     <w:abstractNumId w:val="3"/>
   </w:num>
-  <w:num w:numId="7" w16cid:durableId="2124496649">
+  <w:num w:numId="7" w16cid:durableId="111023346">
     <w:abstractNumId w:val="2"/>
   </w:num>
-  <w:num w:numId="8" w16cid:durableId="971517822">
+  <w:num w:numId="8" w16cid:durableId="975179084">
     <w:abstractNumId w:val="1"/>
   </w:num>
-  <w:num w:numId="9" w16cid:durableId="1480146713">
+  <w:num w:numId="9" w16cid:durableId="1607035646">
     <w:abstractNumId w:val="0"/>
   </w:num>
 </w:numbering>

</xml_diff>

<commit_message>
docs(report): update cover page adjustments in docx and pdf reports
</commit_message>
<xml_diff>
--- a/รายงาน_Mini_Project_Database_ร้านขาย_E-Book_2026.docx
+++ b/รายงาน_Mini_Project_Database_ร้านขาย_E-Book_2026.docx
@@ -15,7 +15,7 @@
           <w:noProof/>
         </w:rPr>
         <w:drawing>
-          <wp:inline distT="0" distB="0" distL="0" distR="0" wp14:anchorId="46DFF8B4" wp14:editId="1954EB62">
+          <wp:inline distT="0" distB="0" distL="0" distR="0" wp14:anchorId="33B99986" wp14:editId="72437D4C">
             <wp:extent cx="1463040" cy="2512771"/>
             <wp:effectExtent l="0" t="0" r="0" b="0"/>
             <wp:docPr id="1" name="Picture 1"/>
@@ -83,13 +83,6 @@
           <w:sz w:val="40"/>
         </w:rPr>
         <w:br/>
-      </w:r>
-      <w:r>
-        <w:rPr>
-          <w:rFonts w:eastAsia="TH Sarabun New" w:cs="TH Sarabun New"/>
-          <w:b/>
-          <w:sz w:val="40"/>
-        </w:rPr>
         <w:t>โครงงานพัฒนาระบบฐานข้อมูล (Mini Project)</w:t>
       </w:r>
     </w:p>
@@ -134,13 +127,7 @@
         <w:rPr>
           <w:rFonts w:eastAsia="TH Sarabun New" w:cs="TH Sarabun New"/>
         </w:rPr>
-        <w:t xml:space="preserve">โครงงานนี้เป็นส่วนหนึ่งของการศึกษารายวิชา [31-407-102-301] </w:t>
-      </w:r>
-      <w:r>
-        <w:rPr>
-          <w:rFonts w:eastAsia="TH Sarabun New" w:cs="TH Sarabun New"/>
-        </w:rPr>
-        <w:t>ระบบฐานข้อมูล</w:t>
+        <w:t>โครงงานนี้เป็นส่วนหนึ่งของการศึกษารายวิชา [31-407-102-301] ระบบฐานข้อมูล</w:t>
       </w:r>
       <w:r>
         <w:rPr>
@@ -154,20 +141,7 @@
           <w:rFonts w:eastAsia="TH Sarabun New" w:cs="TH Sarabun New"/>
         </w:rPr>
         <w:br/>
-      </w:r>
-      <w:r>
-        <w:rPr>
-          <w:rFonts w:eastAsia="TH Sarabun New" w:cs="TH Sarabun New"/>
-        </w:rPr>
-        <w:lastRenderedPageBreak/>
         <w:t>มหาวิทยาลัยเทคโนโลยีราชมงคลอีสาน วิทยาเขตขอนแก่น พ.ศ. 2569</w:t>
-      </w:r>
-      <w:r>
-        <w:rPr>
-          <w:rFonts w:eastAsia="TH Sarabun New" w:cs="TH Sarabun New"/>
-        </w:rPr>
-        <w:br/>
-        <w:t>ลิขสิทธิ์ของคณะวิศวกรรมศาสตร์ มหาวิทยาลัยเทคโนโลยีราชมงคลอีสาน</w:t>
       </w:r>
     </w:p>
     <w:p>
@@ -177,6 +151,7 @@
         </w:rPr>
       </w:pPr>
       <w:r>
+        <w:lastRenderedPageBreak/>
         <w:br w:type="page"/>
       </w:r>
     </w:p>
@@ -371,15 +346,7 @@
                 <w:color w:val="1E293B"/>
                 <w:sz w:val="23"/>
               </w:rPr>
-              <w:t xml:space="preserve">Executive Summary </w:t>
-            </w:r>
-            <w:r>
-              <w:rPr>
-                <w:rFonts w:eastAsia="TH Sarabun New" w:cs="TH Sarabun New"/>
-                <w:color w:val="1E293B"/>
-                <w:sz w:val="23"/>
-              </w:rPr>
-              <w:t>สรุปภาพรวมโครงงานและผลสัมฤทธิ์</w:t>
+              <w:t>Executive Summary สรุปภาพรวมโครงงานและผลสัมฤทธิ์</w:t>
             </w:r>
           </w:p>
         </w:tc>
@@ -567,23 +534,7 @@
                 <w:color w:val="1E293B"/>
                 <w:sz w:val="23"/>
               </w:rPr>
-              <w:t xml:space="preserve">ผังความสัมพันธ์ (ERD), กฎ </w:t>
-            </w:r>
-            <w:r>
-              <w:rPr>
-                <w:rFonts w:eastAsia="TH Sarabun New" w:cs="TH Sarabun New"/>
-                <w:color w:val="1E293B"/>
-                <w:sz w:val="23"/>
-              </w:rPr>
-              <w:t xml:space="preserve">Normalization (3NF), Data Dictionary 9 </w:t>
-            </w:r>
-            <w:r>
-              <w:rPr>
-                <w:rFonts w:eastAsia="TH Sarabun New" w:cs="TH Sarabun New"/>
-                <w:color w:val="1E293B"/>
-                <w:sz w:val="23"/>
-              </w:rPr>
-              <w:t>ตาราง</w:t>
+              <w:t>ผังความสัมพันธ์ (ERD), กฎ Normalization (3NF), Data Dictionary 9 ตาราง</w:t>
             </w:r>
           </w:p>
         </w:tc>
@@ -677,15 +628,7 @@
                 <w:color w:val="1E293B"/>
                 <w:sz w:val="23"/>
               </w:rPr>
-              <w:t xml:space="preserve">SQL Schema DDL, Integrity Constraints, RLS, Indexes, </w:t>
-            </w:r>
-            <w:r>
-              <w:rPr>
-                <w:rFonts w:eastAsia="TH Sarabun New" w:cs="TH Sarabun New"/>
-                <w:color w:val="1E293B"/>
-                <w:sz w:val="23"/>
-              </w:rPr>
-              <w:t>ข้อมูล Seed</w:t>
+              <w:t>SQL Schema DDL, Integrity Constraints, RLS, Indexes, ข้อมูล Seed</w:t>
             </w:r>
           </w:p>
         </w:tc>
@@ -779,15 +722,7 @@
                 <w:color w:val="1E293B"/>
                 <w:sz w:val="23"/>
               </w:rPr>
-              <w:t xml:space="preserve">ยอดขายรายเดือน, สินค้าขายดี 5 อันดับ, </w:t>
-            </w:r>
-            <w:r>
-              <w:rPr>
-                <w:rFonts w:eastAsia="TH Sarabun New" w:cs="TH Sarabun New"/>
-                <w:color w:val="1E293B"/>
-                <w:sz w:val="23"/>
-              </w:rPr>
-              <w:t>ยอดขายตามหมวดหมู่, ลูกค้า VIP</w:t>
+              <w:t>ยอดขายรายเดือน, สินค้าขายดี 5 อันดับ, ยอดขายตามหมวดหมู่, ลูกค้า VIP</w:t>
             </w:r>
           </w:p>
         </w:tc>
@@ -1040,15 +975,7 @@
                 <w:color w:val="1E293B"/>
                 <w:sz w:val="23"/>
               </w:rPr>
-              <w:t xml:space="preserve">บทที่ 7: </w:t>
-            </w:r>
-            <w:r>
-              <w:rPr>
-                <w:rFonts w:eastAsia="TH Sarabun New" w:cs="TH Sarabun New"/>
-                <w:color w:val="1E293B"/>
-                <w:sz w:val="23"/>
-              </w:rPr>
-              <w:t>การประยุกต์ใช้ AI และจริยธรรมข้อมูล</w:t>
+              <w:t>บทที่ 7: การประยุกต์ใช้ AI และจริยธรรมข้อมูล</w:t>
             </w:r>
           </w:p>
         </w:tc>
@@ -1434,21 +1361,7 @@
           <w:rFonts w:eastAsia="TH Sarabun New" w:cs="TH Sarabun New"/>
           <w:color w:val="1E293B"/>
         </w:rPr>
-        <w:t xml:space="preserve">โครงงานพัฒนาระบบฐานข้อมูล </w:t>
-      </w:r>
-      <w:r>
-        <w:rPr>
-          <w:rFonts w:eastAsia="TH Sarabun New" w:cs="TH Sarabun New"/>
-          <w:color w:val="1E293B"/>
-        </w:rPr>
-        <w:t>"</w:t>
-      </w:r>
-      <w:r>
-        <w:rPr>
-          <w:rFonts w:eastAsia="TH Sarabun New" w:cs="TH Sarabun New"/>
-          <w:color w:val="1E293B"/>
-        </w:rPr>
-        <w:t>ร้านขายหนังสือและอีบุ๊กออนไลน์ (Lampara Books)" จัดทำขึ้นเพื่อประยุกต์ใช้ทฤษฎีการออกแบบและการบริหารจัดการระบบฐานข้อมูลเชิงสัมพันธ์ (Relational Database Management Systems: RDBMS) ภายใต้เกณฑ์มาตรฐานของรายวิชาระบบฐานข้อมูล [31-407-102-301] โดยเน้นการพัฒนาระบบจำหน่ายหนังสือดิจิทัลที่มีความรัดกุม ถูกต้องตามหลักการจัดรูปแบบบรรทัดฐานที่ 3 (Third Normal Form: 3NF) และมีความปลอดภัยในการส่งมอบสินค้าดิจิทัลในระดับข้อมูลจริง</w:t>
+        <w:t>โครงงานพัฒนาระบบฐานข้อมูล "ร้านขายหนังสือและอีบุ๊กออนไลน์ (Lampara Books)" จัดทำขึ้นเพื่อประยุกต์ใช้ทฤษฎีการออกแบบและการบริหารจัดการระบบฐานข้อมูลเชิงสัมพันธ์ (Relational Database Management Systems: RDBMS) ภายใต้เกณฑ์มาตรฐานของรายวิชาระบบฐานข้อมูล [31-407-102-301] โดยเน้นการพัฒนาระบบจำหน่ายหนังสือดิจิทัลที่มีความรัดกุม ถูกต้องตามหลักการจัดรูปแบบบรรทัดฐานที่ 3 (Third Normal Form: 3NF) และมีความปลอดภัยในการส่งมอบสินค้าดิจิทัลในระดับข้อมูลจริง</w:t>
       </w:r>
     </w:p>
     <w:p>
@@ -1478,14 +1391,7 @@
           <w:rFonts w:eastAsia="TH Sarabun New" w:cs="TH Sarabun New"/>
           <w:color w:val="1E293B"/>
         </w:rPr>
-        <w:t>ระบบทำงานร่วมกับฐานข้อมูล PostgreSQL บนคลาวด์แพลตฟอร์ม Supabase ผ่านแอปพลิเคชัน Next.js 16 (TypeScript) มีการรักษาความปลอดภัยด้วยเงื่อนไขสิทธิ์: สมาชิกทั่วไปไม่สามารถเข้าถึงหน้าหลังบ้านได้ (403 Forbidden Access Denied) และคำสั่งซื้อที่ยังไม่ได้รับการยืนยันการชำระเงิน (Pending) จะไม่สามารถเปิดดาวน์โหลดหนังสือได้เด็ดขาด นอกจากนี้ ยังได้พัฒนาคำสั่งสืบค้น SQL ขั้นสูง (Complex Queries) สำหรับจัดทำรายงานวิเคราะห์ธุรกิจ 4 ด้าน ตอบโจทย์การบริหารจัดการยอดขาย สินค้าขายดี หมวดหมู่ยอดนิยม และมูลค่าสะสมของลูกค้า พร้อมทั</w:t>
-      </w:r>
-      <w:r>
-        <w:rPr>
-          <w:rFonts w:eastAsia="TH Sarabun New" w:cs="TH Sarabun New"/>
-          <w:color w:val="1E293B"/>
-        </w:rPr>
-        <w:t>้งส่งออกเป็นไฟล์ CSV มาตรฐาน UTF-8 BOM ที่รองรับภาษาไทยใน Microsoft Excel ได้อย่างสมบูรณ์</w:t>
+        <w:t>ระบบทำงานร่วมกับฐานข้อมูล PostgreSQL บนคลาวด์แพลตฟอร์ม Supabase ผ่านแอปพลิเคชัน Next.js 16 (TypeScript) มีการรักษาความปลอดภัยด้วยเงื่อนไขสิทธิ์: สมาชิกทั่วไปไม่สามารถเข้าถึงหน้าหลังบ้านได้ (403 Forbidden Access Denied) และคำสั่งซื้อที่ยังไม่ได้รับการยืนยันการชำระเงิน (Pending) จะไม่สามารถเปิดดาวน์โหลดหนังสือได้เด็ดขาด นอกจากนี้ ยังได้พัฒนาคำสั่งสืบค้น SQL ขั้นสูง (Complex Queries) สำหรับจัดทำรายงานวิเคราะห์ธุรกิจ 4 ด้าน ตอบโจทย์การบริหารจัดการยอดขาย สินค้าขายดี หมวดหมู่ยอดนิยม และมูลค่าสะสมของลูกค้า พร้อมทั้งส่งออกเป็นไฟล์ CSV มาตรฐาน UTF-8 BOM ที่รองรับภาษาไทยใน Microsoft Excel ได้อย่างสมบูรณ์</w:t>
       </w:r>
     </w:p>
     <w:p>
@@ -1524,15 +1430,7 @@
           <w:color w:val="0F172A"/>
           <w:sz w:val="32"/>
         </w:rPr>
-        <w:t xml:space="preserve">1.1 </w:t>
-      </w:r>
-      <w:r>
-        <w:rPr>
-          <w:rFonts w:ascii="TH Sarabun New" w:eastAsia="TH Sarabun New" w:hAnsi="TH Sarabun New" w:cs="TH Sarabun New"/>
-          <w:color w:val="0F172A"/>
-          <w:sz w:val="32"/>
-        </w:rPr>
-        <w:t>ที่มาและความสำคัญของปัญหา</w:t>
+        <w:t>1.1 ที่มาและความสำคัญของปัญหา</w:t>
       </w:r>
     </w:p>
     <w:p>
@@ -1547,14 +1445,7 @@
           <w:rFonts w:eastAsia="TH Sarabun New" w:cs="TH Sarabun New"/>
           <w:color w:val="1E293B"/>
         </w:rPr>
-        <w:t>ในยุคเศรษฐกิจดิจิทัล หนังสืออิเล็กทรอนิกส์ (E-Book) ได้กลายเป็นช่องทางการเผยแพร่และอ่านหนังสือที่ได้รับความนิยมอย่างแพร่หลาย เนื่องจากผู้บริโภคสามารถสั่งซื้อและดาวน์โหลดไปอ่านได้ทันทีทุกที่ทุกเวลา อย่างไรก็ดี สถาปัตยกรรมระบบสำหรับร้านขายสินค้าดิจิทัลมีความแตกต่างอย่างมีนัยสำคัญจากร้านค้าสินค้าที่จับต้องได้ กล่าวคือ สินค้าดิจิทัลไม่มีการจำกัดจำนวนสินค้าคงเหลือทางกายภาพ แต่ต้องการระบบรักษาความปลอดภัยในการส่งมอบไฟล์ที่มีความเข้มงวดสูง เพื่อให้มั่นใจว่าเฉพาะคำสั่งซื้อที่ชำระเงินถูกต้องแล้วเท่านั้นจึงจะได้รับสิท</w:t>
-      </w:r>
-      <w:r>
-        <w:rPr>
-          <w:rFonts w:eastAsia="TH Sarabun New" w:cs="TH Sarabun New"/>
-          <w:color w:val="1E293B"/>
-        </w:rPr>
-        <w:t>ธิ์เข้าถึงเนื้อหา และป้องกันการนำลิงก์ดาวน์โหลดไปแชร์ต่อสาธารณะ</w:t>
+        <w:t>ในยุคเศรษฐกิจดิจิทัล หนังสืออิเล็กทรอนิกส์ (E-Book) ได้กลายเป็นช่องทางการเผยแพร่และอ่านหนังสือที่ได้รับความนิยมอย่างแพร่หลาย เนื่องจากผู้บริโภคสามารถสั่งซื้อและดาวน์โหลดไปอ่านได้ทันทีทุกที่ทุกเวลา อย่างไรก็ดี สถาปัตยกรรมระบบสำหรับร้านขายสินค้าดิจิทัลมีความแตกต่างอย่างมีนัยสำคัญจากร้านค้าสินค้าที่จับต้องได้ กล่าวคือ สินค้าดิจิทัลไม่มีการจำกัดจำนวนสินค้าคงเหลือทางกายภาพ แต่ต้องการระบบรักษาความปลอดภัยในการส่งมอบไฟล์ที่มีความเข้มงวดสูง เพื่อให้มั่นใจว่าเฉพาะคำสั่งซื้อที่ชำระเงินถูกต้องแล้วเท่านั้นจึงจะได้รับสิทธิ์เข้าถึงเนื้อหา และป้องกันการนำลิงก์ดาวน์โหลดไปแชร์ต่อสาธารณะ</w:t>
       </w:r>
     </w:p>
     <w:p>
@@ -1583,15 +1474,7 @@
           <w:color w:val="0F172A"/>
           <w:sz w:val="32"/>
         </w:rPr>
-        <w:t xml:space="preserve">1.2 </w:t>
-      </w:r>
-      <w:r>
-        <w:rPr>
-          <w:rFonts w:ascii="TH Sarabun New" w:eastAsia="TH Sarabun New" w:hAnsi="TH Sarabun New" w:cs="TH Sarabun New"/>
-          <w:color w:val="0F172A"/>
-          <w:sz w:val="32"/>
-        </w:rPr>
-        <w:t>วัตถุประสงค์ของโครงงาน</w:t>
+        <w:t>1.2 วัตถุประสงค์ของโครงงาน</w:t>
       </w:r>
     </w:p>
     <w:p>
@@ -1606,14 +1489,7 @@
           <w:rFonts w:eastAsia="TH Sarabun New" w:cs="TH Sarabun New"/>
           <w:color w:val="1E293B"/>
         </w:rPr>
-        <w:t xml:space="preserve">1. </w:t>
-      </w:r>
-      <w:r>
-        <w:rPr>
-          <w:rFonts w:eastAsia="TH Sarabun New" w:cs="TH Sarabun New"/>
-          <w:color w:val="1E293B"/>
-        </w:rPr>
-        <w:t>เพื่อออกแบบและพัฒนาฐานข้อมูลเชิงสัมพันธ์สำหรับระบบร้านค้า E-Book ที่ถูกต้องตามหลักการ Normalization ระดับ 3NF</w:t>
+        <w:t>1. เพื่อออกแบบและพัฒนาฐานข้อมูลเชิงสัมพันธ์สำหรับระบบร้านค้า E-Book ที่ถูกต้องตามหลักการ Normalization ระดับ 3NF</w:t>
       </w:r>
     </w:p>
     <w:p>
@@ -1628,14 +1504,7 @@
           <w:rFonts w:eastAsia="TH Sarabun New" w:cs="TH Sarabun New"/>
           <w:color w:val="1E293B"/>
         </w:rPr>
-        <w:t xml:space="preserve">2. </w:t>
-      </w:r>
-      <w:r>
-        <w:rPr>
-          <w:rFonts w:eastAsia="TH Sarabun New" w:cs="TH Sarabun New"/>
-          <w:color w:val="1E293B"/>
-        </w:rPr>
-        <w:t>เพื่อสร้างระบบเว็บแอปพลิเคชันต้นแบบ (Prototype) ที่เชื่อมโยงกับฐานข้อมูล PostgreSQL บน Supabase Cloud ได้จริง</w:t>
+        <w:t>2. เพื่อสร้างระบบเว็บแอปพลิเคชันต้นแบบ (Prototype) ที่เชื่อมโยงกับฐานข้อมูล PostgreSQL บน Supabase Cloud ได้จริง</w:t>
       </w:r>
     </w:p>
     <w:p>
@@ -1650,21 +1519,7 @@
           <w:rFonts w:eastAsia="TH Sarabun New" w:cs="TH Sarabun New"/>
           <w:color w:val="1E293B"/>
         </w:rPr>
-        <w:t xml:space="preserve">3. </w:t>
-      </w:r>
-      <w:r>
-        <w:rPr>
-          <w:rFonts w:eastAsia="TH Sarabun New" w:cs="TH Sarabun New"/>
-          <w:color w:val="1E293B"/>
-        </w:rPr>
-        <w:t xml:space="preserve">เพื่อจำลองเส้นทางการใช้งานของลูกค้า (Customer Journey) </w:t>
-      </w:r>
-      <w:r>
-        <w:rPr>
-          <w:rFonts w:eastAsia="TH Sarabun New" w:cs="TH Sarabun New"/>
-          <w:color w:val="1E293B"/>
-        </w:rPr>
-        <w:t>และระบบบริหารจัดการหลังบ้านของผู้ดูแลระบบ (Admin Backoffice)</w:t>
+        <w:t>3. เพื่อจำลองเส้นทางการใช้งานของลูกค้า (Customer Journey) และระบบบริหารจัดการหลังบ้านของผู้ดูแลระบบ (Admin Backoffice)</w:t>
       </w:r>
     </w:p>
     <w:p>
@@ -1679,14 +1534,7 @@
           <w:rFonts w:eastAsia="TH Sarabun New" w:cs="TH Sarabun New"/>
           <w:color w:val="1E293B"/>
         </w:rPr>
-        <w:t xml:space="preserve">4. </w:t>
-      </w:r>
-      <w:r>
-        <w:rPr>
-          <w:rFonts w:eastAsia="TH Sarabun New" w:cs="TH Sarabun New"/>
-          <w:color w:val="1E293B"/>
-        </w:rPr>
-        <w:t>เพื่อเขียนคำสั่ง SQL สืบทอดรายงานวิเคราะห์ข้อมูลเชิงลึก 4 หัวข้อ และสร้างฟังก์ชันส่งออกข้อมูลเป็นไฟล์ CSV สำหรับผู้บริหาร</w:t>
+        <w:t>4. เพื่อเขียนคำสั่ง SQL สืบทอดรายงานวิเคราะห์ข้อมูลเชิงลึก 4 หัวข้อ และสร้างฟังก์ชันส่งออกข้อมูลเป็นไฟล์ CSV สำหรับผู้บริหาร</w:t>
       </w:r>
     </w:p>
     <w:p>
@@ -1701,14 +1549,7 @@
           <w:rFonts w:eastAsia="TH Sarabun New" w:cs="TH Sarabun New"/>
           <w:color w:val="1E293B"/>
         </w:rPr>
-        <w:t xml:space="preserve">5. </w:t>
-      </w:r>
-      <w:r>
-        <w:rPr>
-          <w:rFonts w:eastAsia="TH Sarabun New" w:cs="TH Sarabun New"/>
-          <w:color w:val="1E293B"/>
-        </w:rPr>
-        <w:t>เพื่อประยุกต์ใช้เครื่องมือปัญญาประดิษฐ์ (AI) ในการออกแบบและแก้ปัญหาอย่างมีความรับผิดชอบ โปร่งใส และตรวจสอบได้</w:t>
+        <w:t>5. เพื่อประยุกต์ใช้เครื่องมือปัญญาประดิษฐ์ (AI) ในการออกแบบและแก้ปัญหาอย่างมีความรับผิดชอบ โปร่งใส และตรวจสอบได้</w:t>
       </w:r>
     </w:p>
     <w:p>
@@ -1723,15 +1564,7 @@
           <w:sz w:val="32"/>
         </w:rPr>
         <w:lastRenderedPageBreak/>
-        <w:t xml:space="preserve">1.3 </w:t>
-      </w:r>
-      <w:r>
-        <w:rPr>
-          <w:rFonts w:ascii="TH Sarabun New" w:eastAsia="TH Sarabun New" w:hAnsi="TH Sarabun New" w:cs="TH Sarabun New"/>
-          <w:color w:val="0F172A"/>
-          <w:sz w:val="32"/>
-        </w:rPr>
-        <w:t>ขอบเขตของระบบ (System Scope)</w:t>
+        <w:t>1.3 ขอบเขตของระบบ (System Scope)</w:t>
       </w:r>
     </w:p>
     <w:p>
@@ -1778,21 +1611,7 @@
           <w:rFonts w:eastAsia="TH Sarabun New" w:cs="TH Sarabun New"/>
           <w:color w:val="1E293B"/>
         </w:rPr>
-        <w:t xml:space="preserve">• </w:t>
-      </w:r>
-      <w:r>
-        <w:rPr>
-          <w:rFonts w:eastAsia="TH Sarabun New" w:cs="TH Sarabun New"/>
-          <w:color w:val="1E293B"/>
-        </w:rPr>
-        <w:t xml:space="preserve">ระบบสมาชิก: สมัครสมาชิก, เข้าสู่ระบบ, </w:t>
-      </w:r>
-      <w:r>
-        <w:rPr>
-          <w:rFonts w:eastAsia="TH Sarabun New" w:cs="TH Sarabun New"/>
-          <w:color w:val="1E293B"/>
-        </w:rPr>
-        <w:t>แก้ไขข้อมูลพื้นฐาน (ชื่อ, เบอร์โทร, อีเมล) และระบุบัญชีธนาคารเพื่อยืนยันตัวตน</w:t>
+        <w:t>• ระบบสมาชิก: สมัครสมาชิก, เข้าสู่ระบบ, แก้ไขข้อมูลพื้นฐาน (ชื่อ, เบอร์โทร, อีเมล) และระบุบัญชีธนาคารเพื่อยืนยันตัวตน</w:t>
       </w:r>
     </w:p>
     <w:p>
@@ -1807,14 +1626,7 @@
           <w:rFonts w:eastAsia="TH Sarabun New" w:cs="TH Sarabun New"/>
           <w:color w:val="1E293B"/>
         </w:rPr>
-        <w:t xml:space="preserve">• </w:t>
-      </w:r>
-      <w:r>
-        <w:rPr>
-          <w:rFonts w:eastAsia="TH Sarabun New" w:cs="TH Sarabun New"/>
-          <w:color w:val="1E293B"/>
-        </w:rPr>
-        <w:t>แคตตาล็อกหนังสือ: ค้นหาด้วยชื่อเรื่อง/คำสำคัญ, กรองตามหมวดหมู่, แสดงรายละเอียดราคา ภาพปก และสถานะเปิดขาย</w:t>
+        <w:t>• แคตตาล็อกหนังสือ: ค้นหาด้วยชื่อเรื่อง/คำสำคัญ, กรองตามหมวดหมู่, แสดงรายละเอียดราคา ภาพปก และสถานะเปิดขาย</w:t>
       </w:r>
     </w:p>
     <w:p>
@@ -1829,14 +1641,7 @@
           <w:rFonts w:eastAsia="TH Sarabun New" w:cs="TH Sarabun New"/>
           <w:color w:val="1E293B"/>
         </w:rPr>
-        <w:t xml:space="preserve">• </w:t>
-      </w:r>
-      <w:r>
-        <w:rPr>
-          <w:rFonts w:eastAsia="TH Sarabun New" w:cs="TH Sarabun New"/>
-          <w:color w:val="1E293B"/>
-        </w:rPr>
-        <w:t>ตะกร้าสินค้า: เพิ่ม/ลดจำนวนหนังสือ ลบรายการ และคำนวณราคาสุทธิแบบ Real-time</w:t>
+        <w:t>• ตะกร้าสินค้า: เพิ่ม/ลดจำนวนหนังสือ ลบรายการ และคำนวณราคาสุทธิแบบ Real-time</w:t>
       </w:r>
     </w:p>
     <w:p>
@@ -1851,14 +1656,7 @@
           <w:rFonts w:eastAsia="TH Sarabun New" w:cs="TH Sarabun New"/>
           <w:color w:val="1E293B"/>
         </w:rPr>
-        <w:t xml:space="preserve">• </w:t>
-      </w:r>
-      <w:r>
-        <w:rPr>
-          <w:rFonts w:eastAsia="TH Sarabun New" w:cs="TH Sarabun New"/>
-          <w:color w:val="1E293B"/>
-        </w:rPr>
-        <w:t>การสั่งซื้อและชำระเงินจำลอง: กรอกข้อมูลผู้สั่ง แนบสลิปโอนเงินจำลอง และตรวจสอบความถูกต้องระหว่างชื่อสั่งซื้อและชื่อบัญชี</w:t>
+        <w:t>• การสั่งซื้อและชำระเงินจำลอง: กรอกข้อมูลผู้สั่ง แนบสลิปโอนเงินจำลอง และตรวจสอบความถูกต้องระหว่างชื่อสั่งซื้อและชื่อบัญชี</w:t>
       </w:r>
     </w:p>
     <w:p>
@@ -1873,14 +1671,7 @@
           <w:rFonts w:eastAsia="TH Sarabun New" w:cs="TH Sarabun New"/>
           <w:color w:val="1E293B"/>
         </w:rPr>
-        <w:t xml:space="preserve">• </w:t>
-      </w:r>
-      <w:r>
-        <w:rPr>
-          <w:rFonts w:eastAsia="TH Sarabun New" w:cs="TH Sarabun New"/>
-          <w:color w:val="1E293B"/>
-        </w:rPr>
-        <w:t>การดาวน์โหลด E-Book ปลอดภัย: ระบบเปิดลิงก์ดาวน์โหลดให้เฉพาะคำสั่งซื้อที่ได้รับการอนุมัติ (Confirmed) แล้วเท่านั้น โดยจำกัดสิทธิ์ดาวน์โหลดสูงสุด 5 ครั้งและมีวันหมดอายุ</w:t>
+        <w:t>• การดาวน์โหลด E-Book ปลอดภัย: ระบบเปิดลิงก์ดาวน์โหลดให้เฉพาะคำสั่งซื้อที่ได้รับการอนุมัติ (Confirmed) แล้วเท่านั้น โดยจำกัดสิทธิ์ดาวน์โหลดสูงสุด 5 ครั้งและมีวันหมดอายุ</w:t>
       </w:r>
     </w:p>
     <w:p>
@@ -1897,13 +1688,6 @@
           <w:color w:val="1E293B"/>
         </w:rPr>
         <w:br/>
-      </w:r>
-      <w:r>
-        <w:rPr>
-          <w:rFonts w:eastAsia="TH Sarabun New" w:cs="TH Sarabun New"/>
-          <w:b/>
-          <w:color w:val="1E293B"/>
-        </w:rPr>
         <w:t>ข) ขอบเขตส่วนหลังบ้านสำหรับผู้ดูแลระบบ (Admin Backoffice):</w:t>
       </w:r>
     </w:p>
@@ -1919,14 +1703,7 @@
           <w:rFonts w:eastAsia="TH Sarabun New" w:cs="TH Sarabun New"/>
           <w:color w:val="1E293B"/>
         </w:rPr>
-        <w:t xml:space="preserve">• </w:t>
-      </w:r>
-      <w:r>
-        <w:rPr>
-          <w:rFonts w:eastAsia="TH Sarabun New" w:cs="TH Sarabun New"/>
-          <w:color w:val="1E293B"/>
-        </w:rPr>
-        <w:t>ระบบรักษาความปลอดภัยสิทธิ์เข้าถึง (RBAC): ซ่อนปุ่มหลังบ้านจากลูกค้า และมี Route Guard บล็อก URL ด้วยหน้า 403 Forbidden</w:t>
+        <w:t>• ระบบรักษาความปลอดภัยสิทธิ์เข้าถึง (RBAC): ซ่อนปุ่มหลังบ้านจากลูกค้า และมี Route Guard บล็อก URL ด้วยหน้า 403 Forbidden</w:t>
       </w:r>
     </w:p>
     <w:p>
@@ -1941,14 +1718,7 @@
           <w:rFonts w:eastAsia="TH Sarabun New" w:cs="TH Sarabun New"/>
           <w:color w:val="1E293B"/>
         </w:rPr>
-        <w:t xml:space="preserve">• </w:t>
-      </w:r>
-      <w:r>
-        <w:rPr>
-          <w:rFonts w:eastAsia="TH Sarabun New" w:cs="TH Sarabun New"/>
-          <w:color w:val="1E293B"/>
-        </w:rPr>
-        <w:t>การจัดการหนังสือ: เพิ่มหนังสือใหม่, แก้ไขข้อมูลราคา รายละเอียด ลิงก์ดาวน์โหลด และสลับสถานะเปิด/ปิดการขาย (Soft Delete)</w:t>
+        <w:t>• การจัดการหนังสือ: เพิ่มหนังสือใหม่, แก้ไขข้อมูลราคา รายละเอียด ลิงก์ดาวน์โหลด และสลับสถานะเปิด/ปิดการขาย (Soft Delete)</w:t>
       </w:r>
     </w:p>
     <w:p>
@@ -1963,14 +1733,7 @@
           <w:rFonts w:eastAsia="TH Sarabun New" w:cs="TH Sarabun New"/>
           <w:color w:val="1E293B"/>
         </w:rPr>
-        <w:t xml:space="preserve">• </w:t>
-      </w:r>
-      <w:r>
-        <w:rPr>
-          <w:rFonts w:eastAsia="TH Sarabun New" w:cs="TH Sarabun New"/>
-          <w:color w:val="1E293B"/>
-        </w:rPr>
-        <w:t>การจัดการหมวดหมู่: เพิ่มและแก้ไขหมวดหมู่หนังสือ</w:t>
+        <w:t>• การจัดการหมวดหมู่: เพิ่มและแก้ไขหมวดหมู่หนังสือ</w:t>
       </w:r>
     </w:p>
     <w:p>
@@ -1985,14 +1748,7 @@
           <w:rFonts w:eastAsia="TH Sarabun New" w:cs="TH Sarabun New"/>
           <w:color w:val="1E293B"/>
         </w:rPr>
-        <w:t xml:space="preserve">• </w:t>
-      </w:r>
-      <w:r>
-        <w:rPr>
-          <w:rFonts w:eastAsia="TH Sarabun New" w:cs="TH Sarabun New"/>
-          <w:color w:val="1E293B"/>
-        </w:rPr>
-        <w:t>การจัดการคำสั่งซื้อ: ค้นหา ตรวจสอบหลักฐานสลิป และกดอนุมัติ (Confirmed) เพื่อเปิดสิทธิ์ดาวน์โหลด หรือกดยกเลิก (Cancelled)</w:t>
+        <w:t>• การจัดการคำสั่งซื้อ: ค้นหา ตรวจสอบหลักฐานสลิป และกดอนุมัติ (Confirmed) เพื่อเปิดสิทธิ์ดาวน์โหลด หรือกดยกเลิก (Cancelled)</w:t>
       </w:r>
     </w:p>
     <w:p>
@@ -2007,14 +1763,7 @@
           <w:rFonts w:eastAsia="TH Sarabun New" w:cs="TH Sarabun New"/>
           <w:color w:val="1E293B"/>
         </w:rPr>
-        <w:t xml:space="preserve">• </w:t>
-      </w:r>
-      <w:r>
-        <w:rPr>
-          <w:rFonts w:eastAsia="TH Sarabun New" w:cs="TH Sarabun New"/>
-          <w:color w:val="1E293B"/>
-        </w:rPr>
-        <w:t>การจัดการสมาชิก: ดูข้อมูลสมาชิกและสลับบทบาทผู้ใช้ (Admin &lt;-&gt; Customer)</w:t>
+        <w:t>• การจัดการสมาชิก: ดูข้อมูลสมาชิกและสลับบทบาทผู้ใช้ (Admin &lt;-&gt; Customer)</w:t>
       </w:r>
     </w:p>
     <w:p>
@@ -2029,14 +1778,7 @@
           <w:rFonts w:eastAsia="TH Sarabun New" w:cs="TH Sarabun New"/>
           <w:color w:val="1E293B"/>
         </w:rPr>
-        <w:t xml:space="preserve">• </w:t>
-      </w:r>
-      <w:r>
-        <w:rPr>
-          <w:rFonts w:eastAsia="TH Sarabun New" w:cs="TH Sarabun New"/>
-          <w:color w:val="1E293B"/>
-        </w:rPr>
-        <w:t>รายงานวิเคราะห์: แสดงผลข้อมูลสด 4 ด้าน และส่งออกเป็นไฟล์ CSV มาตรฐาน UTF-8 BOM</w:t>
+        <w:t>• รายงานวิเคราะห์: แสดงผลข้อมูลสด 4 ด้าน และส่งออกเป็นไฟล์ CSV มาตรฐาน UTF-8 BOM</w:t>
       </w:r>
     </w:p>
     <w:p>
@@ -2050,15 +1792,7 @@
           <w:color w:val="0F172A"/>
           <w:sz w:val="32"/>
         </w:rPr>
-        <w:t xml:space="preserve">1.4 </w:t>
-      </w:r>
-      <w:r>
-        <w:rPr>
-          <w:rFonts w:ascii="TH Sarabun New" w:eastAsia="TH Sarabun New" w:hAnsi="TH Sarabun New" w:cs="TH Sarabun New"/>
-          <w:color w:val="0F172A"/>
-          <w:sz w:val="32"/>
-        </w:rPr>
-        <w:t>เครื่องมือและเทคโนโลยีที่ใช้พัฒนา</w:t>
+        <w:t>1.4 เครื่องมือและเทคโนโลยีที่ใช้พัฒนา</w:t>
       </w:r>
     </w:p>
     <w:tbl>
@@ -2360,23 +2094,7 @@
                 <w:color w:val="1E293B"/>
                 <w:sz w:val="23"/>
               </w:rPr>
-              <w:t xml:space="preserve">เฟรมเวิร์กสมัยใหม่ ให้ความเร็วสูง มีระบบ Server </w:t>
-            </w:r>
-            <w:r>
-              <w:rPr>
-                <w:rFonts w:eastAsia="TH Sarabun New" w:cs="TH Sarabun New"/>
-                <w:color w:val="1E293B"/>
-                <w:sz w:val="23"/>
-              </w:rPr>
-              <w:t xml:space="preserve">Component </w:t>
-            </w:r>
-            <w:r>
-              <w:rPr>
-                <w:rFonts w:eastAsia="TH Sarabun New" w:cs="TH Sarabun New"/>
-                <w:color w:val="1E293B"/>
-                <w:sz w:val="23"/>
-              </w:rPr>
-              <w:t>และ Routing ปลอดภัย</w:t>
+              <w:t>เฟรมเวิร์กสมัยใหม่ ให้ความเร็วสูง มีระบบ Server Component และ Routing ปลอดภัย</w:t>
             </w:r>
           </w:p>
         </w:tc>
@@ -2562,23 +2280,7 @@
                 <w:color w:val="1E293B"/>
                 <w:sz w:val="23"/>
               </w:rPr>
-              <w:t xml:space="preserve">ออกแบบ UI ทันสมัย สะอาดตา ด้วยฟอนต์ Plus </w:t>
-            </w:r>
-            <w:r>
-              <w:rPr>
-                <w:rFonts w:eastAsia="TH Sarabun New" w:cs="TH Sarabun New"/>
-                <w:color w:val="1E293B"/>
-                <w:sz w:val="23"/>
-              </w:rPr>
-              <w:t xml:space="preserve">Jakarta Sans </w:t>
-            </w:r>
-            <w:r>
-              <w:rPr>
-                <w:rFonts w:eastAsia="TH Sarabun New" w:cs="TH Sarabun New"/>
-                <w:color w:val="1E293B"/>
-                <w:sz w:val="23"/>
-              </w:rPr>
-              <w:t>และ IBM Plex Sans Thai</w:t>
+              <w:t>ออกแบบ UI ทันสมัย สะอาดตา ด้วยฟอนต์ Plus Jakarta Sans และ IBM Plex Sans Thai</w:t>
             </w:r>
           </w:p>
         </w:tc>
@@ -2713,23 +2415,7 @@
           <w:color w:val="0F172A"/>
           <w:sz w:val="32"/>
         </w:rPr>
-        <w:t xml:space="preserve">2.1 </w:t>
-      </w:r>
-      <w:r>
-        <w:rPr>
-          <w:rFonts w:ascii="TH Sarabun New" w:eastAsia="TH Sarabun New" w:hAnsi="TH Sarabun New" w:cs="TH Sarabun New"/>
-          <w:color w:val="0F172A"/>
-          <w:sz w:val="32"/>
-        </w:rPr>
-        <w:t xml:space="preserve">โครงสร้างผังความสัมพันธ์ข้อมูล </w:t>
-      </w:r>
-      <w:r>
-        <w:rPr>
-          <w:rFonts w:ascii="TH Sarabun New" w:eastAsia="TH Sarabun New" w:hAnsi="TH Sarabun New" w:cs="TH Sarabun New"/>
-          <w:color w:val="0F172A"/>
-          <w:sz w:val="32"/>
-        </w:rPr>
-        <w:t>(Entity-Relationship Diagram)</w:t>
+        <w:t>2.1 โครงสร้างผังความสัมพันธ์ข้อมูล (Entity-Relationship Diagram)</w:t>
       </w:r>
     </w:p>
     <w:p>
@@ -2759,14 +2445,7 @@
           <w:rFonts w:eastAsia="TH Sarabun New" w:cs="TH Sarabun New"/>
           <w:color w:val="1E293B"/>
         </w:rPr>
-        <w:t xml:space="preserve">1. roles (1) &lt;---&gt; (N) users : </w:t>
-      </w:r>
-      <w:r>
-        <w:rPr>
-          <w:rFonts w:eastAsia="TH Sarabun New" w:cs="TH Sarabun New"/>
-          <w:color w:val="1E293B"/>
-        </w:rPr>
-        <w:t>บทบาทหนึ่งบทบาทกำหนดให้กับผู้ใช้ได้หลายคน (One-to-Many)</w:t>
+        <w:t>1. roles (1) &lt;---&gt; (N) users : บทบาทหนึ่งบทบาทกำหนดให้กับผู้ใช้ได้หลายคน (One-to-Many)</w:t>
       </w:r>
     </w:p>
     <w:p>
@@ -2781,14 +2460,7 @@
           <w:rFonts w:eastAsia="TH Sarabun New" w:cs="TH Sarabun New"/>
           <w:color w:val="1E293B"/>
         </w:rPr>
-        <w:t xml:space="preserve">2. users (1) &lt;---&gt; (N) orders : </w:t>
-      </w:r>
-      <w:r>
-        <w:rPr>
-          <w:rFonts w:eastAsia="TH Sarabun New" w:cs="TH Sarabun New"/>
-          <w:color w:val="1E293B"/>
-        </w:rPr>
-        <w:t>สมาชิกหนึ่งคนสามารถมีประวัติคำสั่งซื้อได้หลายคำสั่งซื้อ (One-to-Many)</w:t>
+        <w:t>2. users (1) &lt;---&gt; (N) orders : สมาชิกหนึ่งคนสามารถมีประวัติคำสั่งซื้อได้หลายคำสั่งซื้อ (One-to-Many)</w:t>
       </w:r>
     </w:p>
     <w:p>
@@ -2803,14 +2475,7 @@
           <w:rFonts w:eastAsia="TH Sarabun New" w:cs="TH Sarabun New"/>
           <w:color w:val="1E293B"/>
         </w:rPr>
-        <w:t xml:space="preserve">3. authors (1) &lt;---&gt; (N) books : </w:t>
-      </w:r>
-      <w:r>
-        <w:rPr>
-          <w:rFonts w:eastAsia="TH Sarabun New" w:cs="TH Sarabun New"/>
-          <w:color w:val="1E293B"/>
-        </w:rPr>
-        <w:t>ผู้แต่งหนึ่งท่านมีผลงานหนังสือได้หลายเล่ม (One-to-Many)</w:t>
+        <w:t>3. authors (1) &lt;---&gt; (N) books : ผู้แต่งหนึ่งท่านมีผลงานหนังสือได้หลายเล่ม (One-to-Many)</w:t>
       </w:r>
     </w:p>
     <w:p>
@@ -2825,14 +2490,7 @@
           <w:rFonts w:eastAsia="TH Sarabun New" w:cs="TH Sarabun New"/>
           <w:color w:val="1E293B"/>
         </w:rPr>
-        <w:t xml:space="preserve">4. categories (1) &lt;---&gt; (N) books : </w:t>
-      </w:r>
-      <w:r>
-        <w:rPr>
-          <w:rFonts w:eastAsia="TH Sarabun New" w:cs="TH Sarabun New"/>
-          <w:color w:val="1E293B"/>
-        </w:rPr>
-        <w:t>หมวดหมู่หนึ่งหมวดหมู่บรรจุหนังสือได้หลายเล่ม (One-to-Many)</w:t>
+        <w:t>4. categories (1) &lt;---&gt; (N) books : หมวดหมู่หนึ่งหมวดหมู่บรรจุหนังสือได้หลายเล่ม (One-to-Many)</w:t>
       </w:r>
     </w:p>
     <w:p>
@@ -2847,14 +2505,7 @@
           <w:rFonts w:eastAsia="TH Sarabun New" w:cs="TH Sarabun New"/>
           <w:color w:val="1E293B"/>
         </w:rPr>
-        <w:t xml:space="preserve">5. orders (1) &lt;---&gt; (N) order_items : </w:t>
-      </w:r>
-      <w:r>
-        <w:rPr>
-          <w:rFonts w:eastAsia="TH Sarabun New" w:cs="TH Sarabun New"/>
-          <w:color w:val="1E293B"/>
-        </w:rPr>
-        <w:t>คำสั่งซื้อหนึ่งออเดอร์มีรายการหนังสือย่อยได้หลายรายการ (One-to-Many)</w:t>
+        <w:t>5. orders (1) &lt;---&gt; (N) order_items : คำสั่งซื้อหนึ่งออเดอร์มีรายการหนังสือย่อยได้หลายรายการ (One-to-Many)</w:t>
       </w:r>
     </w:p>
     <w:p>
@@ -2869,14 +2520,7 @@
           <w:rFonts w:eastAsia="TH Sarabun New" w:cs="TH Sarabun New"/>
           <w:color w:val="1E293B"/>
         </w:rPr>
-        <w:t xml:space="preserve">6. books (1) &lt;---&gt; (N) order_items : </w:t>
-      </w:r>
-      <w:r>
-        <w:rPr>
-          <w:rFonts w:eastAsia="TH Sarabun New" w:cs="TH Sarabun New"/>
-          <w:color w:val="1E293B"/>
-        </w:rPr>
-        <w:t>หนังสือหนึ่งเล่มสามารถถูกสั่งซื้อในรายการย่อยได้หลายออเดอร์ (One-to-Many)</w:t>
+        <w:t>6. books (1) &lt;---&gt; (N) order_items : หนังสือหนึ่งเล่มสามารถถูกสั่งซื้อในรายการย่อยได้หลายออเดอร์ (One-to-Many)</w:t>
       </w:r>
     </w:p>
     <w:p>
@@ -2891,14 +2535,7 @@
           <w:rFonts w:eastAsia="TH Sarabun New" w:cs="TH Sarabun New"/>
           <w:color w:val="1E293B"/>
         </w:rPr>
-        <w:t xml:space="preserve">7. orders (1) &lt;---&gt; (1) payments : </w:t>
-      </w:r>
-      <w:r>
-        <w:rPr>
-          <w:rFonts w:eastAsia="TH Sarabun New" w:cs="TH Sarabun New"/>
-          <w:color w:val="1E293B"/>
-        </w:rPr>
-        <w:t>คำสั่งซื้อหนึ่งรายการมีการแจ้งชำระเงินและสลิปหลักฐานคู่กัน 1 ชุด (One-to-One)</w:t>
+        <w:t>7. orders (1) &lt;---&gt; (1) payments : คำสั่งซื้อหนึ่งรายการมีการแจ้งชำระเงินและสลิปหลักฐานคู่กัน 1 ชุด (One-to-One)</w:t>
       </w:r>
     </w:p>
     <w:p>
@@ -2913,14 +2550,7 @@
           <w:rFonts w:eastAsia="TH Sarabun New" w:cs="TH Sarabun New"/>
           <w:color w:val="1E293B"/>
         </w:rPr>
-        <w:t xml:space="preserve">8. orders (1) &lt;---&gt; (N) download_links : </w:t>
-      </w:r>
-      <w:r>
-        <w:rPr>
-          <w:rFonts w:eastAsia="TH Sarabun New" w:cs="TH Sarabun New"/>
-          <w:color w:val="1E293B"/>
-        </w:rPr>
-        <w:t>คำสั่งซื้อที่อนุมัติแล้วจะสร้างสิทธิ์ดาวน์โหลดตามจำนวนเล่มที่ซื้อ (One-to-Many)</w:t>
+        <w:t>8. orders (1) &lt;---&gt; (N) download_links : คำสั่งซื้อที่อนุมัติแล้วจะสร้างสิทธิ์ดาวน์โหลดตามจำนวนเล่มที่ซื้อ (One-to-Many)</w:t>
       </w:r>
     </w:p>
     <w:p>
@@ -2935,14 +2565,7 @@
           <w:rFonts w:eastAsia="TH Sarabun New" w:cs="TH Sarabun New"/>
           <w:color w:val="1E293B"/>
         </w:rPr>
-        <w:t xml:space="preserve">9. books (1) &lt;---&gt; (N) download_links : </w:t>
-      </w:r>
-      <w:r>
-        <w:rPr>
-          <w:rFonts w:eastAsia="TH Sarabun New" w:cs="TH Sarabun New"/>
-          <w:color w:val="1E293B"/>
-        </w:rPr>
-        <w:t>หนังสือแต่ละเล่มเชื่อมโยงกับโทเค็นดาวน์โหลดของลูกค้าแต่ละออเดอร์ (One-to-Many)</w:t>
+        <w:t>9. books (1) &lt;---&gt; (N) download_links : หนังสือแต่ละเล่มเชื่อมโยงกับโทเค็นดาวน์โหลดของลูกค้าแต่ละออเดอร์ (One-to-Many)</w:t>
       </w:r>
     </w:p>
     <w:p>
@@ -2956,15 +2579,7 @@
           <w:color w:val="0F172A"/>
           <w:sz w:val="32"/>
         </w:rPr>
-        <w:t xml:space="preserve">2.2 </w:t>
-      </w:r>
-      <w:r>
-        <w:rPr>
-          <w:rFonts w:ascii="TH Sarabun New" w:eastAsia="TH Sarabun New" w:hAnsi="TH Sarabun New" w:cs="TH Sarabun New"/>
-          <w:color w:val="0F172A"/>
-          <w:sz w:val="32"/>
-        </w:rPr>
-        <w:t>ทฤษฎีการปรับรูปบรรทัดฐาน (Database Normalization to 3NF)</w:t>
+        <w:t>2.2 ทฤษฎีการปรับรูปบรรทัดฐาน (Database Normalization to 3NF)</w:t>
       </w:r>
     </w:p>
     <w:p>
@@ -2994,14 +2609,7 @@
           <w:rFonts w:eastAsia="TH Sarabun New" w:cs="TH Sarabun New"/>
           <w:color w:val="1E293B"/>
         </w:rPr>
-        <w:t xml:space="preserve">1. Unnormalized Form (UNF): </w:t>
-      </w:r>
-      <w:r>
-        <w:rPr>
-          <w:rFonts w:eastAsia="TH Sarabun New" w:cs="TH Sarabun New"/>
-          <w:color w:val="1E293B"/>
-        </w:rPr>
-        <w:t>โครงสร้างเดิมก่อนจัดรูป เก็บข้อมูลการสั่งซื้อ ชื่อลูกค้า รายการหนังสือ ผู้แต่ง หมวดหมู่ และราคาไว้ในตารางรวมเพียงตารางเดียว เกิดปัญหาข้อมูลซ้ำซ้อนและชุดข้อมูลซ้ำ (Repeating Groups)</w:t>
+        <w:t>1. Unnormalized Form (UNF): โครงสร้างเดิมก่อนจัดรูป เก็บข้อมูลการสั่งซื้อ ชื่อลูกค้า รายการหนังสือ ผู้แต่ง หมวดหมู่ และราคาไว้ในตารางรวมเพียงตารางเดียว เกิดปัญหาข้อมูลซ้ำซ้อนและชุดข้อมูลซ้ำ (Repeating Groups)</w:t>
       </w:r>
     </w:p>
     <w:p>
@@ -3016,14 +2624,7 @@
           <w:rFonts w:eastAsia="TH Sarabun New" w:cs="TH Sarabun New"/>
           <w:color w:val="1E293B"/>
         </w:rPr>
-        <w:t xml:space="preserve">2. First Normal Form (1NF): </w:t>
-      </w:r>
-      <w:r>
-        <w:rPr>
-          <w:rFonts w:eastAsia="TH Sarabun New" w:cs="TH Sarabun New"/>
-          <w:color w:val="1E293B"/>
-        </w:rPr>
-        <w:t>ขจัด Repeating Groups โดยทำให้ทุก Attribute เป็น Atomic Value (ค่าเดี่ยวที่ไม่สามารถแบ่งย่อยได้อีก) และกำหนด Primary Key ชัดเจนในทุกแถว</w:t>
+        <w:t>2. First Normal Form (1NF): ขจัด Repeating Groups โดยทำให้ทุก Attribute เป็น Atomic Value (ค่าเดี่ยวที่ไม่สามารถแบ่งย่อยได้อีก) และกำหนด Primary Key ชัดเจนในทุกแถว</w:t>
       </w:r>
     </w:p>
     <w:p>
@@ -3039,14 +2640,7 @@
           <w:color w:val="1E293B"/>
         </w:rPr>
         <w:lastRenderedPageBreak/>
-        <w:t xml:space="preserve">3. Second Normal Form (2NF): </w:t>
-      </w:r>
-      <w:r>
-        <w:rPr>
-          <w:rFonts w:eastAsia="TH Sarabun New" w:cs="TH Sarabun New"/>
-          <w:color w:val="1E293B"/>
-        </w:rPr>
-        <w:t>ขจัด Partial Functional Dependency โดยแยกตาราง authors และ categories ออกจาก books เพื่อให้ Attribute ทุกตัวขึ้นตรงกับ Primary Key books.id ทั้งหมด และแยกตาราง order_items โดยเก็บ price_at_time เพื่อบันทึกราคา ณ วันที่ซื้อ</w:t>
+        <w:t>3. Second Normal Form (2NF): ขจัด Partial Functional Dependency โดยแยกตาราง authors และ categories ออกจาก books เพื่อให้ Attribute ทุกตัวขึ้นตรงกับ Primary Key books.id ทั้งหมด และแยกตาราง order_items โดยเก็บ price_at_time เพื่อบันทึกราคา ณ วันที่ซื้อ</w:t>
       </w:r>
     </w:p>
     <w:p>
@@ -3061,14 +2655,7 @@
           <w:rFonts w:eastAsia="TH Sarabun New" w:cs="TH Sarabun New"/>
           <w:color w:val="1E293B"/>
         </w:rPr>
-        <w:t xml:space="preserve">4. Third Normal Form (3NF): </w:t>
-      </w:r>
-      <w:r>
-        <w:rPr>
-          <w:rFonts w:eastAsia="TH Sarabun New" w:cs="TH Sarabun New"/>
-          <w:color w:val="1E293B"/>
-        </w:rPr>
-        <w:t>ขจัด Transitive Functional Dependency (Attribute ที่ขึ้นต่อกันเองโดยไม่ผ่าน Primary Key) โดยแยกสิทธิ์ roles ออกจาก users, แยกการชำระเงิน payments ออกจาก orders, และแยกโทเค็นความปลอดภัย download_links ออกจาก orders</w:t>
+        <w:t>4. Third Normal Form (3NF): ขจัด Transitive Functional Dependency (Attribute ที่ขึ้นต่อกันเองโดยไม่ผ่าน Primary Key) โดยแยกสิทธิ์ roles ออกจาก users, แยกการชำระเงิน payments ออกจาก orders, และแยกโทเค็นความปลอดภัย download_links ออกจาก orders</w:t>
       </w:r>
     </w:p>
     <w:p>
@@ -3082,15 +2669,7 @@
           <w:color w:val="0F172A"/>
           <w:sz w:val="32"/>
         </w:rPr>
-        <w:t xml:space="preserve">2.3 </w:t>
-      </w:r>
-      <w:r>
-        <w:rPr>
-          <w:rFonts w:ascii="TH Sarabun New" w:eastAsia="TH Sarabun New" w:hAnsi="TH Sarabun New" w:cs="TH Sarabun New"/>
-          <w:color w:val="0F172A"/>
-          <w:sz w:val="32"/>
-        </w:rPr>
-        <w:t>พจนานุกรมข้อมูลฉบับสมบูรณ์ 9 ตาราง (Data Dictionary)</w:t>
+        <w:t>2.3 พจนานุกรมข้อมูลฉบับสมบูรณ์ 9 ตาราง (Data Dictionary)</w:t>
       </w:r>
     </w:p>
     <w:p>
@@ -3764,23 +3343,7 @@
           <w:b/>
           <w:color w:val="1E293B"/>
         </w:rPr>
-        <w:t xml:space="preserve">ตารางที่ 2: users </w:t>
-      </w:r>
-      <w:r>
-        <w:rPr>
-          <w:rFonts w:eastAsia="TH Sarabun New" w:cs="TH Sarabun New"/>
-          <w:b/>
-          <w:color w:val="1E293B"/>
-        </w:rPr>
-        <w:t>(</w:t>
-      </w:r>
-      <w:r>
-        <w:rPr>
-          <w:rFonts w:eastAsia="TH Sarabun New" w:cs="TH Sarabun New"/>
-          <w:b/>
-          <w:color w:val="1E293B"/>
-        </w:rPr>
-        <w:t>ข้อมูลสมาชิกและผู้ดูแลระบบ)</w:t>
+        <w:t>ตารางที่ 2: users (ข้อมูลสมาชิกและผู้ดูแลระบบ)</w:t>
       </w:r>
     </w:p>
     <w:tbl>
@@ -6154,15 +5717,7 @@
                 <w:color w:val="1E293B"/>
                 <w:sz w:val="23"/>
               </w:rPr>
-              <w:t xml:space="preserve">DEFAULT </w:t>
-            </w:r>
-            <w:r>
-              <w:rPr>
-                <w:rFonts w:eastAsia="TH Sarabun New" w:cs="TH Sarabun New"/>
-                <w:color w:val="1E293B"/>
-                <w:sz w:val="23"/>
-              </w:rPr>
-              <w:t>CURRENT_TIMESTAMP</w:t>
+              <w:t>DEFAULT CURRENT_TIMESTAMP</w:t>
             </w:r>
           </w:p>
         </w:tc>
@@ -6991,23 +6546,7 @@
           <w:b/>
           <w:color w:val="1E293B"/>
         </w:rPr>
-        <w:t xml:space="preserve">ตารางที่ 5: books </w:t>
-      </w:r>
-      <w:r>
-        <w:rPr>
-          <w:rFonts w:eastAsia="TH Sarabun New" w:cs="TH Sarabun New"/>
-          <w:b/>
-          <w:color w:val="1E293B"/>
-        </w:rPr>
-        <w:t>(</w:t>
-      </w:r>
-      <w:r>
-        <w:rPr>
-          <w:rFonts w:eastAsia="TH Sarabun New" w:cs="TH Sarabun New"/>
-          <w:b/>
-          <w:color w:val="1E293B"/>
-        </w:rPr>
-        <w:t>ข้อมูลหนังสือดิจิทัล E-Book)</w:t>
+        <w:t>ตารางที่ 5: books (ข้อมูลหนังสือดิจิทัล E-Book)</w:t>
       </w:r>
     </w:p>
     <w:tbl>
@@ -7617,15 +7156,7 @@
                 <w:color w:val="1E293B"/>
                 <w:sz w:val="23"/>
               </w:rPr>
-              <w:t xml:space="preserve">FK -&gt; </w:t>
-            </w:r>
-            <w:r>
-              <w:rPr>
-                <w:rFonts w:eastAsia="TH Sarabun New" w:cs="TH Sarabun New"/>
-                <w:color w:val="1E293B"/>
-                <w:sz w:val="23"/>
-              </w:rPr>
-              <w:t>categories(id) SET NULL</w:t>
+              <w:t>FK -&gt; categories(id) SET NULL</w:t>
             </w:r>
           </w:p>
         </w:tc>
@@ -8516,23 +8047,7 @@
                 <w:color w:val="1E293B"/>
                 <w:sz w:val="23"/>
               </w:rPr>
-              <w:t xml:space="preserve">เส้นทางไฟล์ </w:t>
-            </w:r>
-            <w:r>
-              <w:rPr>
-                <w:rFonts w:eastAsia="TH Sarabun New" w:cs="TH Sarabun New"/>
-                <w:color w:val="1E293B"/>
-                <w:sz w:val="23"/>
-              </w:rPr>
-              <w:t xml:space="preserve">PDF/EPUB </w:t>
-            </w:r>
-            <w:r>
-              <w:rPr>
-                <w:rFonts w:eastAsia="TH Sarabun New" w:cs="TH Sarabun New"/>
-                <w:color w:val="1E293B"/>
-                <w:sz w:val="23"/>
-              </w:rPr>
-              <w:t>ตัวอย่าง</w:t>
+              <w:t>เส้นทางไฟล์ PDF/EPUB ตัวอย่าง</w:t>
             </w:r>
           </w:p>
         </w:tc>
@@ -10605,23 +10120,7 @@
           <w:b/>
           <w:color w:val="1E293B"/>
         </w:rPr>
-        <w:t xml:space="preserve">ตารางที่ 8: payments </w:t>
-      </w:r>
-      <w:r>
-        <w:rPr>
-          <w:rFonts w:eastAsia="TH Sarabun New" w:cs="TH Sarabun New"/>
-          <w:b/>
-          <w:color w:val="1E293B"/>
-        </w:rPr>
-        <w:t>(</w:t>
-      </w:r>
-      <w:r>
-        <w:rPr>
-          <w:rFonts w:eastAsia="TH Sarabun New" w:cs="TH Sarabun New"/>
-          <w:b/>
-          <w:color w:val="1E293B"/>
-        </w:rPr>
-        <w:t>ข้อมูลการชำระเงินและสลิปหลักฐาน)</w:t>
+        <w:t>ตารางที่ 8: payments (ข้อมูลการชำระเงินและสลิปหลักฐาน)</w:t>
       </w:r>
     </w:p>
     <w:tbl>
@@ -11108,15 +10607,7 @@
                 <w:color w:val="1E293B"/>
                 <w:sz w:val="23"/>
               </w:rPr>
-              <w:t xml:space="preserve">CHECK (IN </w:t>
-            </w:r>
-            <w:r>
-              <w:rPr>
-                <w:rFonts w:eastAsia="TH Sarabun New" w:cs="TH Sarabun New"/>
-                <w:color w:val="1E293B"/>
-                <w:sz w:val="23"/>
-              </w:rPr>
-              <w:t>('PromptPay', ...))</w:t>
+              <w:t>CHECK (IN ('PromptPay', ...))</w:t>
             </w:r>
           </w:p>
         </w:tc>
@@ -11515,15 +11006,7 @@
                 <w:color w:val="1E293B"/>
                 <w:sz w:val="23"/>
               </w:rPr>
-              <w:t xml:space="preserve">สถานะตรวจสลิป (Pending, Verified, </w:t>
-            </w:r>
-            <w:r>
-              <w:rPr>
-                <w:rFonts w:eastAsia="TH Sarabun New" w:cs="TH Sarabun New"/>
-                <w:color w:val="1E293B"/>
-                <w:sz w:val="23"/>
-              </w:rPr>
-              <w:t>Rejected)</w:t>
+              <w:t>สถานะตรวจสลิป (Pending, Verified, Rejected)</w:t>
             </w:r>
           </w:p>
         </w:tc>
@@ -11904,16 +11387,7 @@
                 <w:color w:val="FFFFFF"/>
                 <w:sz w:val="26"/>
               </w:rPr>
-              <w:t xml:space="preserve">ข้อกำหนด </w:t>
-            </w:r>
-            <w:r>
-              <w:rPr>
-                <w:rFonts w:eastAsia="TH Sarabun New" w:cs="TH Sarabun New"/>
-                <w:b/>
-                <w:color w:val="FFFFFF"/>
-                <w:sz w:val="26"/>
-              </w:rPr>
-              <w:t>(Constraints)</w:t>
+              <w:t>ข้อกำหนด (Constraints)</w:t>
             </w:r>
           </w:p>
         </w:tc>
@@ -12970,15 +12444,7 @@
           <w:color w:val="0F172A"/>
           <w:sz w:val="32"/>
         </w:rPr>
-        <w:t xml:space="preserve">3.1 DDL Scripts </w:t>
-      </w:r>
-      <w:r>
-        <w:rPr>
-          <w:rFonts w:ascii="TH Sarabun New" w:eastAsia="TH Sarabun New" w:hAnsi="TH Sarabun New" w:cs="TH Sarabun New"/>
-          <w:color w:val="0F172A"/>
-          <w:sz w:val="32"/>
-        </w:rPr>
-        <w:t>และการสร้างตารางบน Supabase PostgreSQL</w:t>
+        <w:t>3.1 DDL Scripts และการสร้างตารางบน Supabase PostgreSQL</w:t>
       </w:r>
     </w:p>
     <w:p>
@@ -13040,7 +12506,7 @@
                 <w:color w:val="0F172A"/>
                 <w:sz w:val="19"/>
               </w:rPr>
-              <w:t xml:space="preserve">-- </w:t>
+              <w:t>-- ตัวอย่างคำสั่งสร้างตาราง books พร้อมข้อกำหนดความสมบูรณ์</w:t>
             </w:r>
             <w:r>
               <w:rPr>
@@ -13048,7 +12514,8 @@
                 <w:color w:val="0F172A"/>
                 <w:sz w:val="19"/>
               </w:rPr>
-              <w:t>ตัวอย่างคำสั่งสร้างตาราง books พร้อมข้อกำหนดความสมบูรณ์</w:t>
+              <w:br/>
+              <w:t>CREATE TABLE books (</w:t>
             </w:r>
             <w:r>
               <w:rPr>
@@ -13057,7 +12524,7 @@
                 <w:sz w:val="19"/>
               </w:rPr>
               <w:br/>
-              <w:t>CREATE TABLE books (</w:t>
+              <w:t xml:space="preserve">    id SERIAL PRIMARY KEY,</w:t>
             </w:r>
             <w:r>
               <w:rPr>
@@ -13066,7 +12533,7 @@
                 <w:sz w:val="19"/>
               </w:rPr>
               <w:br/>
-              <w:t xml:space="preserve">    id SERIAL PRIMARY KEY,</w:t>
+              <w:t xml:space="preserve">    title VARCHAR(255) NOT NULL,</w:t>
             </w:r>
             <w:r>
               <w:rPr>
@@ -13075,7 +12542,7 @@
                 <w:sz w:val="19"/>
               </w:rPr>
               <w:br/>
-              <w:t xml:space="preserve">    title VARCHAR(255) NOT NULL,</w:t>
+              <w:t xml:space="preserve">    author_id INT REFERENCES authors(id) ON DELETE SET NULL,</w:t>
             </w:r>
             <w:r>
               <w:rPr>
@@ -13084,7 +12551,7 @@
                 <w:sz w:val="19"/>
               </w:rPr>
               <w:br/>
-              <w:t xml:space="preserve">    author_id INT REFERENCES authors(id) ON DELETE SET NULL,</w:t>
+              <w:t xml:space="preserve">    category_id INT REFERENCES categories(id) ON DELETE SET NULL,</w:t>
             </w:r>
             <w:r>
               <w:rPr>
@@ -13093,7 +12560,7 @@
                 <w:sz w:val="19"/>
               </w:rPr>
               <w:br/>
-              <w:t xml:space="preserve">    category_id INT REFERENCES categories(id) ON DELETE SET NULL,</w:t>
+              <w:t xml:space="preserve">    price DECIMAL(10, 2) NOT NULL CHECK (price &gt;= 0),</w:t>
             </w:r>
             <w:r>
               <w:rPr>
@@ -13102,7 +12569,7 @@
                 <w:sz w:val="19"/>
               </w:rPr>
               <w:br/>
-              <w:t xml:space="preserve">    price DECIMAL(10, 2) NOT NULL CHECK (price &gt;= 0),</w:t>
+              <w:t xml:space="preserve">    cover_color VARCHAR(20) DEFAULT '#2F5D50',</w:t>
             </w:r>
             <w:r>
               <w:rPr>
@@ -13111,7 +12578,7 @@
                 <w:sz w:val="19"/>
               </w:rPr>
               <w:br/>
-              <w:t xml:space="preserve">    cover_color VARCHAR(20) DEFAULT '#2F5D50',</w:t>
+              <w:t xml:space="preserve">    description TEXT,</w:t>
             </w:r>
             <w:r>
               <w:rPr>
@@ -13120,7 +12587,7 @@
                 <w:sz w:val="19"/>
               </w:rPr>
               <w:br/>
-              <w:t xml:space="preserve">    description TEXT,</w:t>
+              <w:t xml:space="preserve">    pages INT CHECK (pages &gt;= 0),</w:t>
             </w:r>
             <w:r>
               <w:rPr>
@@ -13129,7 +12596,7 @@
                 <w:sz w:val="19"/>
               </w:rPr>
               <w:br/>
-              <w:t xml:space="preserve">    pages INT CHECK (pages &gt;= 0),</w:t>
+              <w:t xml:space="preserve">    isbn VARCHAR(30) UNIQUE,</w:t>
             </w:r>
             <w:r>
               <w:rPr>
@@ -13138,7 +12605,7 @@
                 <w:sz w:val="19"/>
               </w:rPr>
               <w:br/>
-              <w:t xml:space="preserve">    isbn VARCHAR(30) UNIQUE,</w:t>
+              <w:t xml:space="preserve">    is_active BOOLEAN DEFAULT TRUE,</w:t>
             </w:r>
             <w:r>
               <w:rPr>
@@ -13147,7 +12614,7 @@
                 <w:sz w:val="19"/>
               </w:rPr>
               <w:br/>
-              <w:t xml:space="preserve">    is_active BOOLEAN DEFAULT TRUE,</w:t>
+              <w:t xml:space="preserve">    file_url VARCHAR(500),</w:t>
             </w:r>
             <w:r>
               <w:rPr>
@@ -13156,7 +12623,7 @@
                 <w:sz w:val="19"/>
               </w:rPr>
               <w:br/>
-              <w:t xml:space="preserve">    file_url VARCHAR(500),</w:t>
+              <w:t xml:space="preserve">    created_at TIMESTAMPTZ DEFAULT CURRENT_TIMESTAMP,</w:t>
             </w:r>
             <w:r>
               <w:rPr>
@@ -13165,7 +12632,7 @@
                 <w:sz w:val="19"/>
               </w:rPr>
               <w:br/>
-              <w:t xml:space="preserve">    created_at TIMESTAMPTZ DEFAULT CURRENT_TIMESTAMP,</w:t>
+              <w:t xml:space="preserve">    updated_at TIMESTAMPTZ DEFAULT CURRENT_TIMESTAMP</w:t>
             </w:r>
             <w:r>
               <w:rPr>
@@ -13174,7 +12641,7 @@
                 <w:sz w:val="19"/>
               </w:rPr>
               <w:br/>
-              <w:t xml:space="preserve">    updated_at TIMESTAMPTZ DEFAULT CURRENT_TIMESTAMP</w:t>
+              <w:t>);</w:t>
             </w:r>
             <w:r>
               <w:rPr>
@@ -13183,7 +12650,6 @@
                 <w:sz w:val="19"/>
               </w:rPr>
               <w:br/>
-              <w:t>);</w:t>
             </w:r>
             <w:r>
               <w:rPr>
@@ -13192,6 +12658,7 @@
                 <w:sz w:val="19"/>
               </w:rPr>
               <w:br/>
+              <w:t>-- ตัวอย่างคำสั่งสร้างตาราง orders</w:t>
             </w:r>
             <w:r>
               <w:rPr>
@@ -13200,7 +12667,7 @@
                 <w:sz w:val="19"/>
               </w:rPr>
               <w:br/>
-              <w:t xml:space="preserve">-- </w:t>
+              <w:t>CREATE TABLE orders (</w:t>
             </w:r>
             <w:r>
               <w:rPr>
@@ -13208,7 +12675,8 @@
                 <w:color w:val="0F172A"/>
                 <w:sz w:val="19"/>
               </w:rPr>
-              <w:t>ตัวอย่างคำสั่งสร้างตาราง orders</w:t>
+              <w:br/>
+              <w:t xml:space="preserve">    id SERIAL PRIMARY KEY,</w:t>
             </w:r>
             <w:r>
               <w:rPr>
@@ -13217,7 +12685,7 @@
                 <w:sz w:val="19"/>
               </w:rPr>
               <w:br/>
-              <w:t>CREATE TABLE orders (</w:t>
+              <w:t xml:space="preserve">    user_id INT REFERENCES users(id) ON DELETE SET NULL,</w:t>
             </w:r>
             <w:r>
               <w:rPr>
@@ -13226,7 +12694,7 @@
                 <w:sz w:val="19"/>
               </w:rPr>
               <w:br/>
-              <w:t xml:space="preserve">    id SERIAL PRIMARY KEY,</w:t>
+              <w:t xml:space="preserve">    checkout_email VARCHAR(255) NOT NULL,</w:t>
             </w:r>
             <w:r>
               <w:rPr>
@@ -13235,7 +12703,7 @@
                 <w:sz w:val="19"/>
               </w:rPr>
               <w:br/>
-              <w:t xml:space="preserve">    user_id INT REFERENCES users(id) ON DELETE SET NULL,</w:t>
+              <w:t xml:space="preserve">    checkout_name VARCHAR(150) NOT NULL,</w:t>
             </w:r>
             <w:r>
               <w:rPr>
@@ -13244,7 +12712,7 @@
                 <w:sz w:val="19"/>
               </w:rPr>
               <w:br/>
-              <w:t xml:space="preserve">    checkout_email VARCHAR(255) NOT NULL,</w:t>
+              <w:t xml:space="preserve">    total DECIMAL(10, 2) NOT NULL CHECK (total &gt;= 0),</w:t>
             </w:r>
             <w:r>
               <w:rPr>
@@ -13253,7 +12721,7 @@
                 <w:sz w:val="19"/>
               </w:rPr>
               <w:br/>
-              <w:t xml:space="preserve">    checkout_name VARCHAR(150) NOT NULL,</w:t>
+              <w:t xml:space="preserve">    status VARCHAR(30) NOT NULL DEFAULT 'Pending' </w:t>
             </w:r>
             <w:r>
               <w:rPr>
@@ -13262,33 +12730,7 @@
                 <w:sz w:val="19"/>
               </w:rPr>
               <w:br/>
-              <w:t xml:space="preserve">    total DECIMAL(10, 2) NOT NULL CHECK (total &gt;= 0),</w:t>
-            </w:r>
-            <w:r>
-              <w:rPr>
-                <w:rFonts w:ascii="Consolas" w:eastAsia="Consolas" w:hAnsi="Consolas" w:cs="Consolas"/>
-                <w:color w:val="0F172A"/>
-                <w:sz w:val="19"/>
-              </w:rPr>
-              <w:br/>
-              <w:t xml:space="preserve">    status VARCHAR(30) NOT NULL DEFAULT 'Pending' </w:t>
-            </w:r>
-            <w:r>
-              <w:rPr>
-                <w:rFonts w:ascii="Consolas" w:eastAsia="Consolas" w:hAnsi="Consolas" w:cs="Consolas"/>
-                <w:color w:val="0F172A"/>
-                <w:sz w:val="19"/>
-              </w:rPr>
-              <w:br/>
-              <w:t xml:space="preserve">        CHECK (status IN ('Pending', 'Paid', 'Confirmed', 'Cancelled'))</w:t>
-            </w:r>
-            <w:r>
-              <w:rPr>
-                <w:rFonts w:ascii="Consolas" w:eastAsia="Consolas" w:hAnsi="Consolas" w:cs="Consolas"/>
-                <w:color w:val="0F172A"/>
-                <w:sz w:val="19"/>
-              </w:rPr>
-              <w:t>,</w:t>
+              <w:t xml:space="preserve">        CHECK (status IN ('Pending', 'Paid', 'Confirmed', 'Cancelled')),</w:t>
             </w:r>
             <w:r>
               <w:rPr>
@@ -13349,15 +12791,7 @@
           <w:color w:val="0F172A"/>
           <w:sz w:val="32"/>
         </w:rPr>
-        <w:t xml:space="preserve">3.2 </w:t>
-      </w:r>
-      <w:r>
-        <w:rPr>
-          <w:rFonts w:ascii="TH Sarabun New" w:eastAsia="TH Sarabun New" w:hAnsi="TH Sarabun New" w:cs="TH Sarabun New"/>
-          <w:color w:val="0F172A"/>
-          <w:sz w:val="32"/>
-        </w:rPr>
-        <w:t>ข้อกำหนดบูรณภาพข้อมูล (Integrity Constraints)</w:t>
+        <w:t>3.2 ข้อกำหนดบูรณภาพข้อมูล (Integrity Constraints)</w:t>
       </w:r>
     </w:p>
     <w:p>
@@ -13372,21 +12806,7 @@
           <w:rFonts w:eastAsia="TH Sarabun New" w:cs="TH Sarabun New"/>
           <w:color w:val="1E293B"/>
         </w:rPr>
-        <w:t xml:space="preserve">1. Primary Key Constraint: </w:t>
-      </w:r>
-      <w:r>
-        <w:rPr>
-          <w:rFonts w:eastAsia="TH Sarabun New" w:cs="TH Sarabun New"/>
-          <w:color w:val="1E293B"/>
-        </w:rPr>
-        <w:t xml:space="preserve">ทุกตารางมีคอลัมน์ id เป็นคีย์หลักแบบ SERIAL </w:t>
-      </w:r>
-      <w:r>
-        <w:rPr>
-          <w:rFonts w:eastAsia="TH Sarabun New" w:cs="TH Sarabun New"/>
-          <w:color w:val="1E293B"/>
-        </w:rPr>
-        <w:t>รับประกันความไม่ซ้ำและห้ามเป็นค่าว่าง</w:t>
+        <w:t>1. Primary Key Constraint: ทุกตารางมีคอลัมน์ id เป็นคีย์หลักแบบ SERIAL รับประกันความไม่ซ้ำและห้ามเป็นค่าว่าง</w:t>
       </w:r>
     </w:p>
     <w:p>
@@ -13401,14 +12821,7 @@
           <w:rFonts w:eastAsia="TH Sarabun New" w:cs="TH Sarabun New"/>
           <w:color w:val="1E293B"/>
         </w:rPr>
-        <w:t xml:space="preserve">2. Foreign Key Constraint: </w:t>
-      </w:r>
-      <w:r>
-        <w:rPr>
-          <w:rFonts w:eastAsia="TH Sarabun New" w:cs="TH Sarabun New"/>
-          <w:color w:val="1E293B"/>
-        </w:rPr>
-        <w:t>เชื่อมโยงความสัมพันธ์ข้ามตาราง พร้อมกำหนด ON DELETE CASCADE (สำหรับรายการย่อยและลิงก์ดาวน์โหลด) หรือ ON DELETE SET NULL / RESTRICT เพื่อป้องกันปัญหาข้อมูลกำพร้า (Orphan Records)</w:t>
+        <w:t>2. Foreign Key Constraint: เชื่อมโยงความสัมพันธ์ข้ามตาราง พร้อมกำหนด ON DELETE CASCADE (สำหรับรายการย่อยและลิงก์ดาวน์โหลด) หรือ ON DELETE SET NULL / RESTRICT เพื่อป้องกันปัญหาข้อมูลกำพร้า (Orphan Records)</w:t>
       </w:r>
     </w:p>
     <w:p>
@@ -13424,14 +12837,7 @@
           <w:color w:val="1E293B"/>
         </w:rPr>
         <w:lastRenderedPageBreak/>
-        <w:t xml:space="preserve">3. NOT NULL Constraint: </w:t>
-      </w:r>
-      <w:r>
-        <w:rPr>
-          <w:rFonts w:eastAsia="TH Sarabun New" w:cs="TH Sarabun New"/>
-          <w:color w:val="1E293B"/>
-        </w:rPr>
-        <w:t>บังคับให้ฟิลด์สำคัญต้องมีค่าเสมอ เช่น ชื่อหนังสือ, ราคา, อีเมล, ชื่อผู้สั่งซื้อ</w:t>
+        <w:t>3. NOT NULL Constraint: บังคับให้ฟิลด์สำคัญต้องมีค่าเสมอ เช่น ชื่อหนังสือ, ราคา, อีเมล, ชื่อผู้สั่งซื้อ</w:t>
       </w:r>
     </w:p>
     <w:p>
@@ -13446,14 +12852,7 @@
           <w:rFonts w:eastAsia="TH Sarabun New" w:cs="TH Sarabun New"/>
           <w:color w:val="1E293B"/>
         </w:rPr>
-        <w:t xml:space="preserve">4. UNIQUE Constraint: </w:t>
-      </w:r>
-      <w:r>
-        <w:rPr>
-          <w:rFonts w:eastAsia="TH Sarabun New" w:cs="TH Sarabun New"/>
-          <w:color w:val="1E293B"/>
-        </w:rPr>
-        <w:t>ป้องกันข้อมูลซ้ำซ้อนในระดับระบบ เช่น email สมาชิก, isbn หนังสือ, slug หมวดหมู่, และ token ดาวน์โหลด</w:t>
+        <w:t>4. UNIQUE Constraint: ป้องกันข้อมูลซ้ำซ้อนในระดับระบบ เช่น email สมาชิก, isbn หนังสือ, slug หมวดหมู่, และ token ดาวน์โหลด</w:t>
       </w:r>
     </w:p>
     <w:p>
@@ -13468,14 +12867,7 @@
           <w:rFonts w:eastAsia="TH Sarabun New" w:cs="TH Sarabun New"/>
           <w:color w:val="1E293B"/>
         </w:rPr>
-        <w:t xml:space="preserve">5. CHECK Constraint: </w:t>
-      </w:r>
-      <w:r>
-        <w:rPr>
-          <w:rFonts w:eastAsia="TH Sarabun New" w:cs="TH Sarabun New"/>
-          <w:color w:val="1E293B"/>
-        </w:rPr>
-        <w:t>ตรวจสอบความสมเหตุสมผลของข้อมูล เช่น price &gt;= 0, total &gt;= 0, quantity &gt; 0, และ status ที่จำกัดเฉพาะค่าที่กำหนด</w:t>
+        <w:t>5. CHECK Constraint: ตรวจสอบความสมเหตุสมผลของข้อมูล เช่น price &gt;= 0, total &gt;= 0, quantity &gt; 0, และ status ที่จำกัดเฉพาะค่าที่กำหนด</w:t>
       </w:r>
     </w:p>
     <w:p>
@@ -13490,14 +12882,7 @@
           <w:rFonts w:eastAsia="TH Sarabun New" w:cs="TH Sarabun New"/>
           <w:color w:val="1E293B"/>
         </w:rPr>
-        <w:t xml:space="preserve">6. DEFAULT Constraint: </w:t>
-      </w:r>
-      <w:r>
-        <w:rPr>
-          <w:rFonts w:eastAsia="TH Sarabun New" w:cs="TH Sarabun New"/>
-          <w:color w:val="1E293B"/>
-        </w:rPr>
-        <w:t>กำหนดค่าเริ่มต้นอัตโนมัติ เช่น is_active = TRUE, created_at = CURRENT_TIMESTAMP</w:t>
+        <w:t>6. DEFAULT Constraint: กำหนดค่าเริ่มต้นอัตโนมัติ เช่น is_active = TRUE, created_at = CURRENT_TIMESTAMP</w:t>
       </w:r>
     </w:p>
     <w:p>
@@ -13511,15 +12896,7 @@
           <w:color w:val="0F172A"/>
           <w:sz w:val="32"/>
         </w:rPr>
-        <w:t xml:space="preserve">3.3 </w:t>
-      </w:r>
-      <w:r>
-        <w:rPr>
-          <w:rFonts w:ascii="TH Sarabun New" w:eastAsia="TH Sarabun New" w:hAnsi="TH Sarabun New" w:cs="TH Sarabun New"/>
-          <w:color w:val="0F172A"/>
-          <w:sz w:val="32"/>
-        </w:rPr>
-        <w:t>ข้อมูลตัวอย่างทดสอบระบบ (Seed Data)</w:t>
+        <w:t>3.3 ข้อมูลตัวอย่างทดสอบระบบ (Seed Data)</w:t>
       </w:r>
     </w:p>
     <w:p>
@@ -13588,15 +12965,7 @@
           <w:color w:val="0F172A"/>
           <w:sz w:val="32"/>
         </w:rPr>
-        <w:t xml:space="preserve">4.1 </w:t>
-      </w:r>
-      <w:r>
-        <w:rPr>
-          <w:rFonts w:ascii="TH Sarabun New" w:eastAsia="TH Sarabun New" w:hAnsi="TH Sarabun New" w:cs="TH Sarabun New"/>
-          <w:color w:val="0F172A"/>
-          <w:sz w:val="32"/>
-        </w:rPr>
-        <w:t>รายงานที่ 1: ยอดขายตามช่วงเวลา (Sales Over Time by Month)</w:t>
+        <w:t>4.1 รายงานที่ 1: ยอดขายตามช่วงเวลา (Sales Over Time by Month)</w:t>
       </w:r>
     </w:p>
     <w:p>
@@ -13612,15 +12981,7 @@
           <w:b/>
           <w:color w:val="1E293B"/>
         </w:rPr>
-        <w:t xml:space="preserve">• </w:t>
-      </w:r>
-      <w:r>
-        <w:rPr>
-          <w:rFonts w:eastAsia="TH Sarabun New" w:cs="TH Sarabun New"/>
-          <w:b/>
-          <w:color w:val="1E293B"/>
-        </w:rPr>
-        <w:t>คำถามทางธุรกิจ: ยอดขาย จำนวนคำสั่งซื้อ และค่าเฉลี่ยต่อคำสั่งซื้อ (AOV) มีแนวโน้มเปลี่ยนแปลงไปอย่างไรตามแต่ละเดือน?</w:t>
+        <w:t>• คำถามทางธุรกิจ: ยอดขาย จำนวนคำสั่งซื้อ และค่าเฉลี่ยต่อคำสั่งซื้อ (AOV) มีแนวโน้มเปลี่ยนแปลงไปอย่างไรตามแต่ละเดือน?</w:t>
       </w:r>
     </w:p>
     <w:p>
@@ -13635,14 +12996,7 @@
           <w:rFonts w:eastAsia="TH Sarabun New" w:cs="TH Sarabun New"/>
           <w:color w:val="1E293B"/>
         </w:rPr>
-        <w:t xml:space="preserve">• </w:t>
-      </w:r>
-      <w:r>
-        <w:rPr>
-          <w:rFonts w:eastAsia="TH Sarabun New" w:cs="TH Sarabun New"/>
-          <w:color w:val="1E293B"/>
-        </w:rPr>
-        <w:t>คำสั่ง SQL Query (JOIN, GROUP BY, SUM, COUNT, AVG, TO_CHAR):</w:t>
+        <w:t>• คำสั่ง SQL Query (JOIN, GROUP BY, SUM, COUNT, AVG, TO_CHAR):</w:t>
       </w:r>
     </w:p>
     <w:tbl>
@@ -13954,15 +13308,7 @@
                 <w:color w:val="1E293B"/>
                 <w:sz w:val="23"/>
               </w:rPr>
-              <w:t>2026-09 (</w:t>
-            </w:r>
-            <w:r>
-              <w:rPr>
-                <w:rFonts w:eastAsia="TH Sarabun New" w:cs="TH Sarabun New"/>
-                <w:color w:val="1E293B"/>
-                <w:sz w:val="23"/>
-              </w:rPr>
-              <w:t>ล่าสุด)</w:t>
+              <w:t>2026-09 (ล่าสุด)</w:t>
             </w:r>
           </w:p>
         </w:tc>
@@ -13991,15 +13337,7 @@
                 <w:color w:val="1E293B"/>
                 <w:sz w:val="23"/>
               </w:rPr>
-              <w:t xml:space="preserve">7 </w:t>
-            </w:r>
-            <w:r>
-              <w:rPr>
-                <w:rFonts w:eastAsia="TH Sarabun New" w:cs="TH Sarabun New"/>
-                <w:color w:val="1E293B"/>
-                <w:sz w:val="23"/>
-              </w:rPr>
-              <w:t>ออเดอร์</w:t>
+              <w:t>7 ออเดอร์</w:t>
             </w:r>
           </w:p>
         </w:tc>
@@ -14124,15 +13462,7 @@
                 <w:color w:val="1E293B"/>
                 <w:sz w:val="23"/>
               </w:rPr>
-              <w:t xml:space="preserve">8 </w:t>
-            </w:r>
-            <w:r>
-              <w:rPr>
-                <w:rFonts w:eastAsia="TH Sarabun New" w:cs="TH Sarabun New"/>
-                <w:color w:val="1E293B"/>
-                <w:sz w:val="23"/>
-              </w:rPr>
-              <w:t>ออเดอร์</w:t>
+              <w:t>8 ออเดอร์</w:t>
             </w:r>
           </w:p>
         </w:tc>
@@ -14257,15 +13587,7 @@
                 <w:color w:val="1E293B"/>
                 <w:sz w:val="23"/>
               </w:rPr>
-              <w:t xml:space="preserve">8 </w:t>
-            </w:r>
-            <w:r>
-              <w:rPr>
-                <w:rFonts w:eastAsia="TH Sarabun New" w:cs="TH Sarabun New"/>
-                <w:color w:val="1E293B"/>
-                <w:sz w:val="23"/>
-              </w:rPr>
-              <w:t>ออเดอร์</w:t>
+              <w:t>8 ออเดอร์</w:t>
             </w:r>
           </w:p>
         </w:tc>
@@ -14390,15 +13712,7 @@
                 <w:color w:val="1E293B"/>
                 <w:sz w:val="23"/>
               </w:rPr>
-              <w:t xml:space="preserve">8 </w:t>
-            </w:r>
-            <w:r>
-              <w:rPr>
-                <w:rFonts w:eastAsia="TH Sarabun New" w:cs="TH Sarabun New"/>
-                <w:color w:val="1E293B"/>
-                <w:sz w:val="23"/>
-              </w:rPr>
-              <w:t>ออเดอร์</w:t>
+              <w:t>8 ออเดอร์</w:t>
             </w:r>
           </w:p>
         </w:tc>
@@ -14477,23 +13791,7 @@
           <w:i/>
           <w:color w:val="1E293B"/>
         </w:rPr>
-        <w:t xml:space="preserve">• </w:t>
-      </w:r>
-      <w:r>
-        <w:rPr>
-          <w:rFonts w:eastAsia="TH Sarabun New" w:cs="TH Sarabun New"/>
-          <w:i/>
-          <w:color w:val="1E293B"/>
-        </w:rPr>
-        <w:t xml:space="preserve">ผลการวิเคราะห์: ยอดขายในเดือนกันยายน 2026 สะท้อนข้อมูลการสั่งซื้อที่เพิ่มขึ้นสดจากระบบจริง </w:t>
-      </w:r>
-      <w:r>
-        <w:rPr>
-          <w:rFonts w:eastAsia="TH Sarabun New" w:cs="TH Sarabun New"/>
-          <w:i/>
-          <w:color w:val="1E293B"/>
-        </w:rPr>
-        <w:t>ช่วยให้ผู้บริหารติดตามอัตราเติบโตและปรับกลยุทธ์ส่งเสริมการขายได้อย่างทันท่วงที</w:t>
+        <w:t>• ผลการวิเคราะห์: ยอดขายในเดือนกันยายน 2026 สะท้อนข้อมูลการสั่งซื้อที่เพิ่มขึ้นสดจากระบบจริง ช่วยให้ผู้บริหารติดตามอัตราเติบโตและปรับกลยุทธ์ส่งเสริมการขายได้อย่างทันท่วงที</w:t>
       </w:r>
     </w:p>
     <w:p>
@@ -14507,15 +13805,7 @@
           <w:color w:val="0F172A"/>
           <w:sz w:val="32"/>
         </w:rPr>
-        <w:t xml:space="preserve">4.2 </w:t>
-      </w:r>
-      <w:r>
-        <w:rPr>
-          <w:rFonts w:ascii="TH Sarabun New" w:eastAsia="TH Sarabun New" w:hAnsi="TH Sarabun New" w:cs="TH Sarabun New"/>
-          <w:color w:val="0F172A"/>
-          <w:sz w:val="32"/>
-        </w:rPr>
-        <w:t>รายงานที่ 2: E-Book ขายดีที่สุด 5 อันดับแรก (Top-Selling Books)</w:t>
+        <w:t>4.2 รายงานที่ 2: E-Book ขายดีที่สุด 5 อันดับแรก (Top-Selling Books)</w:t>
       </w:r>
     </w:p>
     <w:p>
@@ -14531,15 +13821,7 @@
           <w:b/>
           <w:color w:val="1E293B"/>
         </w:rPr>
-        <w:t xml:space="preserve">• </w:t>
-      </w:r>
-      <w:r>
-        <w:rPr>
-          <w:rFonts w:eastAsia="TH Sarabun New" w:cs="TH Sarabun New"/>
-          <w:b/>
-          <w:color w:val="1E293B"/>
-        </w:rPr>
-        <w:t>คำถามทางธุรกิจ: E-Book ใดขายได้มากที่สุด 5 อันดับแรกตามจำนวนเล่มและยอดขายรวม?</w:t>
+        <w:t>• คำถามทางธุรกิจ: E-Book ใดขายได้มากที่สุด 5 อันดับแรกตามจำนวนเล่มและยอดขายรวม?</w:t>
       </w:r>
     </w:p>
     <w:p>
@@ -14554,14 +13836,7 @@
           <w:rFonts w:eastAsia="TH Sarabun New" w:cs="TH Sarabun New"/>
           <w:color w:val="1E293B"/>
         </w:rPr>
-        <w:t xml:space="preserve">• </w:t>
-      </w:r>
-      <w:r>
-        <w:rPr>
-          <w:rFonts w:eastAsia="TH Sarabun New" w:cs="TH Sarabun New"/>
-          <w:color w:val="1E293B"/>
-        </w:rPr>
-        <w:t>คำสั่ง SQL Query (JOIN 4 ตาราง, GROUP BY, LIMIT 5):</w:t>
+        <w:t>• คำสั่ง SQL Query (JOIN 4 ตาราง, GROUP BY, LIMIT 5):</w:t>
       </w:r>
     </w:p>
     <w:tbl>
@@ -14643,7 +13918,7 @@
                 <w:sz w:val="19"/>
               </w:rPr>
               <w:br/>
-              <w:t xml:space="preserve">    COALESCE(a.name, '</w:t>
+              <w:t xml:space="preserve">    COALESCE(a.name, 'ไม่ระบุผู้แต่ง') AS author_name,</w:t>
             </w:r>
             <w:r>
               <w:rPr>
@@ -14651,7 +13926,8 @@
                 <w:color w:val="0F172A"/>
                 <w:sz w:val="19"/>
               </w:rPr>
-              <w:t>ไม่ระบุผู้แต่ง') AS author_name,</w:t>
+              <w:br/>
+              <w:t xml:space="preserve">    COALESCE(c.name, 'ทั่วไป') AS category_name,</w:t>
             </w:r>
             <w:r>
               <w:rPr>
@@ -14660,7 +13936,7 @@
                 <w:sz w:val="19"/>
               </w:rPr>
               <w:br/>
-              <w:t xml:space="preserve">    COALESCE(c.name, 'ทั่วไป') AS category_name,</w:t>
+              <w:t xml:space="preserve">    SUM(oi.quantity) AS total_sold_copies,</w:t>
             </w:r>
             <w:r>
               <w:rPr>
@@ -14669,7 +13945,7 @@
                 <w:sz w:val="19"/>
               </w:rPr>
               <w:br/>
-              <w:t xml:space="preserve">    SUM(oi.quantity) AS total_sold_copies,</w:t>
+              <w:t xml:space="preserve">    SUM(oi.quantity * oi.price_at_time) AS total_revenue</w:t>
             </w:r>
             <w:r>
               <w:rPr>
@@ -14678,7 +13954,7 @@
                 <w:sz w:val="19"/>
               </w:rPr>
               <w:br/>
-              <w:t xml:space="preserve">    SUM(oi.quantity * oi.price_at_time) AS total_revenue</w:t>
+              <w:t>FROM order_items oi</w:t>
             </w:r>
             <w:r>
               <w:rPr>
@@ -14687,7 +13963,7 @@
                 <w:sz w:val="19"/>
               </w:rPr>
               <w:br/>
-              <w:t>FROM order_items oi</w:t>
+              <w:t>JOIN books b ON oi.book_id = b.id</w:t>
             </w:r>
             <w:r>
               <w:rPr>
@@ -14696,7 +13972,7 @@
                 <w:sz w:val="19"/>
               </w:rPr>
               <w:br/>
-              <w:t>JOIN books b ON oi.book_id = b.id</w:t>
+              <w:t>LEFT JOIN authors a ON b.author_id = a.id</w:t>
             </w:r>
             <w:r>
               <w:rPr>
@@ -14705,7 +13981,7 @@
                 <w:sz w:val="19"/>
               </w:rPr>
               <w:br/>
-              <w:t>LEFT JOIN authors a ON b.author_id = a.id</w:t>
+              <w:t>LEFT JOIN categories c ON b.category_id = c.id</w:t>
             </w:r>
             <w:r>
               <w:rPr>
@@ -14714,7 +13990,7 @@
                 <w:sz w:val="19"/>
               </w:rPr>
               <w:br/>
-              <w:t>LEFT JOIN categories c ON b.category_id = c.id</w:t>
+              <w:t>JOIN orders o ON oi.order_id = o.id</w:t>
             </w:r>
             <w:r>
               <w:rPr>
@@ -14723,7 +13999,7 @@
                 <w:sz w:val="19"/>
               </w:rPr>
               <w:br/>
-              <w:t>JOIN orders o ON oi.order_id = o.id</w:t>
+              <w:t>WHERE o.status IN ('Confirmed', 'Completed', 'Paid')</w:t>
             </w:r>
             <w:r>
               <w:rPr>
@@ -14732,7 +14008,7 @@
                 <w:sz w:val="19"/>
               </w:rPr>
               <w:br/>
-              <w:t>WHERE o.status IN ('Confirmed', 'Completed', 'Paid')</w:t>
+              <w:t>GROUP BY b.id, b.title, a.name, c.name</w:t>
             </w:r>
             <w:r>
               <w:rPr>
@@ -14741,24 +14017,7 @@
                 <w:sz w:val="19"/>
               </w:rPr>
               <w:br/>
-              <w:t>GROUP BY b.id, b.title, a.name, c.name</w:t>
-            </w:r>
-            <w:r>
-              <w:rPr>
-                <w:rFonts w:ascii="Consolas" w:eastAsia="Consolas" w:hAnsi="Consolas" w:cs="Consolas"/>
-                <w:color w:val="0F172A"/>
-                <w:sz w:val="19"/>
-              </w:rPr>
-              <w:br/>
-              <w:t>OR</w:t>
-            </w:r>
-            <w:r>
-              <w:rPr>
-                <w:rFonts w:ascii="Consolas" w:eastAsia="Consolas" w:hAnsi="Consolas" w:cs="Consolas"/>
-                <w:color w:val="0F172A"/>
-                <w:sz w:val="19"/>
-              </w:rPr>
-              <w:t>DER BY total_sold_copies DESC, total_revenue DESC</w:t>
+              <w:t>ORDER BY total_sold_copies DESC, total_revenue DESC</w:t>
             </w:r>
             <w:r>
               <w:rPr>
@@ -15141,15 +14400,7 @@
                 <w:color w:val="1E293B"/>
                 <w:sz w:val="19"/>
               </w:rPr>
-              <w:t xml:space="preserve">6 </w:t>
-            </w:r>
-            <w:r>
-              <w:rPr>
-                <w:rFonts w:eastAsia="TH Sarabun New" w:cs="TH Sarabun New"/>
-                <w:color w:val="1E293B"/>
-                <w:sz w:val="19"/>
-              </w:rPr>
-              <w:t>เล่ม</w:t>
+              <w:t>6 เล่ม</w:t>
             </w:r>
           </w:p>
         </w:tc>
@@ -15244,15 +14495,7 @@
                 <w:color w:val="1E293B"/>
                 <w:sz w:val="19"/>
               </w:rPr>
-              <w:t xml:space="preserve">The Quiet </w:t>
-            </w:r>
-            <w:r>
-              <w:rPr>
-                <w:rFonts w:eastAsia="TH Sarabun New" w:cs="TH Sarabun New"/>
-                <w:color w:val="1E293B"/>
-                <w:sz w:val="19"/>
-              </w:rPr>
-              <w:t>Algorithm</w:t>
+              <w:t>The Quiet Algorithm</w:t>
             </w:r>
           </w:p>
         </w:tc>
@@ -15339,15 +14582,7 @@
                 <w:color w:val="1E293B"/>
                 <w:sz w:val="19"/>
               </w:rPr>
-              <w:t xml:space="preserve">5 </w:t>
-            </w:r>
-            <w:r>
-              <w:rPr>
-                <w:rFonts w:eastAsia="TH Sarabun New" w:cs="TH Sarabun New"/>
-                <w:color w:val="1E293B"/>
-                <w:sz w:val="19"/>
-              </w:rPr>
-              <w:t>เล่ม</w:t>
+              <w:t>5 เล่ม</w:t>
             </w:r>
           </w:p>
         </w:tc>
@@ -15529,15 +14764,7 @@
                 <w:color w:val="1E293B"/>
                 <w:sz w:val="19"/>
               </w:rPr>
-              <w:t xml:space="preserve">3 </w:t>
-            </w:r>
-            <w:r>
-              <w:rPr>
-                <w:rFonts w:eastAsia="TH Sarabun New" w:cs="TH Sarabun New"/>
-                <w:color w:val="1E293B"/>
-                <w:sz w:val="19"/>
-              </w:rPr>
-              <w:t>เล่ม</w:t>
+              <w:t>3 เล่ม</w:t>
             </w:r>
           </w:p>
         </w:tc>
@@ -15719,15 +14946,7 @@
                 <w:color w:val="1E293B"/>
                 <w:sz w:val="19"/>
               </w:rPr>
-              <w:t xml:space="preserve">3 </w:t>
-            </w:r>
-            <w:r>
-              <w:rPr>
-                <w:rFonts w:eastAsia="TH Sarabun New" w:cs="TH Sarabun New"/>
-                <w:color w:val="1E293B"/>
-                <w:sz w:val="19"/>
-              </w:rPr>
-              <w:t>เล่ม</w:t>
+              <w:t>3 เล่ม</w:t>
             </w:r>
           </w:p>
         </w:tc>
@@ -15909,15 +15128,7 @@
                 <w:color w:val="1E293B"/>
                 <w:sz w:val="19"/>
               </w:rPr>
-              <w:t xml:space="preserve">3 </w:t>
-            </w:r>
-            <w:r>
-              <w:rPr>
-                <w:rFonts w:eastAsia="TH Sarabun New" w:cs="TH Sarabun New"/>
-                <w:color w:val="1E293B"/>
-                <w:sz w:val="19"/>
-              </w:rPr>
-              <w:t>เล่ม</w:t>
+              <w:t>3 เล่ม</w:t>
             </w:r>
           </w:p>
         </w:tc>
@@ -15966,15 +15177,7 @@
           <w:i/>
           <w:color w:val="1E293B"/>
         </w:rPr>
-        <w:t xml:space="preserve">• </w:t>
-      </w:r>
-      <w:r>
-        <w:rPr>
-          <w:rFonts w:eastAsia="TH Sarabun New" w:cs="TH Sarabun New"/>
-          <w:i/>
-          <w:color w:val="1E293B"/>
-        </w:rPr>
-        <w:t>ผลการวิเคราะห์: หนังสือด้านวิทยาการและเทคโนโลยีสร้างรายได้เฉลี่ยต่อเล่มสูงสุด ควรจัดวางเป็นสินค้าแนะนำบนแบนเนอร์หน้าแรกของร้าน</w:t>
+        <w:t>• ผลการวิเคราะห์: หนังสือด้านวิทยาการและเทคโนโลยีสร้างรายได้เฉลี่ยต่อเล่มสูงสุด ควรจัดวางเป็นสินค้าแนะนำบนแบนเนอร์หน้าแรกของร้าน</w:t>
       </w:r>
     </w:p>
     <w:p>
@@ -15988,15 +15191,7 @@
           <w:color w:val="0F172A"/>
           <w:sz w:val="32"/>
         </w:rPr>
-        <w:t xml:space="preserve">4.3 </w:t>
-      </w:r>
-      <w:r>
-        <w:rPr>
-          <w:rFonts w:ascii="TH Sarabun New" w:eastAsia="TH Sarabun New" w:hAnsi="TH Sarabun New" w:cs="TH Sarabun New"/>
-          <w:color w:val="0F172A"/>
-          <w:sz w:val="32"/>
-        </w:rPr>
-        <w:t>รายงานที่ 3: ยอดขายตามหมวดหมู่ (Sales by Category)</w:t>
+        <w:t>4.3 รายงานที่ 3: ยอดขายตามหมวดหมู่ (Sales by Category)</w:t>
       </w:r>
     </w:p>
     <w:p>
@@ -16012,23 +15207,7 @@
           <w:b/>
           <w:color w:val="1E293B"/>
         </w:rPr>
-        <w:t xml:space="preserve">• </w:t>
-      </w:r>
-      <w:r>
-        <w:rPr>
-          <w:rFonts w:eastAsia="TH Sarabun New" w:cs="TH Sarabun New"/>
-          <w:b/>
-          <w:color w:val="1E293B"/>
-        </w:rPr>
-        <w:t xml:space="preserve">คำถามทางธุรกิจ: </w:t>
-      </w:r>
-      <w:r>
-        <w:rPr>
-          <w:rFonts w:eastAsia="TH Sarabun New" w:cs="TH Sarabun New"/>
-          <w:b/>
-          <w:color w:val="1E293B"/>
-        </w:rPr>
-        <w:t>หมวดหมู่ใดสร้างยอดขายและจำนวนรายการสั่งซื้อได้สูงสุด?</w:t>
+        <w:t>• คำถามทางธุรกิจ: หมวดหมู่ใดสร้างยอดขายและจำนวนรายการสั่งซื้อได้สูงสุด?</w:t>
       </w:r>
     </w:p>
     <w:p>
@@ -16043,14 +15222,7 @@
           <w:rFonts w:eastAsia="TH Sarabun New" w:cs="TH Sarabun New"/>
           <w:color w:val="1E293B"/>
         </w:rPr>
-        <w:t xml:space="preserve">• </w:t>
-      </w:r>
-      <w:r>
-        <w:rPr>
-          <w:rFonts w:eastAsia="TH Sarabun New" w:cs="TH Sarabun New"/>
-          <w:color w:val="1E293B"/>
-        </w:rPr>
-        <w:t>คำสั่ง SQL Query (JOIN หลายตาราง, GROUP BY, SUM):</w:t>
+        <w:t>• คำสั่ง SQL Query (JOIN หลายตาราง, GROUP BY, SUM):</w:t>
       </w:r>
     </w:p>
     <w:tbl>
@@ -16490,15 +15662,7 @@
                 <w:color w:val="1E293B"/>
                 <w:sz w:val="20"/>
               </w:rPr>
-              <w:t xml:space="preserve">10 </w:t>
-            </w:r>
-            <w:r>
-              <w:rPr>
-                <w:rFonts w:eastAsia="TH Sarabun New" w:cs="TH Sarabun New"/>
-                <w:color w:val="1E293B"/>
-                <w:sz w:val="20"/>
-              </w:rPr>
-              <w:t>ออเดอร์</w:t>
+              <w:t>10 ออเดอร์</w:t>
             </w:r>
           </w:p>
         </w:tc>
@@ -16527,15 +15691,7 @@
                 <w:color w:val="1E293B"/>
                 <w:sz w:val="20"/>
               </w:rPr>
-              <w:t xml:space="preserve">10 </w:t>
-            </w:r>
-            <w:r>
-              <w:rPr>
-                <w:rFonts w:eastAsia="TH Sarabun New" w:cs="TH Sarabun New"/>
-                <w:color w:val="1E293B"/>
-                <w:sz w:val="20"/>
-              </w:rPr>
-              <w:t>เล่ม</w:t>
+              <w:t>10 เล่ม</w:t>
             </w:r>
           </w:p>
         </w:tc>
@@ -16659,15 +15815,7 @@
                 <w:color w:val="1E293B"/>
                 <w:sz w:val="20"/>
               </w:rPr>
-              <w:t xml:space="preserve">9 </w:t>
-            </w:r>
-            <w:r>
-              <w:rPr>
-                <w:rFonts w:eastAsia="TH Sarabun New" w:cs="TH Sarabun New"/>
-                <w:color w:val="1E293B"/>
-                <w:sz w:val="20"/>
-              </w:rPr>
-              <w:t>ออเดอร์</w:t>
+              <w:t>9 ออเดอร์</w:t>
             </w:r>
           </w:p>
         </w:tc>
@@ -16696,15 +15844,7 @@
                 <w:color w:val="1E293B"/>
                 <w:sz w:val="20"/>
               </w:rPr>
-              <w:t xml:space="preserve">9 </w:t>
-            </w:r>
-            <w:r>
-              <w:rPr>
-                <w:rFonts w:eastAsia="TH Sarabun New" w:cs="TH Sarabun New"/>
-                <w:color w:val="1E293B"/>
-                <w:sz w:val="20"/>
-              </w:rPr>
-              <w:t>เล่ม</w:t>
+              <w:t>9 เล่ม</w:t>
             </w:r>
           </w:p>
         </w:tc>
@@ -16828,15 +15968,7 @@
                 <w:color w:val="1E293B"/>
                 <w:sz w:val="20"/>
               </w:rPr>
-              <w:t xml:space="preserve">6 </w:t>
-            </w:r>
-            <w:r>
-              <w:rPr>
-                <w:rFonts w:eastAsia="TH Sarabun New" w:cs="TH Sarabun New"/>
-                <w:color w:val="1E293B"/>
-                <w:sz w:val="20"/>
-              </w:rPr>
-              <w:t>ออเดอร์</w:t>
+              <w:t>6 ออเดอร์</w:t>
             </w:r>
           </w:p>
         </w:tc>
@@ -16865,15 +15997,7 @@
                 <w:color w:val="1E293B"/>
                 <w:sz w:val="20"/>
               </w:rPr>
-              <w:t xml:space="preserve">6 </w:t>
-            </w:r>
-            <w:r>
-              <w:rPr>
-                <w:rFonts w:eastAsia="TH Sarabun New" w:cs="TH Sarabun New"/>
-                <w:color w:val="1E293B"/>
-                <w:sz w:val="20"/>
-              </w:rPr>
-              <w:t>เล่ม</w:t>
+              <w:t>6 เล่ม</w:t>
             </w:r>
           </w:p>
         </w:tc>
@@ -16997,15 +16121,7 @@
                 <w:color w:val="1E293B"/>
                 <w:sz w:val="20"/>
               </w:rPr>
-              <w:t xml:space="preserve">5 </w:t>
-            </w:r>
-            <w:r>
-              <w:rPr>
-                <w:rFonts w:eastAsia="TH Sarabun New" w:cs="TH Sarabun New"/>
-                <w:color w:val="1E293B"/>
-                <w:sz w:val="20"/>
-              </w:rPr>
-              <w:t>ออเดอร์</w:t>
+              <w:t>5 ออเดอร์</w:t>
             </w:r>
           </w:p>
         </w:tc>
@@ -17034,15 +16150,7 @@
                 <w:color w:val="1E293B"/>
                 <w:sz w:val="20"/>
               </w:rPr>
-              <w:t xml:space="preserve">5 </w:t>
-            </w:r>
-            <w:r>
-              <w:rPr>
-                <w:rFonts w:eastAsia="TH Sarabun New" w:cs="TH Sarabun New"/>
-                <w:color w:val="1E293B"/>
-                <w:sz w:val="20"/>
-              </w:rPr>
-              <w:t>เล่ม</w:t>
+              <w:t>5 เล่ม</w:t>
             </w:r>
           </w:p>
         </w:tc>
@@ -17166,15 +16274,7 @@
                 <w:color w:val="1E293B"/>
                 <w:sz w:val="20"/>
               </w:rPr>
-              <w:t xml:space="preserve">4 </w:t>
-            </w:r>
-            <w:r>
-              <w:rPr>
-                <w:rFonts w:eastAsia="TH Sarabun New" w:cs="TH Sarabun New"/>
-                <w:color w:val="1E293B"/>
-                <w:sz w:val="20"/>
-              </w:rPr>
-              <w:t>ออเดอร์</w:t>
+              <w:t>4 ออเดอร์</w:t>
             </w:r>
           </w:p>
         </w:tc>
@@ -17203,15 +16303,7 @@
                 <w:color w:val="1E293B"/>
                 <w:sz w:val="20"/>
               </w:rPr>
-              <w:t xml:space="preserve">4 </w:t>
-            </w:r>
-            <w:r>
-              <w:rPr>
-                <w:rFonts w:eastAsia="TH Sarabun New" w:cs="TH Sarabun New"/>
-                <w:color w:val="1E293B"/>
-                <w:sz w:val="20"/>
-              </w:rPr>
-              <w:t>เล่ม</w:t>
+              <w:t>4 เล่ม</w:t>
             </w:r>
           </w:p>
         </w:tc>
@@ -17260,23 +16352,7 @@
           <w:i/>
           <w:color w:val="1E293B"/>
         </w:rPr>
-        <w:t xml:space="preserve">• </w:t>
-      </w:r>
-      <w:r>
-        <w:rPr>
-          <w:rFonts w:eastAsia="TH Sarabun New" w:cs="TH Sarabun New"/>
-          <w:i/>
-          <w:color w:val="1E293B"/>
-        </w:rPr>
-        <w:t xml:space="preserve">ผลการวิเคราะห์: </w:t>
-      </w:r>
-      <w:r>
-        <w:rPr>
-          <w:rFonts w:eastAsia="TH Sarabun New" w:cs="TH Sarabun New"/>
-          <w:i/>
-          <w:color w:val="1E293B"/>
-        </w:rPr>
-        <w:t>หมวดวิทยาการและคอมพิวเตอร์มียอดขายรวมสูงสุด สะท้อนกลุ่มผู้อ่านหลักที่เป็นนักศึกษาและสายงานไอที</w:t>
+        <w:t>• ผลการวิเคราะห์: หมวดวิทยาการและคอมพิวเตอร์มียอดขายรวมสูงสุด สะท้อนกลุ่มผู้อ่านหลักที่เป็นนักศึกษาและสายงานไอที</w:t>
       </w:r>
     </w:p>
     <w:p>
@@ -17290,15 +16366,7 @@
           <w:color w:val="0F172A"/>
           <w:sz w:val="32"/>
         </w:rPr>
-        <w:t xml:space="preserve">4.4 </w:t>
-      </w:r>
-      <w:r>
-        <w:rPr>
-          <w:rFonts w:ascii="TH Sarabun New" w:eastAsia="TH Sarabun New" w:hAnsi="TH Sarabun New" w:cs="TH Sarabun New"/>
-          <w:color w:val="0F172A"/>
-          <w:sz w:val="32"/>
-        </w:rPr>
-        <w:t>รายงานที่ 4: พฤติกรรมลูกค้าและยอดซื้อสะสม (Customer Lifetime Value)</w:t>
+        <w:t>4.4 รายงานที่ 4: พฤติกรรมลูกค้าและยอดซื้อสะสม (Customer Lifetime Value)</w:t>
       </w:r>
     </w:p>
     <w:p>
@@ -17314,15 +16382,7 @@
           <w:b/>
           <w:color w:val="1E293B"/>
         </w:rPr>
-        <w:t xml:space="preserve">• </w:t>
-      </w:r>
-      <w:r>
-        <w:rPr>
-          <w:rFonts w:eastAsia="TH Sarabun New" w:cs="TH Sarabun New"/>
-          <w:b/>
-          <w:color w:val="1E293B"/>
-        </w:rPr>
-        <w:t>คำถามทางธุรกิจ: ลูกค้ารายใดมียอดซื้อสะสมสูงสุด และมีการแจกแจงสถานะคำสั่งซื้อเป็นอย่างไร?</w:t>
+        <w:t>• คำถามทางธุรกิจ: ลูกค้ารายใดมียอดซื้อสะสมสูงสุด และมีการแจกแจงสถานะคำสั่งซื้อเป็นอย่างไร?</w:t>
       </w:r>
     </w:p>
     <w:p>
@@ -17337,14 +16397,7 @@
           <w:rFonts w:eastAsia="TH Sarabun New" w:cs="TH Sarabun New"/>
           <w:color w:val="1E293B"/>
         </w:rPr>
-        <w:t xml:space="preserve">• </w:t>
-      </w:r>
-      <w:r>
-        <w:rPr>
-          <w:rFonts w:eastAsia="TH Sarabun New" w:cs="TH Sarabun New"/>
-          <w:color w:val="1E293B"/>
-        </w:rPr>
-        <w:t>คำสั่ง SQL Query (JOIN, GROUP BY, HAVING, CASE WHEN):</w:t>
+        <w:t>• คำสั่ง SQL Query (JOIN, GROUP BY, HAVING, CASE WHEN):</w:t>
       </w:r>
     </w:p>
     <w:tbl>
@@ -17490,15 +16543,7 @@
                 <w:sz w:val="19"/>
               </w:rPr>
               <w:br/>
-              <w:t>GROUP BY u.id, u.full_name,</w:t>
-            </w:r>
-            <w:r>
-              <w:rPr>
-                <w:rFonts w:ascii="Consolas" w:eastAsia="Consolas" w:hAnsi="Consolas" w:cs="Consolas"/>
-                <w:color w:val="0F172A"/>
-                <w:sz w:val="19"/>
-              </w:rPr>
-              <w:t xml:space="preserve"> u.email</w:t>
+              <w:t>GROUP BY u.id, u.full_name, u.email</w:t>
             </w:r>
             <w:r>
               <w:rPr>
@@ -17864,15 +16909,7 @@
                 <w:color w:val="1E293B"/>
                 <w:sz w:val="19"/>
               </w:rPr>
-              <w:t xml:space="preserve">6 </w:t>
-            </w:r>
-            <w:r>
-              <w:rPr>
-                <w:rFonts w:eastAsia="TH Sarabun New" w:cs="TH Sarabun New"/>
-                <w:color w:val="1E293B"/>
-                <w:sz w:val="19"/>
-              </w:rPr>
-              <w:t>ออเดอร์</w:t>
+              <w:t>6 ออเดอร์</w:t>
             </w:r>
           </w:p>
         </w:tc>
@@ -17931,15 +16968,7 @@
                 <w:color w:val="1E293B"/>
                 <w:sz w:val="19"/>
               </w:rPr>
-              <w:t xml:space="preserve">5 </w:t>
-            </w:r>
-            <w:r>
-              <w:rPr>
-                <w:rFonts w:eastAsia="TH Sarabun New" w:cs="TH Sarabun New"/>
-                <w:color w:val="1E293B"/>
-                <w:sz w:val="19"/>
-              </w:rPr>
-              <w:t>ออเดอร์</w:t>
+              <w:t>5 ออเดอร์</w:t>
             </w:r>
           </w:p>
         </w:tc>
@@ -17968,15 +16997,7 @@
                 <w:color w:val="1E293B"/>
                 <w:sz w:val="19"/>
               </w:rPr>
-              <w:t xml:space="preserve">1 </w:t>
-            </w:r>
-            <w:r>
-              <w:rPr>
-                <w:rFonts w:eastAsia="TH Sarabun New" w:cs="TH Sarabun New"/>
-                <w:color w:val="1E293B"/>
-                <w:sz w:val="19"/>
-              </w:rPr>
-              <w:t>ออเดอร์</w:t>
+              <w:t>1 ออเดอร์</w:t>
             </w:r>
           </w:p>
         </w:tc>
@@ -18100,15 +17121,7 @@
                 <w:color w:val="1E293B"/>
                 <w:sz w:val="19"/>
               </w:rPr>
-              <w:t xml:space="preserve">5 </w:t>
-            </w:r>
-            <w:r>
-              <w:rPr>
-                <w:rFonts w:eastAsia="TH Sarabun New" w:cs="TH Sarabun New"/>
-                <w:color w:val="1E293B"/>
-                <w:sz w:val="19"/>
-              </w:rPr>
-              <w:t>ออเดอร์</w:t>
+              <w:t>5 ออเดอร์</w:t>
             </w:r>
           </w:p>
         </w:tc>
@@ -18167,15 +17180,7 @@
                 <w:color w:val="1E293B"/>
                 <w:sz w:val="19"/>
               </w:rPr>
-              <w:t xml:space="preserve">4 </w:t>
-            </w:r>
-            <w:r>
-              <w:rPr>
-                <w:rFonts w:eastAsia="TH Sarabun New" w:cs="TH Sarabun New"/>
-                <w:color w:val="1E293B"/>
-                <w:sz w:val="19"/>
-              </w:rPr>
-              <w:t>ออเดอร์</w:t>
+              <w:t>4 ออเดอร์</w:t>
             </w:r>
           </w:p>
         </w:tc>
@@ -18204,15 +17209,7 @@
                 <w:color w:val="1E293B"/>
                 <w:sz w:val="19"/>
               </w:rPr>
-              <w:t xml:space="preserve">1 </w:t>
-            </w:r>
-            <w:r>
-              <w:rPr>
-                <w:rFonts w:eastAsia="TH Sarabun New" w:cs="TH Sarabun New"/>
-                <w:color w:val="1E293B"/>
-                <w:sz w:val="19"/>
-              </w:rPr>
-              <w:t>ออเดอร์</w:t>
+              <w:t>1 ออเดอร์</w:t>
             </w:r>
           </w:p>
         </w:tc>
@@ -18335,15 +17332,7 @@
                 <w:color w:val="1E293B"/>
                 <w:sz w:val="19"/>
               </w:rPr>
-              <w:t xml:space="preserve">4 </w:t>
-            </w:r>
-            <w:r>
-              <w:rPr>
-                <w:rFonts w:eastAsia="TH Sarabun New" w:cs="TH Sarabun New"/>
-                <w:color w:val="1E293B"/>
-                <w:sz w:val="19"/>
-              </w:rPr>
-              <w:t>ออเดอร์</w:t>
+              <w:t>4 ออเดอร์</w:t>
             </w:r>
           </w:p>
         </w:tc>
@@ -18402,15 +17391,7 @@
                 <w:color w:val="1E293B"/>
                 <w:sz w:val="19"/>
               </w:rPr>
-              <w:t xml:space="preserve">4 </w:t>
-            </w:r>
-            <w:r>
-              <w:rPr>
-                <w:rFonts w:eastAsia="TH Sarabun New" w:cs="TH Sarabun New"/>
-                <w:color w:val="1E293B"/>
-                <w:sz w:val="19"/>
-              </w:rPr>
-              <w:t>ออเดอร์</w:t>
+              <w:t>4 ออเดอร์</w:t>
             </w:r>
           </w:p>
         </w:tc>
@@ -18563,15 +17544,7 @@
                 <w:color w:val="1E293B"/>
                 <w:sz w:val="19"/>
               </w:rPr>
-              <w:t xml:space="preserve">4 </w:t>
-            </w:r>
-            <w:r>
-              <w:rPr>
-                <w:rFonts w:eastAsia="TH Sarabun New" w:cs="TH Sarabun New"/>
-                <w:color w:val="1E293B"/>
-                <w:sz w:val="19"/>
-              </w:rPr>
-              <w:t>ออเดอร์</w:t>
+              <w:t>4 ออเดอร์</w:t>
             </w:r>
           </w:p>
         </w:tc>
@@ -18630,15 +17603,7 @@
                 <w:color w:val="1E293B"/>
                 <w:sz w:val="19"/>
               </w:rPr>
-              <w:t xml:space="preserve">3 </w:t>
-            </w:r>
-            <w:r>
-              <w:rPr>
-                <w:rFonts w:eastAsia="TH Sarabun New" w:cs="TH Sarabun New"/>
-                <w:color w:val="1E293B"/>
-                <w:sz w:val="19"/>
-              </w:rPr>
-              <w:t>ออเดอร์</w:t>
+              <w:t>3 ออเดอร์</w:t>
             </w:r>
           </w:p>
         </w:tc>
@@ -18697,15 +17662,7 @@
                 <w:color w:val="1E293B"/>
                 <w:sz w:val="19"/>
               </w:rPr>
-              <w:t xml:space="preserve">1 </w:t>
-            </w:r>
-            <w:r>
-              <w:rPr>
-                <w:rFonts w:eastAsia="TH Sarabun New" w:cs="TH Sarabun New"/>
-                <w:color w:val="1E293B"/>
-                <w:sz w:val="19"/>
-              </w:rPr>
-              <w:t>ออเดอร์</w:t>
+              <w:t>1 ออเดอร์</w:t>
             </w:r>
           </w:p>
         </w:tc>
@@ -18798,15 +17755,7 @@
                 <w:color w:val="1E293B"/>
                 <w:sz w:val="19"/>
               </w:rPr>
-              <w:t xml:space="preserve">3 </w:t>
-            </w:r>
-            <w:r>
-              <w:rPr>
-                <w:rFonts w:eastAsia="TH Sarabun New" w:cs="TH Sarabun New"/>
-                <w:color w:val="1E293B"/>
-                <w:sz w:val="19"/>
-              </w:rPr>
-              <w:t>ออเดอร์</w:t>
+              <w:t>3 ออเดอร์</w:t>
             </w:r>
           </w:p>
         </w:tc>
@@ -18865,15 +17814,7 @@
                 <w:color w:val="1E293B"/>
                 <w:sz w:val="19"/>
               </w:rPr>
-              <w:t xml:space="preserve">3 </w:t>
-            </w:r>
-            <w:r>
-              <w:rPr>
-                <w:rFonts w:eastAsia="TH Sarabun New" w:cs="TH Sarabun New"/>
-                <w:color w:val="1E293B"/>
-                <w:sz w:val="19"/>
-              </w:rPr>
-              <w:t>ออเดอร์</w:t>
+              <w:t>3 ออเดอร์</w:t>
             </w:r>
           </w:p>
         </w:tc>
@@ -18952,23 +17893,7 @@
           <w:i/>
           <w:color w:val="1E293B"/>
         </w:rPr>
-        <w:t xml:space="preserve">• </w:t>
-      </w:r>
-      <w:r>
-        <w:rPr>
-          <w:rFonts w:eastAsia="TH Sarabun New" w:cs="TH Sarabun New"/>
-          <w:i/>
-          <w:color w:val="1E293B"/>
-        </w:rPr>
-        <w:t xml:space="preserve">ผลการวิเคราะห์: สามารถระบุกลุ่มลูกค้า VIP เพื่อจัดทำระบบสะสมแต้ม </w:t>
-      </w:r>
-      <w:r>
-        <w:rPr>
-          <w:rFonts w:eastAsia="TH Sarabun New" w:cs="TH Sarabun New"/>
-          <w:i/>
-          <w:color w:val="1E293B"/>
-        </w:rPr>
-        <w:t>หรือมอบคูปองส่วนลดพิเศษเพื่อกระตุ้นการซื้อซ้ำได้อย่างแม่นยำ</w:t>
+        <w:t>• ผลการวิเคราะห์: สามารถระบุกลุ่มลูกค้า VIP เพื่อจัดทำระบบสะสมแต้ม หรือมอบคูปองส่วนลดพิเศษเพื่อกระตุ้นการซื้อซ้ำได้อย่างแม่นยำ</w:t>
       </w:r>
     </w:p>
     <w:p>
@@ -19007,15 +17932,7 @@
           <w:color w:val="0F172A"/>
           <w:sz w:val="32"/>
         </w:rPr>
-        <w:t xml:space="preserve">5.1 </w:t>
-      </w:r>
-      <w:r>
-        <w:rPr>
-          <w:rFonts w:ascii="TH Sarabun New" w:eastAsia="TH Sarabun New" w:hAnsi="TH Sarabun New" w:cs="TH Sarabun New"/>
-          <w:color w:val="0F172A"/>
-          <w:sz w:val="32"/>
-        </w:rPr>
-        <w:t>สถาปัตยกรรมระบบและความปลอดภัยการเข้าสู่ระบบ</w:t>
+        <w:t>5.1 สถาปัตยกรรมระบบและความปลอดภัยการเข้าสู่ระบบ</w:t>
       </w:r>
     </w:p>
     <w:p>
@@ -19030,14 +17947,7 @@
           <w:rFonts w:eastAsia="TH Sarabun New" w:cs="TH Sarabun New"/>
           <w:color w:val="1E293B"/>
         </w:rPr>
-        <w:t xml:space="preserve">ระบบพัฒนาด้วย Next.js 16 (React 19) และเชื่อมต่อไปยัง Supabase PostgreSQL </w:t>
-      </w:r>
-      <w:r>
-        <w:rPr>
-          <w:rFonts w:eastAsia="TH Sarabun New" w:cs="TH Sarabun New"/>
-          <w:color w:val="1E293B"/>
-        </w:rPr>
-        <w:t>โดยมีหน้าต่างเข้าสู่ระบบและสมัครสมาชิกแบบ Email &amp; Password ที่สะอาดตา สอดคล้องกับแนวคิดการออกแบบสไตล์ Minimal Typography (ฟอนต์ Plus Jakarta Sans และ IBM Plex Sans Thai) ดังแสดงในภาพที่ 5.1</w:t>
+        <w:t>ระบบพัฒนาด้วย Next.js 16 (React 19) และเชื่อมต่อไปยัง Supabase PostgreSQL โดยมีหน้าต่างเข้าสู่ระบบและสมัครสมาชิกแบบ Email &amp; Password ที่สะอาดตา สอดคล้องกับแนวคิดการออกแบบสไตล์ Minimal Typography (ฟอนต์ Plus Jakarta Sans และ IBM Plex Sans Thai) ดังแสดงในภาพที่ 5.1</w:t>
       </w:r>
     </w:p>
     <w:p>
@@ -19054,7 +17964,7 @@
           <w:noProof/>
         </w:rPr>
         <w:drawing>
-          <wp:inline distT="0" distB="0" distL="0" distR="0" wp14:anchorId="69D6C7D8" wp14:editId="6FBDA0FA">
+          <wp:inline distT="0" distB="0" distL="0" distR="0" wp14:anchorId="222AC1B9" wp14:editId="5D56AC73">
             <wp:extent cx="4297680" cy="2171224"/>
             <wp:effectExtent l="0" t="0" r="0" b="0"/>
             <wp:docPr id="2" name="Picture 2"/>
@@ -19119,15 +18029,7 @@
           <w:color w:val="0F172A"/>
           <w:sz w:val="32"/>
         </w:rPr>
-        <w:t xml:space="preserve">5.2 </w:t>
-      </w:r>
-      <w:r>
-        <w:rPr>
-          <w:rFonts w:ascii="TH Sarabun New" w:eastAsia="TH Sarabun New" w:hAnsi="TH Sarabun New" w:cs="TH Sarabun New"/>
-          <w:color w:val="0F172A"/>
-          <w:sz w:val="32"/>
-        </w:rPr>
-        <w:t>การแก้ไขข้อมูลพื้นฐานและการยืนยันตัวตนบัญชีธนาคาร</w:t>
+        <w:t>5.2 การแก้ไขข้อมูลพื้นฐานและการยืนยันตัวตนบัญชีธนาคาร</w:t>
       </w:r>
     </w:p>
     <w:p>
@@ -19142,28 +18044,7 @@
           <w:rFonts w:eastAsia="TH Sarabun New" w:cs="TH Sarabun New"/>
           <w:color w:val="1E293B"/>
         </w:rPr>
-        <w:t>เพื่อความถูกต้องในการสั่งซื้อและป้องกันการแอบอ้างสลิปโอนเงิน ระบบจัดเตรียมปุ่มเฟืองการตั้งค่า (⚙</w:t>
-      </w:r>
-      <w:r>
-        <w:rPr>
-          <w:rFonts w:eastAsia="TH Sarabun New" w:cs="TH Sarabun New"/>
-          <w:color w:val="1E293B"/>
-        </w:rPr>
-        <w:t>️</w:t>
-      </w:r>
-      <w:r>
-        <w:rPr>
-          <w:rFonts w:eastAsia="TH Sarabun New" w:cs="TH Sarabun New"/>
-          <w:color w:val="1E293B"/>
-        </w:rPr>
-        <w:t xml:space="preserve">) </w:t>
-      </w:r>
-      <w:r>
-        <w:rPr>
-          <w:rFonts w:eastAsia="TH Sarabun New" w:cs="TH Sarabun New"/>
-          <w:color w:val="1E293B"/>
-        </w:rPr>
-        <w:t>ในหน้าเข้าสู่ระบบ เพื่อให้ลูกค้าสามารถแก้ไขชื่อ-นามสกุล เบอร์โทรศัพท์ อีเมล รวมถึงเพิ่มชื่อบัญชีธนาคารและเลขที่บัญชีธนาคารเพื่อใช้จับคู่ยืนยันตัวตนกับสลิปโอนเงินที่สั่งซื้อเข้ามาจริง ดังแสดงในภาพที่ 5.2</w:t>
+        <w:t>เพื่อความถูกต้องในการสั่งซื้อและป้องกันการแอบอ้างสลิปโอนเงิน ระบบจัดเตรียมปุ่มเฟืองการตั้งค่า (⚙️) ในหน้าเข้าสู่ระบบ เพื่อให้ลูกค้าสามารถแก้ไขชื่อ-นามสกุล เบอร์โทรศัพท์ อีเมล รวมถึงเพิ่มชื่อบัญชีธนาคารและเลขที่บัญชีธนาคารเพื่อใช้จับคู่ยืนยันตัวตนกับสลิปโอนเงินที่สั่งซื้อเข้ามาจริง ดังแสดงในภาพที่ 5.2</w:t>
       </w:r>
     </w:p>
     <w:p>
@@ -19181,7 +18062,7 @@
         </w:rPr>
         <w:lastRenderedPageBreak/>
         <w:drawing>
-          <wp:inline distT="0" distB="0" distL="0" distR="0" wp14:anchorId="58D58C28" wp14:editId="136EC5C2">
+          <wp:inline distT="0" distB="0" distL="0" distR="0" wp14:anchorId="6122943D" wp14:editId="069DC78C">
             <wp:extent cx="4297680" cy="2171224"/>
             <wp:effectExtent l="0" t="0" r="0" b="0"/>
             <wp:docPr id="3" name="Picture 3"/>
@@ -19246,15 +18127,7 @@
           <w:color w:val="0F172A"/>
           <w:sz w:val="32"/>
         </w:rPr>
-        <w:t xml:space="preserve">5.3 </w:t>
-      </w:r>
-      <w:r>
-        <w:rPr>
-          <w:rFonts w:ascii="TH Sarabun New" w:eastAsia="TH Sarabun New" w:hAnsi="TH Sarabun New" w:cs="TH Sarabun New"/>
-          <w:color w:val="0F172A"/>
-          <w:sz w:val="32"/>
-        </w:rPr>
-        <w:t>การควบคุมสิทธิ์การเข้าถึง (Role-Based Access Control: RBAC)</w:t>
+        <w:t>5.3 การควบคุมสิทธิ์การเข้าถึง (Role-Based Access Control: RBAC)</w:t>
       </w:r>
     </w:p>
     <w:p>
@@ -19286,7 +18159,7 @@
           <w:noProof/>
         </w:rPr>
         <w:drawing>
-          <wp:inline distT="0" distB="0" distL="0" distR="0" wp14:anchorId="1BA5542F" wp14:editId="309B4519">
+          <wp:inline distT="0" distB="0" distL="0" distR="0" wp14:anchorId="6DFD0219" wp14:editId="1E467AC9">
             <wp:extent cx="4389120" cy="2217420"/>
             <wp:effectExtent l="0" t="0" r="0" b="0"/>
             <wp:docPr id="4" name="Picture 4"/>
@@ -19370,7 +18243,7 @@
         </w:rPr>
         <w:lastRenderedPageBreak/>
         <w:drawing>
-          <wp:inline distT="0" distB="0" distL="0" distR="0" wp14:anchorId="4FB6A87F" wp14:editId="2D6AF6DD">
+          <wp:inline distT="0" distB="0" distL="0" distR="0" wp14:anchorId="10E134AF" wp14:editId="2AAED1E0">
             <wp:extent cx="4297680" cy="2171224"/>
             <wp:effectExtent l="0" t="0" r="0" b="0"/>
             <wp:docPr id="5" name="Picture 5"/>
@@ -19453,7 +18326,7 @@
           <w:noProof/>
         </w:rPr>
         <w:drawing>
-          <wp:inline distT="0" distB="0" distL="0" distR="0" wp14:anchorId="7B8D573F" wp14:editId="7858F95B">
+          <wp:inline distT="0" distB="0" distL="0" distR="0" wp14:anchorId="0FB64FFA" wp14:editId="6026D5E0">
             <wp:extent cx="4389120" cy="2217420"/>
             <wp:effectExtent l="0" t="0" r="0" b="0"/>
             <wp:docPr id="6" name="Picture 6"/>
@@ -19518,15 +18391,7 @@
           <w:color w:val="0F172A"/>
           <w:sz w:val="32"/>
         </w:rPr>
-        <w:t xml:space="preserve">5.4 </w:t>
-      </w:r>
-      <w:r>
-        <w:rPr>
-          <w:rFonts w:ascii="TH Sarabun New" w:eastAsia="TH Sarabun New" w:hAnsi="TH Sarabun New" w:cs="TH Sarabun New"/>
-          <w:color w:val="0F172A"/>
-          <w:sz w:val="32"/>
-        </w:rPr>
-        <w:t>การจัดการหมวดหมู่และการจัดการร้านค้าหลังบ้าน</w:t>
+        <w:t>5.4 การจัดการหมวดหมู่และการจัดการร้านค้าหลังบ้าน</w:t>
       </w:r>
     </w:p>
     <w:p>
@@ -19559,7 +18424,7 @@
         </w:rPr>
         <w:lastRenderedPageBreak/>
         <w:drawing>
-          <wp:inline distT="0" distB="0" distL="0" distR="0" wp14:anchorId="08630070" wp14:editId="59147D36">
+          <wp:inline distT="0" distB="0" distL="0" distR="0" wp14:anchorId="4CE7EB16" wp14:editId="7832765E">
             <wp:extent cx="4297680" cy="2171224"/>
             <wp:effectExtent l="0" t="0" r="0" b="0"/>
             <wp:docPr id="7" name="Picture 7"/>
@@ -19624,15 +18489,7 @@
           <w:color w:val="0F172A"/>
           <w:sz w:val="32"/>
         </w:rPr>
-        <w:t xml:space="preserve">5.5 </w:t>
-      </w:r>
-      <w:r>
-        <w:rPr>
-          <w:rFonts w:ascii="TH Sarabun New" w:eastAsia="TH Sarabun New" w:hAnsi="TH Sarabun New" w:cs="TH Sarabun New"/>
-          <w:color w:val="0F172A"/>
-          <w:sz w:val="32"/>
-        </w:rPr>
-        <w:t>หน้าจอรายงานวิเคราะห์ธุรกิจและการส่งออกไฟล์ CSV</w:t>
+        <w:t>5.5 หน้าจอรายงานวิเคราะห์ธุรกิจและการส่งออกไฟล์ CSV</w:t>
       </w:r>
     </w:p>
     <w:p>
@@ -19664,7 +18521,7 @@
           <w:noProof/>
         </w:rPr>
         <w:drawing>
-          <wp:inline distT="0" distB="0" distL="0" distR="0" wp14:anchorId="02146720" wp14:editId="63C4D651">
+          <wp:inline distT="0" distB="0" distL="0" distR="0" wp14:anchorId="42F3EA03" wp14:editId="2265444B">
             <wp:extent cx="4297680" cy="2171224"/>
             <wp:effectExtent l="0" t="0" r="0" b="0"/>
             <wp:docPr id="8" name="Picture 8"/>
@@ -19715,16 +18572,7 @@
           <w:color w:val="475569"/>
           <w:sz w:val="23"/>
         </w:rPr>
-        <w:t xml:space="preserve">ภาพที่ 5.7: </w:t>
-      </w:r>
-      <w:r>
-        <w:rPr>
-          <w:rFonts w:eastAsia="TH Sarabun New" w:cs="TH Sarabun New"/>
-          <w:b/>
-          <w:color w:val="475569"/>
-          <w:sz w:val="23"/>
-        </w:rPr>
-        <w:t>หน้าจอรายงานวิเคราะห์ธุรกิจ 4 ด้าน พร้อมปุ่ม Export CSV ที่อัปเดตข้อมูลสดตามการซื้อขายจริง</w:t>
+        <w:t>ภาพที่ 5.7: หน้าจอรายงานวิเคราะห์ธุรกิจ 4 ด้าน พร้อมปุ่ม Export CSV ที่อัปเดตข้อมูลสดตามการซื้อขายจริง</w:t>
       </w:r>
     </w:p>
     <w:p>
@@ -20641,15 +19489,7 @@
                 <w:color w:val="1E293B"/>
                 <w:sz w:val="19"/>
               </w:rPr>
-              <w:t xml:space="preserve">ไม่อนุญาตให้ดาวน์โหลด </w:t>
-            </w:r>
-            <w:r>
-              <w:rPr>
-                <w:rFonts w:eastAsia="TH Sarabun New" w:cs="TH Sarabun New"/>
-                <w:color w:val="1E293B"/>
-                <w:sz w:val="19"/>
-              </w:rPr>
-              <w:t>แสดงสถานะรอตรวจสอบ</w:t>
+              <w:t>ไม่อนุญาตให้ดาวน์โหลด แสดงสถานะรอตรวจสอบ</w:t>
             </w:r>
           </w:p>
         </w:tc>
@@ -20982,15 +19822,7 @@
                 <w:color w:val="1E293B"/>
                 <w:sz w:val="19"/>
               </w:rPr>
-              <w:t xml:space="preserve">Insert </w:t>
-            </w:r>
-            <w:r>
-              <w:rPr>
-                <w:rFonts w:eastAsia="TH Sarabun New" w:cs="TH Sarabun New"/>
-                <w:color w:val="1E293B"/>
-                <w:sz w:val="19"/>
-              </w:rPr>
-              <w:t>หนังสือด้วยราคา -150.00 บาท</w:t>
+              <w:t>Insert หนังสือด้วยราคา -150.00 บาท</w:t>
             </w:r>
           </w:p>
         </w:tc>
@@ -21019,15 +19851,7 @@
                 <w:color w:val="1E293B"/>
                 <w:sz w:val="19"/>
               </w:rPr>
-              <w:t xml:space="preserve">Database </w:t>
-            </w:r>
-            <w:r>
-              <w:rPr>
-                <w:rFonts w:eastAsia="TH Sarabun New" w:cs="TH Sarabun New"/>
-                <w:color w:val="1E293B"/>
-                <w:sz w:val="19"/>
-              </w:rPr>
-              <w:t>ปฏิเสธคำสั่ง CHECK constraint violation</w:t>
+              <w:t>Database ปฏิเสธคำสั่ง CHECK constraint violation</w:t>
             </w:r>
           </w:p>
         </w:tc>
@@ -21056,15 +19880,7 @@
                 <w:color w:val="1E293B"/>
                 <w:sz w:val="19"/>
               </w:rPr>
-              <w:t xml:space="preserve">PostgreSQL </w:t>
-            </w:r>
-            <w:r>
-              <w:rPr>
-                <w:rFonts w:eastAsia="TH Sarabun New" w:cs="TH Sarabun New"/>
-                <w:color w:val="1E293B"/>
-                <w:sz w:val="19"/>
-              </w:rPr>
-              <w:t>ปฏิเสธการ Insert ข้อมูลผิดรูปแบบ</w:t>
+              <w:t>PostgreSQL ปฏิเสธการ Insert ข้อมูลผิดรูปแบบ</w:t>
             </w:r>
           </w:p>
         </w:tc>
@@ -21187,15 +20003,7 @@
                 <w:color w:val="1E293B"/>
                 <w:sz w:val="19"/>
               </w:rPr>
-              <w:t xml:space="preserve">ลูกค้าพิมพ์ URL </w:t>
-            </w:r>
-            <w:r>
-              <w:rPr>
-                <w:rFonts w:eastAsia="TH Sarabun New" w:cs="TH Sarabun New"/>
-                <w:color w:val="1E293B"/>
-                <w:sz w:val="19"/>
-              </w:rPr>
-              <w:t>http://localhost:3000/admin</w:t>
+              <w:t>ลูกค้าพิมพ์ URL http://localhost:3000/admin</w:t>
             </w:r>
           </w:p>
         </w:tc>
@@ -21434,15 +20242,7 @@
                 <w:color w:val="1E293B"/>
                 <w:sz w:val="19"/>
               </w:rPr>
-              <w:t xml:space="preserve">ได้ไฟล์ CSV พร้อม UTF-8 BOM </w:t>
-            </w:r>
-            <w:r>
-              <w:rPr>
-                <w:rFonts w:eastAsia="TH Sarabun New" w:cs="TH Sarabun New"/>
-                <w:color w:val="1E293B"/>
-                <w:sz w:val="19"/>
-              </w:rPr>
-              <w:t>อ่านไทยได้ 100%</w:t>
+              <w:t>ได้ไฟล์ CSV พร้อม UTF-8 BOM อ่านไทยได้ 100%</w:t>
             </w:r>
           </w:p>
         </w:tc>
@@ -21514,14 +20314,7 @@
           <w:rFonts w:eastAsia="TH Sarabun New" w:cs="TH Sarabun New"/>
           <w:color w:val="1E293B"/>
         </w:rPr>
-        <w:t xml:space="preserve">ตามข้อกำหนดใบงานข้อ 12 นักศึกษาได้บันทึกการประยุกต์ใช้ AI </w:t>
-      </w:r>
-      <w:r>
-        <w:rPr>
-          <w:rFonts w:eastAsia="TH Sarabun New" w:cs="TH Sarabun New"/>
-          <w:color w:val="1E293B"/>
-        </w:rPr>
-        <w:t>เพื่อเป็นหลักฐานความโปร่งใสและแสดงการตรวจทานด้วยตนเองดังนี้:</w:t>
+        <w:t>ตามข้อกำหนดใบงานข้อ 12 นักศึกษาได้บันทึกการประยุกต์ใช้ AI เพื่อเป็นหลักฐานความโปร่งใสและแสดงการตรวจทานด้วยตนเองดังนี้:</w:t>
       </w:r>
     </w:p>
     <w:tbl>
@@ -21736,15 +20529,7 @@
                 <w:color w:val="1E293B"/>
                 <w:sz w:val="20"/>
               </w:rPr>
-              <w:t xml:space="preserve">10 </w:t>
-            </w:r>
-            <w:r>
-              <w:rPr>
-                <w:rFonts w:eastAsia="TH Sarabun New" w:cs="TH Sarabun New"/>
-                <w:color w:val="1E293B"/>
-                <w:sz w:val="20"/>
-              </w:rPr>
-              <w:t>ก.ย. 69</w:t>
+              <w:t>10 ก.ย. 69</w:t>
             </w:r>
           </w:p>
         </w:tc>
@@ -21802,15 +20587,7 @@
                 <w:color w:val="1E293B"/>
                 <w:sz w:val="20"/>
               </w:rPr>
-              <w:t xml:space="preserve">ช่วยออกแบบ ERD และโครงสร้าง 9 ตารางสำหรับร้านขาย E-Book </w:t>
-            </w:r>
-            <w:r>
-              <w:rPr>
-                <w:rFonts w:eastAsia="TH Sarabun New" w:cs="TH Sarabun New"/>
-                <w:color w:val="1E293B"/>
-                <w:sz w:val="20"/>
-              </w:rPr>
-              <w:t>ให้ตรงหลัก 3NF และมี Foreign Key ครบถ้วน</w:t>
+              <w:t>ช่วยออกแบบ ERD และโครงสร้าง 9 ตารางสำหรับร้านขาย E-Book ให้ตรงหลัก 3NF และมี Foreign Key ครบถ้วน</w:t>
             </w:r>
           </w:p>
         </w:tc>
@@ -21904,15 +20681,7 @@
                 <w:color w:val="1E293B"/>
                 <w:sz w:val="20"/>
               </w:rPr>
-              <w:t xml:space="preserve">12 </w:t>
-            </w:r>
-            <w:r>
-              <w:rPr>
-                <w:rFonts w:eastAsia="TH Sarabun New" w:cs="TH Sarabun New"/>
-                <w:color w:val="1E293B"/>
-                <w:sz w:val="20"/>
-              </w:rPr>
-              <w:t>ก.ย. 69</w:t>
+              <w:t>12 ก.ย. 69</w:t>
             </w:r>
           </w:p>
         </w:tc>
@@ -21970,15 +20739,7 @@
                 <w:color w:val="1E293B"/>
                 <w:sz w:val="20"/>
               </w:rPr>
-              <w:t xml:space="preserve">ช่วยเขียน SQL Query รายงาน 4 </w:t>
-            </w:r>
-            <w:r>
-              <w:rPr>
-                <w:rFonts w:eastAsia="TH Sarabun New" w:cs="TH Sarabun New"/>
-                <w:color w:val="1E293B"/>
-                <w:sz w:val="20"/>
-              </w:rPr>
-              <w:t>ด้านตามเกณฑ์อาจารย์ประภาส ที่ใช้ JOIN, GROUP BY, HAVING, CASE WHEN, SUM, COUNT, AVG, LIMIT</w:t>
+              <w:t>ช่วยเขียน SQL Query รายงาน 4 ด้านตามเกณฑ์อาจารย์ประภาส ที่ใช้ JOIN, GROUP BY, HAVING, CASE WHEN, SUM, COUNT, AVG, LIMIT</w:t>
             </w:r>
           </w:p>
         </w:tc>
@@ -22072,15 +20833,7 @@
                 <w:color w:val="1E293B"/>
                 <w:sz w:val="20"/>
               </w:rPr>
-              <w:t xml:space="preserve">14 </w:t>
-            </w:r>
-            <w:r>
-              <w:rPr>
-                <w:rFonts w:eastAsia="TH Sarabun New" w:cs="TH Sarabun New"/>
-                <w:color w:val="1E293B"/>
-                <w:sz w:val="20"/>
-              </w:rPr>
-              <w:t>ก.ย. 69</w:t>
+              <w:t>14 ก.ย. 69</w:t>
             </w:r>
           </w:p>
         </w:tc>
@@ -22109,15 +20862,7 @@
                 <w:color w:val="1E293B"/>
                 <w:sz w:val="20"/>
               </w:rPr>
-              <w:t xml:space="preserve">Claude / </w:t>
-            </w:r>
-            <w:r>
-              <w:rPr>
-                <w:rFonts w:eastAsia="TH Sarabun New" w:cs="TH Sarabun New"/>
-                <w:color w:val="1E293B"/>
-                <w:sz w:val="20"/>
-              </w:rPr>
-              <w:t>Antigravity</w:t>
+              <w:t>Claude / Antigravity</w:t>
             </w:r>
           </w:p>
         </w:tc>
@@ -22221,15 +20966,7 @@
           <w:color w:val="0F172A"/>
           <w:sz w:val="32"/>
         </w:rPr>
-        <w:t xml:space="preserve">7.2 </w:t>
-      </w:r>
-      <w:r>
-        <w:rPr>
-          <w:rFonts w:ascii="TH Sarabun New" w:eastAsia="TH Sarabun New" w:hAnsi="TH Sarabun New" w:cs="TH Sarabun New"/>
-          <w:color w:val="0F172A"/>
-          <w:sz w:val="32"/>
-        </w:rPr>
-        <w:t>ข้อเสนอแนะของ AI ที่นักศึกษาตัดสินใจปฏิเสธ (Rejected AI Proposals)</w:t>
+        <w:t>7.2 ข้อเสนอแนะของ AI ที่นักศึกษาตัดสินใจปฏิเสธ (Rejected AI Proposals)</w:t>
       </w:r>
     </w:p>
     <w:p>
@@ -22244,21 +20981,7 @@
           <w:rFonts w:eastAsia="TH Sarabun New" w:cs="TH Sarabun New"/>
           <w:color w:val="1E293B"/>
         </w:rPr>
-        <w:t xml:space="preserve">1. </w:t>
-      </w:r>
-      <w:r>
-        <w:rPr>
-          <w:rFonts w:eastAsia="TH Sarabun New" w:cs="TH Sarabun New"/>
-          <w:color w:val="1E293B"/>
-        </w:rPr>
-        <w:t xml:space="preserve">การเก็บข้อมูลสลิปเป็น Base64 String ในตาราง payments: AI เสนอให้แปลงไฟล์สลิปเป็น Base64 แล้วเซฟลงฐานข้อมูลตรงๆ </w:t>
-      </w:r>
-      <w:r>
-        <w:rPr>
-          <w:rFonts w:eastAsia="TH Sarabun New" w:cs="TH Sarabun New"/>
-          <w:color w:val="1E293B"/>
-        </w:rPr>
-        <w:t>แต่นักศึกษาปฏิเสธเนื่องจากจะทำให้ฐานข้อมูลบวม (Database Bloat) และส่งผลเสียต่อ Performance อย่างรุนแรง โดยเลือกเก็บเป็น URL ชี้ไปยัง Cloud Storage แทน</w:t>
+        <w:t>1. การเก็บข้อมูลสลิปเป็น Base64 String ในตาราง payments: AI เสนอให้แปลงไฟล์สลิปเป็น Base64 แล้วเซฟลงฐานข้อมูลตรงๆ แต่นักศึกษาปฏิเสธเนื่องจากจะทำให้ฐานข้อมูลบวม (Database Bloat) และส่งผลเสียต่อ Performance อย่างรุนแรง โดยเลือกเก็บเป็น URL ชี้ไปยัง Cloud Storage แทน</w:t>
       </w:r>
     </w:p>
     <w:p>
@@ -22273,14 +20996,7 @@
           <w:rFonts w:eastAsia="TH Sarabun New" w:cs="TH Sarabun New"/>
           <w:color w:val="1E293B"/>
         </w:rPr>
-        <w:t xml:space="preserve">2. </w:t>
-      </w:r>
-      <w:r>
-        <w:rPr>
-          <w:rFonts w:eastAsia="TH Sarabun New" w:cs="TH Sarabun New"/>
-          <w:color w:val="1E293B"/>
-        </w:rPr>
-        <w:t>การอนุญาตให้ลูกค้าดาวน์โหลดไฟล์ E-Book ได้ทันทีหลังสั่งซื้อโดยไม่ต้องรอตรวจสลิป: นักศึกษาปฏิเสธเนื่องจากขัดต่อข้อกำหนดความปลอดภัยข้อ 2.2 ของอาจารย์ประภาส และเสี่ยงต่อการถูกมิจฉาชีพหลอกสั่งซื้อโดยไม่โอนเงินจริง</w:t>
+        <w:t>2. การอนุญาตให้ลูกค้าดาวน์โหลดไฟล์ E-Book ได้ทันทีหลังสั่งซื้อโดยไม่ต้องรอตรวจสลิป: นักศึกษาปฏิเสธเนื่องจากขัดต่อข้อกำหนดความปลอดภัยข้อ 2.2 ของอาจารย์ประภาส และเสี่ยงต่อการถูกมิจฉาชีพหลอกสั่งซื้อโดยไม่โอนเงินจริง</w:t>
       </w:r>
     </w:p>
     <w:p>
@@ -22295,14 +21011,7 @@
           <w:rFonts w:eastAsia="TH Sarabun New" w:cs="TH Sarabun New"/>
           <w:color w:val="1E293B"/>
         </w:rPr>
-        <w:t xml:space="preserve">3. </w:t>
-      </w:r>
-      <w:r>
-        <w:rPr>
-          <w:rFonts w:eastAsia="TH Sarabun New" w:cs="TH Sarabun New"/>
-          <w:color w:val="1E293B"/>
-        </w:rPr>
-        <w:t>การใช้รหัสผ่าน Plain Text ในตารางทดสอบ: นักศึกษาปฏิเสธและปรับปรุง Schema ให้เก็บเป็น password_hash เสมอ เพื่อให้เป็นไปตามมาตรฐานความปลอดภัยสารสนเทศสากล</w:t>
+        <w:t>3. การใช้รหัสผ่าน Plain Text ในตารางทดสอบ: นักศึกษาปฏิเสธและปรับปรุง Schema ให้เก็บเป็น password_hash เสมอ เพื่อให้เป็นไปตามมาตรฐานความปลอดภัยสารสนเทศสากล</w:t>
       </w:r>
     </w:p>
     <w:p>
@@ -22316,15 +21025,7 @@
           <w:color w:val="0F172A"/>
           <w:sz w:val="32"/>
         </w:rPr>
-        <w:t xml:space="preserve">7.3 </w:t>
-      </w:r>
-      <w:r>
-        <w:rPr>
-          <w:rFonts w:ascii="TH Sarabun New" w:eastAsia="TH Sarabun New" w:hAnsi="TH Sarabun New" w:cs="TH Sarabun New"/>
-          <w:color w:val="0F172A"/>
-          <w:sz w:val="32"/>
-        </w:rPr>
-        <w:t>จริยธรรมข้อมูลส่วนบุคคล (PDPA Consideration)</w:t>
+        <w:t>7.3 จริยธรรมข้อมูลส่วนบุคคล (PDPA Consideration)</w:t>
       </w:r>
     </w:p>
     <w:p>
@@ -22378,15 +21079,7 @@
           <w:color w:val="0F172A"/>
           <w:sz w:val="32"/>
         </w:rPr>
-        <w:t xml:space="preserve">8.1 </w:t>
-      </w:r>
-      <w:r>
-        <w:rPr>
-          <w:rFonts w:ascii="TH Sarabun New" w:eastAsia="TH Sarabun New" w:hAnsi="TH Sarabun New" w:cs="TH Sarabun New"/>
-          <w:color w:val="0F172A"/>
-          <w:sz w:val="32"/>
-        </w:rPr>
-        <w:t>สรุปผลสัมฤทธิ์ของโครงงาน</w:t>
+        <w:t>8.1 สรุปผลสัมฤทธิ์ของโครงงาน</w:t>
       </w:r>
     </w:p>
     <w:p>
@@ -22415,15 +21108,7 @@
           <w:color w:val="0F172A"/>
           <w:sz w:val="32"/>
         </w:rPr>
-        <w:t xml:space="preserve">8.2 </w:t>
-      </w:r>
-      <w:r>
-        <w:rPr>
-          <w:rFonts w:ascii="TH Sarabun New" w:eastAsia="TH Sarabun New" w:hAnsi="TH Sarabun New" w:cs="TH Sarabun New"/>
-          <w:color w:val="0F172A"/>
-          <w:sz w:val="32"/>
-        </w:rPr>
-        <w:t>ข้อเสนอแนะในการพัฒนาต่อยอด</w:t>
+        <w:t>8.2 ข้อเสนอแนะในการพัฒนาต่อยอด</w:t>
       </w:r>
     </w:p>
     <w:p>
@@ -22438,14 +21123,7 @@
           <w:rFonts w:eastAsia="TH Sarabun New" w:cs="TH Sarabun New"/>
           <w:color w:val="1E293B"/>
         </w:rPr>
-        <w:t xml:space="preserve">1. </w:t>
-      </w:r>
-      <w:r>
-        <w:rPr>
-          <w:rFonts w:eastAsia="TH Sarabun New" w:cs="TH Sarabun New"/>
-          <w:color w:val="1E293B"/>
-        </w:rPr>
-        <w:t>การพัฒนาระบบตัวอย่างการอ่าน (E-Book Preview Reader): ให้ลูกค้าสามารถทดลองอ่าน 10 หน้าแรกผ่านหน้าเว็บก่อนตัดสินใจซื้อ</w:t>
+        <w:t>1. การพัฒนาระบบตัวอย่างการอ่าน (E-Book Preview Reader): ให้ลูกค้าสามารถทดลองอ่าน 10 หน้าแรกผ่านหน้าเว็บก่อนตัดสินใจซื้อ</w:t>
       </w:r>
     </w:p>
     <w:p>
@@ -22460,14 +21138,7 @@
           <w:rFonts w:eastAsia="TH Sarabun New" w:cs="TH Sarabun New"/>
           <w:color w:val="1E293B"/>
         </w:rPr>
-        <w:t xml:space="preserve">2. </w:t>
-      </w:r>
-      <w:r>
-        <w:rPr>
-          <w:rFonts w:eastAsia="TH Sarabun New" w:cs="TH Sarabun New"/>
-          <w:color w:val="1E293B"/>
-        </w:rPr>
-        <w:t>การเชื่อมต่อระบบชำระเงินอัตโนมัติ (Payment Gateway Webhook): เช่น ระบบแจ้งเตือนการโอนเงินสำเร็จแบบเรียลไทม์ผ่าน PromptPay QR API</w:t>
+        <w:t>2. การเชื่อมต่อระบบชำระเงินอัตโนมัติ (Payment Gateway Webhook): เช่น ระบบแจ้งเตือนการโอนเงินสำเร็จแบบเรียลไทม์ผ่าน PromptPay QR API</w:t>
       </w:r>
     </w:p>
     <w:p>
@@ -22482,14 +21153,7 @@
           <w:rFonts w:eastAsia="TH Sarabun New" w:cs="TH Sarabun New"/>
           <w:color w:val="1E293B"/>
         </w:rPr>
-        <w:t xml:space="preserve">3. </w:t>
-      </w:r>
-      <w:r>
-        <w:rPr>
-          <w:rFonts w:eastAsia="TH Sarabun New" w:cs="TH Sarabun New"/>
-          <w:color w:val="1E293B"/>
-        </w:rPr>
-        <w:t>การรองรับสินค้าแบบ Hybrid Catalog: เชื่อมโยงกับระบบ Inventory ของวิชาวิศวกรรมซอฟต์แวร์ เพื่อจำหน่ายทั้งหนังสือเล่มกระดาษที่มีการตัดสต็อก และหนังสือดิจิทัลที่เปิดสิทธิ์ดาวน์โหลด</w:t>
+        <w:t>3. การรองรับสินค้าแบบ Hybrid Catalog: เชื่อมโยงกับระบบ Inventory ของวิชาวิศวกรรมซอฟต์แวร์ เพื่อจำหน่ายทั้งหนังสือเล่มกระดาษที่มีการตัดสต็อก และหนังสือดิจิทัลที่เปิดสิทธิ์ดาวน์โหลด</w:t>
       </w:r>
     </w:p>
     <w:p>
@@ -22543,14 +21207,7 @@
           <w:rFonts w:eastAsia="TH Sarabun New" w:cs="TH Sarabun New"/>
           <w:color w:val="1E293B"/>
         </w:rPr>
-        <w:t xml:space="preserve">[X] </w:t>
-      </w:r>
-      <w:r>
-        <w:rPr>
-          <w:rFonts w:eastAsia="TH Sarabun New" w:cs="TH Sarabun New"/>
-          <w:color w:val="1E293B"/>
-        </w:rPr>
-        <w:t>สมาชิกในกลุ่มเข้าใจและสามารถอธิบายโครงสร้าง ERD ความสัมพันธ์ 1:N, N:M และคำสั่ง SQL ได้อย่างแม่นยำ</w:t>
+        <w:t>[X] สมาชิกในกลุ่มเข้าใจและสามารถอธิบายโครงสร้าง ERD ความสัมพันธ์ 1:N, N:M และคำสั่ง SQL ได้อย่างแม่นยำ</w:t>
       </w:r>
     </w:p>
     <w:p>
@@ -22565,14 +21222,7 @@
           <w:rFonts w:eastAsia="TH Sarabun New" w:cs="TH Sarabun New"/>
           <w:color w:val="1E293B"/>
         </w:rPr>
-        <w:t xml:space="preserve">[X] </w:t>
-      </w:r>
-      <w:r>
-        <w:rPr>
-          <w:rFonts w:eastAsia="TH Sarabun New" w:cs="TH Sarabun New"/>
-          <w:color w:val="1E293B"/>
-        </w:rPr>
-        <w:t>คำสั่งซื้อที่ยังไม่ยืนยัน (Pending) ไม่สามารถเปิดดาวน์โหลด E-Book ได้ (ตรงตามข้อกำหนดข้อ 2.2)</w:t>
+        <w:t>[X] คำสั่งซื้อที่ยังไม่ยืนยัน (Pending) ไม่สามารถเปิดดาวน์โหลด E-Book ได้ (ตรงตามข้อกำหนดข้อ 2.2)</w:t>
       </w:r>
     </w:p>
     <w:p>
@@ -22587,14 +21237,7 @@
           <w:rFonts w:eastAsia="TH Sarabun New" w:cs="TH Sarabun New"/>
           <w:color w:val="1E293B"/>
         </w:rPr>
-        <w:t xml:space="preserve">[X] </w:t>
-      </w:r>
-      <w:r>
-        <w:rPr>
-          <w:rFonts w:eastAsia="TH Sarabun New" w:cs="TH Sarabun New"/>
-          <w:color w:val="1E293B"/>
-        </w:rPr>
-        <w:t>มีข้อมูลตัวอย่างในระบบมากกว่า 30 คำสั่งซื้อ และครอบคลุมยอดขายหลายเดือน (มิถุนายน - กันยายน 2569)</w:t>
+        <w:t>[X] มีข้อมูลตัวอย่างในระบบมากกว่า 30 คำสั่งซื้อ และครอบคลุมยอดขายหลายเดือน (มิถุนายน - กันยายน 2569)</w:t>
       </w:r>
     </w:p>
     <w:p>
@@ -22609,14 +21252,7 @@
           <w:rFonts w:eastAsia="TH Sarabun New" w:cs="TH Sarabun New"/>
           <w:color w:val="1E293B"/>
         </w:rPr>
-        <w:t xml:space="preserve">[X] </w:t>
-      </w:r>
-      <w:r>
-        <w:rPr>
-          <w:rFonts w:eastAsia="TH Sarabun New" w:cs="TH Sarabun New"/>
-          <w:color w:val="1E293B"/>
-        </w:rPr>
-        <w:t>ไฟล์ SQL ทั้งหมด (sql/schema.sql, sql/seed.sql, sql/reports.sql) รันได้สมบูรณ์บน Supabase SQL Editor</w:t>
+        <w:t>[X] ไฟล์ SQL ทั้งหมด (sql/schema.sql, sql/seed.sql, sql/reports.sql) รันได้สมบูรณ์บน Supabase SQL Editor</w:t>
       </w:r>
     </w:p>
     <w:p>
@@ -22631,14 +21267,7 @@
           <w:rFonts w:eastAsia="TH Sarabun New" w:cs="TH Sarabun New"/>
           <w:color w:val="1E293B"/>
         </w:rPr>
-        <w:t xml:space="preserve">[X] </w:t>
-      </w:r>
-      <w:r>
-        <w:rPr>
-          <w:rFonts w:eastAsia="TH Sarabun New" w:cs="TH Sarabun New"/>
-          <w:color w:val="1E293B"/>
-        </w:rPr>
-        <w:t>รายงานวิเคราะห์ 4 ด้าน รันจากข้อมูลจริงในระบบและสามารถ Export เป็นไฟล์ CSV ได้อย่างถูกต้อง</w:t>
+        <w:t>[X] รายงานวิเคราะห์ 4 ด้าน รันจากข้อมูลจริงในระบบและสามารถ Export เป็นไฟล์ CSV ได้อย่างถูกต้อง</w:t>
       </w:r>
     </w:p>
     <w:p>
@@ -22653,14 +21282,7 @@
           <w:rFonts w:eastAsia="TH Sarabun New" w:cs="TH Sarabun New"/>
           <w:color w:val="1E293B"/>
         </w:rPr>
-        <w:t xml:space="preserve">[X] </w:t>
-      </w:r>
-      <w:r>
-        <w:rPr>
-          <w:rFonts w:eastAsia="TH Sarabun New" w:cs="TH Sarabun New"/>
-          <w:color w:val="1E293B"/>
-        </w:rPr>
-        <w:t>ไม่มีการใช้ข้อมูลส่วนบุคคลจริง รหัสผ่านจริง หรือไฟล์ที่มีลิขสิทธิ์</w:t>
+        <w:t>[X] ไม่มีการใช้ข้อมูลส่วนบุคคลจริง รหัสผ่านจริง หรือไฟล์ที่มีลิขสิทธิ์</w:t>
       </w:r>
     </w:p>
     <w:p>
@@ -22675,14 +21297,7 @@
           <w:rFonts w:eastAsia="TH Sarabun New" w:cs="TH Sarabun New"/>
           <w:color w:val="1E293B"/>
         </w:rPr>
-        <w:t xml:space="preserve">[X] </w:t>
-      </w:r>
-      <w:r>
-        <w:rPr>
-          <w:rFonts w:eastAsia="TH Sarabun New" w:cs="TH Sarabun New"/>
-          <w:color w:val="1E293B"/>
-        </w:rPr>
-        <w:t>มีบัญชีทดสอบด่วนบนหน้าจอเพื่อให้ผู้สอนคลิกสลับสิทธิ์ Admin / Customer เพื่อตรวจข้อสอบได้สะดวก</w:t>
+        <w:t>[X] มีบัญชีทดสอบด่วนบนหน้าจอเพื่อให้ผู้สอนคลิกสลับสิทธิ์ Admin / Customer เพื่อตรวจข้อสอบได้สะดวก</w:t>
       </w:r>
     </w:p>
     <w:p>
@@ -22804,15 +21419,7 @@
         <w:color w:val="64748B"/>
         <w:sz w:val="22"/>
       </w:rPr>
-      <w:t xml:space="preserve"> </w:t>
-    </w:r>
-    <w:r>
-      <w:rPr>
-        <w:rFonts w:eastAsia="TH Sarabun New" w:cs="TH Sarabun New"/>
-        <w:color w:val="64748B"/>
-        <w:sz w:val="22"/>
-      </w:rPr>
-      <w:t xml:space="preserve">จาก </w:t>
+      <w:t xml:space="preserve"> จาก </w:t>
     </w:r>
     <w:r>
       <w:fldChar w:fldCharType="begin"/>
@@ -22888,16 +21495,7 @@
         <w:color w:val="94A3B8"/>
         <w:sz w:val="20"/>
       </w:rPr>
-      <w:t xml:space="preserve">โครงงานระบบฐานข้อมูลร้านขายหนังสือและอีบุ๊กออนไลน์ (Lampara Books) | </w:t>
-    </w:r>
-    <w:r>
-      <w:rPr>
-        <w:rFonts w:eastAsia="TH Sarabun New" w:cs="TH Sarabun New"/>
-        <w:i/>
-        <w:color w:val="94A3B8"/>
-        <w:sz w:val="20"/>
-      </w:rPr>
-      <w:t>มหาวิทยาลัยเทคโนโลยีราชมงคลอีสาน วิทยาเขตขอนแก่น</w:t>
+      <w:t>โครงงานระบบฐานข้อมูลร้านขายหนังสือและอีบุ๊กออนไลน์ (Lampara Books) | มหาวิทยาลัยเทคโนโลยีราชมงคลอีสาน วิทยาเขตขอนแก่น</w:t>
     </w:r>
   </w:p>
 </w:hdr>
@@ -23076,31 +21674,31 @@
       </w:rPr>
     </w:lvl>
   </w:abstractNum>
-  <w:num w:numId="1" w16cid:durableId="1777283424">
+  <w:num w:numId="1" w16cid:durableId="72901263">
     <w:abstractNumId w:val="8"/>
   </w:num>
-  <w:num w:numId="2" w16cid:durableId="921376069">
+  <w:num w:numId="2" w16cid:durableId="860170566">
     <w:abstractNumId w:val="6"/>
   </w:num>
-  <w:num w:numId="3" w16cid:durableId="1639608254">
+  <w:num w:numId="3" w16cid:durableId="441530504">
     <w:abstractNumId w:val="5"/>
   </w:num>
-  <w:num w:numId="4" w16cid:durableId="2060738636">
+  <w:num w:numId="4" w16cid:durableId="1986087370">
     <w:abstractNumId w:val="4"/>
   </w:num>
-  <w:num w:numId="5" w16cid:durableId="1889682285">
+  <w:num w:numId="5" w16cid:durableId="1536114942">
     <w:abstractNumId w:val="7"/>
   </w:num>
-  <w:num w:numId="6" w16cid:durableId="1920212378">
+  <w:num w:numId="6" w16cid:durableId="1730038144">
     <w:abstractNumId w:val="3"/>
   </w:num>
-  <w:num w:numId="7" w16cid:durableId="111023346">
+  <w:num w:numId="7" w16cid:durableId="1251545768">
     <w:abstractNumId w:val="2"/>
   </w:num>
-  <w:num w:numId="8" w16cid:durableId="975179084">
+  <w:num w:numId="8" w16cid:durableId="666520261">
     <w:abstractNumId w:val="1"/>
   </w:num>
-  <w:num w:numId="9" w16cid:durableId="1607035646">
+  <w:num w:numId="9" w16cid:durableId="1191140955">
     <w:abstractNumId w:val="0"/>
   </w:num>
 </w:numbering>

</xml_diff>

<commit_message>
docs & reports: sync Chapter 5 and evaluation UI screenshots with live Vercel app
</commit_message>
<xml_diff>
--- a/รายงาน_Mini_Project_Database_ร้านขาย_E-Book_2026.docx
+++ b/รายงาน_Mini_Project_Database_ร้านขาย_E-Book_2026.docx
@@ -9,8 +9,8 @@
       </w:pPr>
       <w:r>
         <w:drawing>
-          <wp:inline distT="0" distB="0" distL="0" distR="0" wp14:anchorId="74EFD429" wp14:editId="2FAB2C3F">
-            <wp:extent cx="1325880" cy="2277199"/>
+          <wp:inline distT="0" distB="0" distL="0" distR="0" wp14:anchorId="05E17C93" wp14:editId="3674C694">
+            <wp:extent cx="1325880" cy="515112"/>
             <wp:effectExtent l="0" t="0" r="0" b="0"/>
             <wp:docPr id="1" name="Picture 1"/>
             <wp:cNvGraphicFramePr>
@@ -32,7 +32,7 @@
                   <pic:spPr>
                     <a:xfrm>
                       <a:off x="0" y="0"/>
-                      <a:ext cx="1325880" cy="2277199"/>
+                      <a:ext cx="1325880" cy="515112"/>
                     </a:xfrm>
                     <a:prstGeom prst="rect">
                       <a:avLst/>
@@ -2068,6 +2068,12 @@
     </w:p>
     <w:p>
       <w:pPr>
+        <w:spacing w:after="60" w:line="240" w:lineRule="auto"/>
+        <w:ind w:left="504" w:hanging="504"/>
+      </w:pPr>
+    </w:p>
+    <w:p>
+      <w:pPr>
         <w:keepNext/>
         <w:spacing w:before="200" w:after="80" w:line="240" w:lineRule="auto"/>
         <w:rPr>
@@ -2081,17 +2087,6 @@
       <w:pPr>
         <w:keepNext/>
         <w:spacing w:before="200" w:after="80" w:line="240" w:lineRule="auto"/>
-        <w:rPr>
-          <w:rFonts w:ascii="TH SarabunPSK" w:eastAsia="TH SarabunPSK" w:hAnsi="TH SarabunPSK" w:cs="TH SarabunPSK"/>
-          <w:b/>
-          <w:sz w:val="36"/>
-        </w:rPr>
-      </w:pPr>
-    </w:p>
-    <w:p>
-      <w:pPr>
-        <w:keepNext/>
-        <w:spacing w:before="200" w:after="80" w:line="240" w:lineRule="auto"/>
       </w:pPr>
       <w:r>
         <w:rPr>
@@ -2283,6 +2278,18 @@
         </w:rPr>
         <w:t>• รายงานวิเคราะห์: แสดงผลข้อมูลสด 4 ด้าน และส่งออกเป็นไฟล์ CSV มาตรฐาน UTF-8 BOM</w:t>
       </w:r>
+    </w:p>
+    <w:p>
+      <w:pPr>
+        <w:spacing w:after="40" w:line="240" w:lineRule="auto"/>
+        <w:ind w:left="504" w:hanging="504"/>
+      </w:pPr>
+    </w:p>
+    <w:p>
+      <w:pPr>
+        <w:spacing w:after="40" w:line="240" w:lineRule="auto"/>
+        <w:ind w:left="504" w:hanging="504"/>
+      </w:pPr>
     </w:p>
     <w:p>
       <w:pPr>
@@ -3046,8 +3053,8 @@
       <w:r>
         <w:lastRenderedPageBreak/>
         <w:drawing>
-          <wp:inline distT="0" distB="0" distL="0" distR="0" wp14:anchorId="54CD3065" wp14:editId="5EC685C8">
-            <wp:extent cx="5303520" cy="4080232"/>
+          <wp:inline distT="0" distB="0" distL="0" distR="0" wp14:anchorId="38F2F7EE" wp14:editId="5C1E28F8">
+            <wp:extent cx="5303520" cy="515112"/>
             <wp:effectExtent l="0" t="0" r="0" b="0"/>
             <wp:docPr id="2" name="Picture 2"/>
             <wp:cNvGraphicFramePr>
@@ -3069,7 +3076,7 @@
                   <pic:spPr>
                     <a:xfrm>
                       <a:off x="0" y="0"/>
-                      <a:ext cx="5303520" cy="4080232"/>
+                      <a:ext cx="5303520" cy="515112"/>
                     </a:xfrm>
                     <a:prstGeom prst="rect">
                       <a:avLst/>
@@ -12806,12 +12813,10 @@
             <w:pPr>
               <w:jc w:val="center"/>
             </w:pPr>
-            <w:r/>
-            <w:r>
-              <w:rPr>
-                <w:rFonts w:ascii="TH SarabunPSK" w:hAnsi="TH SarabunPSK" w:cs="TH SarabunPSK" w:eastAsia="TH SarabunPSK"/>
+            <w:r>
+              <w:rPr>
+                <w:rFonts w:ascii="TH SarabunPSK" w:eastAsia="TH SarabunPSK" w:hAnsi="TH SarabunPSK" w:cs="TH SarabunPSK"/>
                 <w:b/>
-                <w:i w:val="0"/>
                 <w:sz w:val="30"/>
               </w:rPr>
               <w:t>2026-09 (ล่าสุด)</w:t>
@@ -12834,12 +12839,9 @@
             <w:pPr>
               <w:jc w:val="center"/>
             </w:pPr>
-            <w:r/>
-            <w:r>
-              <w:rPr>
-                <w:rFonts w:ascii="TH SarabunPSK" w:hAnsi="TH SarabunPSK" w:cs="TH SarabunPSK" w:eastAsia="TH SarabunPSK"/>
-                <w:b w:val="0"/>
-                <w:i w:val="0"/>
+            <w:r>
+              <w:rPr>
+                <w:rFonts w:ascii="TH SarabunPSK" w:eastAsia="TH SarabunPSK" w:hAnsi="TH SarabunPSK" w:cs="TH SarabunPSK"/>
                 <w:sz w:val="30"/>
               </w:rPr>
               <w:t>8 ออเดอร์</w:t>
@@ -12862,12 +12864,9 @@
             <w:pPr>
               <w:jc w:val="center"/>
             </w:pPr>
-            <w:r/>
-            <w:r>
-              <w:rPr>
-                <w:rFonts w:ascii="TH SarabunPSK" w:hAnsi="TH SarabunPSK" w:cs="TH SarabunPSK" w:eastAsia="TH SarabunPSK"/>
-                <w:b w:val="0"/>
-                <w:i w:val="0"/>
+            <w:r>
+              <w:rPr>
+                <w:rFonts w:ascii="TH SarabunPSK" w:eastAsia="TH SarabunPSK" w:hAnsi="TH SarabunPSK" w:cs="TH SarabunPSK"/>
                 <w:sz w:val="30"/>
               </w:rPr>
               <w:t>฿2,791.00</w:t>
@@ -12890,12 +12889,9 @@
             <w:pPr>
               <w:jc w:val="center"/>
             </w:pPr>
-            <w:r/>
-            <w:r>
-              <w:rPr>
-                <w:rFonts w:ascii="TH SarabunPSK" w:hAnsi="TH SarabunPSK" w:cs="TH SarabunPSK" w:eastAsia="TH SarabunPSK"/>
-                <w:b w:val="0"/>
-                <w:i w:val="0"/>
+            <w:r>
+              <w:rPr>
+                <w:rFonts w:ascii="TH SarabunPSK" w:eastAsia="TH SarabunPSK" w:hAnsi="TH SarabunPSK" w:cs="TH SarabunPSK"/>
                 <w:sz w:val="30"/>
               </w:rPr>
               <w:t>฿348.88</w:t>
@@ -13733,12 +13729,10 @@
             <w:pPr>
               <w:jc w:val="center"/>
             </w:pPr>
-            <w:r/>
-            <w:r>
-              <w:rPr>
-                <w:rFonts w:ascii="TH SarabunPSK" w:hAnsi="TH SarabunPSK" w:cs="TH SarabunPSK" w:eastAsia="TH SarabunPSK"/>
+            <w:r>
+              <w:rPr>
+                <w:rFonts w:ascii="TH SarabunPSK" w:eastAsia="TH SarabunPSK" w:hAnsi="TH SarabunPSK" w:cs="TH SarabunPSK"/>
                 <w:b/>
-                <w:i w:val="0"/>
                 <w:sz w:val="30"/>
               </w:rPr>
               <w:t>#1</w:t>
@@ -13758,15 +13752,9 @@
             <w:vAlign w:val="center"/>
           </w:tcPr>
           <w:p>
-            <w:pPr>
-              <w:jc w:val="left"/>
-            </w:pPr>
-            <w:r/>
-            <w:r>
-              <w:rPr>
-                <w:rFonts w:ascii="TH SarabunPSK" w:hAnsi="TH SarabunPSK" w:cs="TH SarabunPSK" w:eastAsia="TH SarabunPSK"/>
-                <w:b w:val="0"/>
-                <w:i w:val="0"/>
+            <w:r>
+              <w:rPr>
+                <w:rFonts w:ascii="TH SarabunPSK" w:eastAsia="TH SarabunPSK" w:hAnsi="TH SarabunPSK" w:cs="TH SarabunPSK"/>
                 <w:sz w:val="30"/>
               </w:rPr>
               <w:t>แสงจันทร์บนป่าไผ่</w:t>
@@ -13786,15 +13774,9 @@
             <w:vAlign w:val="center"/>
           </w:tcPr>
           <w:p>
-            <w:pPr>
-              <w:jc w:val="left"/>
-            </w:pPr>
-            <w:r/>
-            <w:r>
-              <w:rPr>
-                <w:rFonts w:ascii="TH SarabunPSK" w:hAnsi="TH SarabunPSK" w:cs="TH SarabunPSK" w:eastAsia="TH SarabunPSK"/>
-                <w:b w:val="0"/>
-                <w:i w:val="0"/>
+            <w:r>
+              <w:rPr>
+                <w:rFonts w:ascii="TH SarabunPSK" w:eastAsia="TH SarabunPSK" w:hAnsi="TH SarabunPSK" w:cs="TH SarabunPSK"/>
                 <w:sz w:val="30"/>
               </w:rPr>
               <w:t>ภรณ์ ภรณ์ภาพ</w:t>
@@ -13817,12 +13799,9 @@
             <w:pPr>
               <w:jc w:val="center"/>
             </w:pPr>
-            <w:r/>
-            <w:r>
-              <w:rPr>
-                <w:rFonts w:ascii="TH SarabunPSK" w:hAnsi="TH SarabunPSK" w:cs="TH SarabunPSK" w:eastAsia="TH SarabunPSK"/>
-                <w:b w:val="0"/>
-                <w:i w:val="0"/>
+            <w:r>
+              <w:rPr>
+                <w:rFonts w:ascii="TH SarabunPSK" w:eastAsia="TH SarabunPSK" w:hAnsi="TH SarabunPSK" w:cs="TH SarabunPSK"/>
                 <w:sz w:val="30"/>
               </w:rPr>
               <w:t>วรรณกรรม</w:t>
@@ -13845,12 +13824,9 @@
             <w:pPr>
               <w:jc w:val="center"/>
             </w:pPr>
-            <w:r/>
-            <w:r>
-              <w:rPr>
-                <w:rFonts w:ascii="TH SarabunPSK" w:hAnsi="TH SarabunPSK" w:cs="TH SarabunPSK" w:eastAsia="TH SarabunPSK"/>
-                <w:b w:val="0"/>
-                <w:i w:val="0"/>
+            <w:r>
+              <w:rPr>
+                <w:rFonts w:ascii="TH SarabunPSK" w:eastAsia="TH SarabunPSK" w:hAnsi="TH SarabunPSK" w:cs="TH SarabunPSK"/>
                 <w:sz w:val="30"/>
               </w:rPr>
               <w:t>11 เล่ม</w:t>
@@ -13873,12 +13849,9 @@
             <w:pPr>
               <w:jc w:val="center"/>
             </w:pPr>
-            <w:r/>
-            <w:r>
-              <w:rPr>
-                <w:rFonts w:ascii="TH SarabunPSK" w:hAnsi="TH SarabunPSK" w:cs="TH SarabunPSK" w:eastAsia="TH SarabunPSK"/>
-                <w:b w:val="0"/>
-                <w:i w:val="0"/>
+            <w:r>
+              <w:rPr>
+                <w:rFonts w:ascii="TH SarabunPSK" w:eastAsia="TH SarabunPSK" w:hAnsi="TH SarabunPSK" w:cs="TH SarabunPSK"/>
                 <w:sz w:val="30"/>
               </w:rPr>
               <w:t>฿2,849.00</w:t>
@@ -13907,12 +13880,10 @@
             <w:pPr>
               <w:jc w:val="center"/>
             </w:pPr>
-            <w:r/>
-            <w:r>
-              <w:rPr>
-                <w:rFonts w:ascii="TH SarabunPSK" w:hAnsi="TH SarabunPSK" w:cs="TH SarabunPSK" w:eastAsia="TH SarabunPSK"/>
+            <w:r>
+              <w:rPr>
+                <w:rFonts w:ascii="TH SarabunPSK" w:eastAsia="TH SarabunPSK" w:hAnsi="TH SarabunPSK" w:cs="TH SarabunPSK"/>
                 <w:b/>
-                <w:i w:val="0"/>
                 <w:sz w:val="30"/>
               </w:rPr>
               <w:t>#2</w:t>
@@ -13932,15 +13903,9 @@
             <w:vAlign w:val="center"/>
           </w:tcPr>
           <w:p>
-            <w:pPr>
-              <w:jc w:val="left"/>
-            </w:pPr>
-            <w:r/>
-            <w:r>
-              <w:rPr>
-                <w:rFonts w:ascii="TH SarabunPSK" w:hAnsi="TH SarabunPSK" w:cs="TH SarabunPSK" w:eastAsia="TH SarabunPSK"/>
-                <w:b w:val="0"/>
-                <w:i w:val="0"/>
+            <w:r>
+              <w:rPr>
+                <w:rFonts w:ascii="TH SarabunPSK" w:eastAsia="TH SarabunPSK" w:hAnsi="TH SarabunPSK" w:cs="TH SarabunPSK"/>
                 <w:sz w:val="30"/>
               </w:rPr>
               <w:t>The Quiet Algorithm</w:t>
@@ -13960,15 +13925,9 @@
             <w:vAlign w:val="center"/>
           </w:tcPr>
           <w:p>
-            <w:pPr>
-              <w:jc w:val="left"/>
-            </w:pPr>
-            <w:r/>
-            <w:r>
-              <w:rPr>
-                <w:rFonts w:ascii="TH SarabunPSK" w:hAnsi="TH SarabunPSK" w:cs="TH SarabunPSK" w:eastAsia="TH SarabunPSK"/>
-                <w:b w:val="0"/>
-                <w:i w:val="0"/>
+            <w:r>
+              <w:rPr>
+                <w:rFonts w:ascii="TH SarabunPSK" w:eastAsia="TH SarabunPSK" w:hAnsi="TH SarabunPSK" w:cs="TH SarabunPSK"/>
                 <w:sz w:val="30"/>
               </w:rPr>
               <w:t>Daniel Reyes</w:t>
@@ -13991,12 +13950,9 @@
             <w:pPr>
               <w:jc w:val="center"/>
             </w:pPr>
-            <w:r/>
-            <w:r>
-              <w:rPr>
-                <w:rFonts w:ascii="TH SarabunPSK" w:hAnsi="TH SarabunPSK" w:cs="TH SarabunPSK" w:eastAsia="TH SarabunPSK"/>
-                <w:b w:val="0"/>
-                <w:i w:val="0"/>
+            <w:r>
+              <w:rPr>
+                <w:rFonts w:ascii="TH SarabunPSK" w:eastAsia="TH SarabunPSK" w:hAnsi="TH SarabunPSK" w:cs="TH SarabunPSK"/>
                 <w:sz w:val="30"/>
               </w:rPr>
               <w:t>เทคโนโลยี</w:t>
@@ -14019,12 +13975,9 @@
             <w:pPr>
               <w:jc w:val="center"/>
             </w:pPr>
-            <w:r/>
-            <w:r>
-              <w:rPr>
-                <w:rFonts w:ascii="TH SarabunPSK" w:hAnsi="TH SarabunPSK" w:cs="TH SarabunPSK" w:eastAsia="TH SarabunPSK"/>
-                <w:b w:val="0"/>
-                <w:i w:val="0"/>
+            <w:r>
+              <w:rPr>
+                <w:rFonts w:ascii="TH SarabunPSK" w:eastAsia="TH SarabunPSK" w:hAnsi="TH SarabunPSK" w:cs="TH SarabunPSK"/>
                 <w:sz w:val="30"/>
               </w:rPr>
               <w:t>8 เล่ม</w:t>
@@ -14047,12 +14000,9 @@
             <w:pPr>
               <w:jc w:val="center"/>
             </w:pPr>
-            <w:r/>
-            <w:r>
-              <w:rPr>
-                <w:rFonts w:ascii="TH SarabunPSK" w:hAnsi="TH SarabunPSK" w:cs="TH SarabunPSK" w:eastAsia="TH SarabunPSK"/>
-                <w:b w:val="0"/>
-                <w:i w:val="0"/>
+            <w:r>
+              <w:rPr>
+                <w:rFonts w:ascii="TH SarabunPSK" w:eastAsia="TH SarabunPSK" w:hAnsi="TH SarabunPSK" w:cs="TH SarabunPSK"/>
                 <w:sz w:val="30"/>
               </w:rPr>
               <w:t>฿3,112.00</w:t>
@@ -14081,12 +14031,10 @@
             <w:pPr>
               <w:jc w:val="center"/>
             </w:pPr>
-            <w:r/>
-            <w:r>
-              <w:rPr>
-                <w:rFonts w:ascii="TH SarabunPSK" w:hAnsi="TH SarabunPSK" w:cs="TH SarabunPSK" w:eastAsia="TH SarabunPSK"/>
+            <w:r>
+              <w:rPr>
+                <w:rFonts w:ascii="TH SarabunPSK" w:eastAsia="TH SarabunPSK" w:hAnsi="TH SarabunPSK" w:cs="TH SarabunPSK"/>
                 <w:b/>
-                <w:i w:val="0"/>
                 <w:sz w:val="30"/>
               </w:rPr>
               <w:t>#3</w:t>
@@ -14106,15 +14054,9 @@
             <w:vAlign w:val="center"/>
           </w:tcPr>
           <w:p>
-            <w:pPr>
-              <w:jc w:val="left"/>
-            </w:pPr>
-            <w:r/>
-            <w:r>
-              <w:rPr>
-                <w:rFonts w:ascii="TH SarabunPSK" w:hAnsi="TH SarabunPSK" w:cs="TH SarabunPSK" w:eastAsia="TH SarabunPSK"/>
-                <w:b w:val="0"/>
-                <w:i w:val="0"/>
+            <w:r>
+              <w:rPr>
+                <w:rFonts w:ascii="TH SarabunPSK" w:eastAsia="TH SarabunPSK" w:hAnsi="TH SarabunPSK" w:cs="TH SarabunPSK"/>
                 <w:sz w:val="30"/>
               </w:rPr>
               <w:t>Building Calm Software</w:t>
@@ -14134,15 +14076,9 @@
             <w:vAlign w:val="center"/>
           </w:tcPr>
           <w:p>
-            <w:pPr>
-              <w:jc w:val="left"/>
-            </w:pPr>
-            <w:r/>
-            <w:r>
-              <w:rPr>
-                <w:rFonts w:ascii="TH SarabunPSK" w:hAnsi="TH SarabunPSK" w:cs="TH SarabunPSK" w:eastAsia="TH SarabunPSK"/>
-                <w:b w:val="0"/>
-                <w:i w:val="0"/>
+            <w:r>
+              <w:rPr>
+                <w:rFonts w:ascii="TH SarabunPSK" w:eastAsia="TH SarabunPSK" w:hAnsi="TH SarabunPSK" w:cs="TH SarabunPSK"/>
                 <w:sz w:val="30"/>
               </w:rPr>
               <w:t>James Park</w:t>
@@ -14165,12 +14101,9 @@
             <w:pPr>
               <w:jc w:val="center"/>
             </w:pPr>
-            <w:r/>
-            <w:r>
-              <w:rPr>
-                <w:rFonts w:ascii="TH SarabunPSK" w:hAnsi="TH SarabunPSK" w:cs="TH SarabunPSK" w:eastAsia="TH SarabunPSK"/>
-                <w:b w:val="0"/>
-                <w:i w:val="0"/>
+            <w:r>
+              <w:rPr>
+                <w:rFonts w:ascii="TH SarabunPSK" w:eastAsia="TH SarabunPSK" w:hAnsi="TH SarabunPSK" w:cs="TH SarabunPSK"/>
                 <w:sz w:val="30"/>
               </w:rPr>
               <w:t>เทคโนโลยี</w:t>
@@ -14193,12 +14126,9 @@
             <w:pPr>
               <w:jc w:val="center"/>
             </w:pPr>
-            <w:r/>
-            <w:r>
-              <w:rPr>
-                <w:rFonts w:ascii="TH SarabunPSK" w:hAnsi="TH SarabunPSK" w:cs="TH SarabunPSK" w:eastAsia="TH SarabunPSK"/>
-                <w:b w:val="0"/>
-                <w:i w:val="0"/>
+            <w:r>
+              <w:rPr>
+                <w:rFonts w:ascii="TH SarabunPSK" w:eastAsia="TH SarabunPSK" w:hAnsi="TH SarabunPSK" w:cs="TH SarabunPSK"/>
                 <w:sz w:val="30"/>
               </w:rPr>
               <w:t>5 เล่ม</w:t>
@@ -14221,12 +14151,9 @@
             <w:pPr>
               <w:jc w:val="center"/>
             </w:pPr>
-            <w:r/>
-            <w:r>
-              <w:rPr>
-                <w:rFonts w:ascii="TH SarabunPSK" w:hAnsi="TH SarabunPSK" w:cs="TH SarabunPSK" w:eastAsia="TH SarabunPSK"/>
-                <w:b w:val="0"/>
-                <w:i w:val="0"/>
+            <w:r>
+              <w:rPr>
+                <w:rFonts w:ascii="TH SarabunPSK" w:eastAsia="TH SarabunPSK" w:hAnsi="TH SarabunPSK" w:cs="TH SarabunPSK"/>
                 <w:sz w:val="30"/>
               </w:rPr>
               <w:t>฿2,245.00</w:t>
@@ -14255,12 +14182,10 @@
             <w:pPr>
               <w:jc w:val="center"/>
             </w:pPr>
-            <w:r/>
-            <w:r>
-              <w:rPr>
-                <w:rFonts w:ascii="TH SarabunPSK" w:hAnsi="TH SarabunPSK" w:cs="TH SarabunPSK" w:eastAsia="TH SarabunPSK"/>
+            <w:r>
+              <w:rPr>
+                <w:rFonts w:ascii="TH SarabunPSK" w:eastAsia="TH SarabunPSK" w:hAnsi="TH SarabunPSK" w:cs="TH SarabunPSK"/>
                 <w:b/>
-                <w:i w:val="0"/>
                 <w:sz w:val="30"/>
               </w:rPr>
               <w:t>#4</w:t>
@@ -14280,15 +14205,9 @@
             <w:vAlign w:val="center"/>
           </w:tcPr>
           <w:p>
-            <w:pPr>
-              <w:jc w:val="left"/>
-            </w:pPr>
-            <w:r/>
-            <w:r>
-              <w:rPr>
-                <w:rFonts w:ascii="TH SarabunPSK" w:hAnsi="TH SarabunPSK" w:cs="TH SarabunPSK" w:eastAsia="TH SarabunPSK"/>
-                <w:b w:val="0"/>
-                <w:i w:val="0"/>
+            <w:r>
+              <w:rPr>
+                <w:rFonts w:ascii="TH SarabunPSK" w:eastAsia="TH SarabunPSK" w:hAnsi="TH SarabunPSK" w:cs="TH SarabunPSK"/>
                 <w:sz w:val="30"/>
               </w:rPr>
               <w:t>ดาวพระศุกร์ก่อนรุ่งสาง</w:t>
@@ -14308,15 +14227,9 @@
             <w:vAlign w:val="center"/>
           </w:tcPr>
           <w:p>
-            <w:pPr>
-              <w:jc w:val="left"/>
-            </w:pPr>
-            <w:r/>
-            <w:r>
-              <w:rPr>
-                <w:rFonts w:ascii="TH SarabunPSK" w:hAnsi="TH SarabunPSK" w:cs="TH SarabunPSK" w:eastAsia="TH SarabunPSK"/>
-                <w:b w:val="0"/>
-                <w:i w:val="0"/>
+            <w:r>
+              <w:rPr>
+                <w:rFonts w:ascii="TH SarabunPSK" w:eastAsia="TH SarabunPSK" w:hAnsi="TH SarabunPSK" w:cs="TH SarabunPSK"/>
                 <w:sz w:val="30"/>
               </w:rPr>
               <w:t>รัชต์ ทวีวงศ์</w:t>
@@ -14339,12 +14252,9 @@
             <w:pPr>
               <w:jc w:val="center"/>
             </w:pPr>
-            <w:r/>
-            <w:r>
-              <w:rPr>
-                <w:rFonts w:ascii="TH SarabunPSK" w:hAnsi="TH SarabunPSK" w:cs="TH SarabunPSK" w:eastAsia="TH SarabunPSK"/>
-                <w:b w:val="0"/>
-                <w:i w:val="0"/>
+            <w:r>
+              <w:rPr>
+                <w:rFonts w:ascii="TH SarabunPSK" w:eastAsia="TH SarabunPSK" w:hAnsi="TH SarabunPSK" w:cs="TH SarabunPSK"/>
                 <w:sz w:val="30"/>
               </w:rPr>
               <w:t>สารคดี</w:t>
@@ -14367,12 +14277,9 @@
             <w:pPr>
               <w:jc w:val="center"/>
             </w:pPr>
-            <w:r/>
-            <w:r>
-              <w:rPr>
-                <w:rFonts w:ascii="TH SarabunPSK" w:hAnsi="TH SarabunPSK" w:cs="TH SarabunPSK" w:eastAsia="TH SarabunPSK"/>
-                <w:b w:val="0"/>
-                <w:i w:val="0"/>
+            <w:r>
+              <w:rPr>
+                <w:rFonts w:ascii="TH SarabunPSK" w:eastAsia="TH SarabunPSK" w:hAnsi="TH SarabunPSK" w:cs="TH SarabunPSK"/>
                 <w:sz w:val="30"/>
               </w:rPr>
               <w:t>4 เล่ม</w:t>
@@ -14395,12 +14302,9 @@
             <w:pPr>
               <w:jc w:val="center"/>
             </w:pPr>
-            <w:r/>
-            <w:r>
-              <w:rPr>
-                <w:rFonts w:ascii="TH SarabunPSK" w:hAnsi="TH SarabunPSK" w:cs="TH SarabunPSK" w:eastAsia="TH SarabunPSK"/>
-                <w:b w:val="0"/>
-                <w:i w:val="0"/>
+            <w:r>
+              <w:rPr>
+                <w:rFonts w:ascii="TH SarabunPSK" w:eastAsia="TH SarabunPSK" w:hAnsi="TH SarabunPSK" w:cs="TH SarabunPSK"/>
                 <w:sz w:val="30"/>
               </w:rPr>
               <w:t>฿1,056.00</w:t>
@@ -14429,12 +14333,10 @@
             <w:pPr>
               <w:jc w:val="center"/>
             </w:pPr>
-            <w:r/>
-            <w:r>
-              <w:rPr>
-                <w:rFonts w:ascii="TH SarabunPSK" w:hAnsi="TH SarabunPSK" w:cs="TH SarabunPSK" w:eastAsia="TH SarabunPSK"/>
+            <w:r>
+              <w:rPr>
+                <w:rFonts w:ascii="TH SarabunPSK" w:eastAsia="TH SarabunPSK" w:hAnsi="TH SarabunPSK" w:cs="TH SarabunPSK"/>
                 <w:b/>
-                <w:i w:val="0"/>
                 <w:sz w:val="30"/>
               </w:rPr>
               <w:t>#5</w:t>
@@ -14454,15 +14356,9 @@
             <w:vAlign w:val="center"/>
           </w:tcPr>
           <w:p>
-            <w:pPr>
-              <w:jc w:val="left"/>
-            </w:pPr>
-            <w:r/>
-            <w:r>
-              <w:rPr>
-                <w:rFonts w:ascii="TH SarabunPSK" w:hAnsi="TH SarabunPSK" w:cs="TH SarabunPSK" w:eastAsia="TH SarabunPSK"/>
-                <w:b w:val="0"/>
-                <w:i w:val="0"/>
+            <w:r>
+              <w:rPr>
+                <w:rFonts w:ascii="TH SarabunPSK" w:eastAsia="TH SarabunPSK" w:hAnsi="TH SarabunPSK" w:cs="TH SarabunPSK"/>
                 <w:sz w:val="30"/>
               </w:rPr>
               <w:t>Thinking in Systems</w:t>
@@ -14482,15 +14378,9 @@
             <w:vAlign w:val="center"/>
           </w:tcPr>
           <w:p>
-            <w:pPr>
-              <w:jc w:val="left"/>
-            </w:pPr>
-            <w:r/>
-            <w:r>
-              <w:rPr>
-                <w:rFonts w:ascii="TH SarabunPSK" w:hAnsi="TH SarabunPSK" w:cs="TH SarabunPSK" w:eastAsia="TH SarabunPSK"/>
-                <w:b w:val="0"/>
-                <w:i w:val="0"/>
+            <w:r>
+              <w:rPr>
+                <w:rFonts w:ascii="TH SarabunPSK" w:eastAsia="TH SarabunPSK" w:hAnsi="TH SarabunPSK" w:cs="TH SarabunPSK"/>
                 <w:sz w:val="30"/>
               </w:rPr>
               <w:t>Donella Meadows</w:t>
@@ -14513,12 +14403,9 @@
             <w:pPr>
               <w:jc w:val="center"/>
             </w:pPr>
-            <w:r/>
-            <w:r>
-              <w:rPr>
-                <w:rFonts w:ascii="TH SarabunPSK" w:hAnsi="TH SarabunPSK" w:cs="TH SarabunPSK" w:eastAsia="TH SarabunPSK"/>
-                <w:b w:val="0"/>
-                <w:i w:val="0"/>
+            <w:r>
+              <w:rPr>
+                <w:rFonts w:ascii="TH SarabunPSK" w:eastAsia="TH SarabunPSK" w:hAnsi="TH SarabunPSK" w:cs="TH SarabunPSK"/>
                 <w:sz w:val="30"/>
               </w:rPr>
               <w:t>เทคโนโลยี</w:t>
@@ -14541,12 +14428,9 @@
             <w:pPr>
               <w:jc w:val="center"/>
             </w:pPr>
-            <w:r/>
-            <w:r>
-              <w:rPr>
-                <w:rFonts w:ascii="TH SarabunPSK" w:hAnsi="TH SarabunPSK" w:cs="TH SarabunPSK" w:eastAsia="TH SarabunPSK"/>
-                <w:b w:val="0"/>
-                <w:i w:val="0"/>
+            <w:r>
+              <w:rPr>
+                <w:rFonts w:ascii="TH SarabunPSK" w:eastAsia="TH SarabunPSK" w:hAnsi="TH SarabunPSK" w:cs="TH SarabunPSK"/>
                 <w:sz w:val="30"/>
               </w:rPr>
               <w:t>3 เล่ม</w:t>
@@ -14569,12 +14453,9 @@
             <w:pPr>
               <w:jc w:val="center"/>
             </w:pPr>
-            <w:r/>
-            <w:r>
-              <w:rPr>
-                <w:rFonts w:ascii="TH SarabunPSK" w:hAnsi="TH SarabunPSK" w:cs="TH SarabunPSK" w:eastAsia="TH SarabunPSK"/>
-                <w:b w:val="0"/>
-                <w:i w:val="0"/>
+            <w:r>
+              <w:rPr>
+                <w:rFonts w:ascii="TH SarabunPSK" w:eastAsia="TH SarabunPSK" w:hAnsi="TH SarabunPSK" w:cs="TH SarabunPSK"/>
                 <w:sz w:val="30"/>
               </w:rPr>
               <w:t>฿1,197.00</w:t>
@@ -14644,7 +14525,6 @@
           <w:b/>
           <w:sz w:val="36"/>
         </w:rPr>
-        <w:lastRenderedPageBreak/>
         <w:t>4.3 รายงานที่ 3: ยอดขายตามหมวดหมู่หนังสือ</w:t>
       </w:r>
     </w:p>
@@ -15035,12 +14915,10 @@
             <w:pPr>
               <w:jc w:val="center"/>
             </w:pPr>
-            <w:r/>
-            <w:r>
-              <w:rPr>
-                <w:rFonts w:ascii="TH SarabunPSK" w:hAnsi="TH SarabunPSK" w:cs="TH SarabunPSK" w:eastAsia="TH SarabunPSK"/>
+            <w:r>
+              <w:rPr>
+                <w:rFonts w:ascii="TH SarabunPSK" w:eastAsia="TH SarabunPSK" w:hAnsi="TH SarabunPSK" w:cs="TH SarabunPSK"/>
                 <w:b/>
-                <w:i w:val="0"/>
                 <w:sz w:val="30"/>
               </w:rPr>
               <w:t>CAT-2</w:t>
@@ -15060,15 +14938,9 @@
             <w:vAlign w:val="center"/>
           </w:tcPr>
           <w:p>
-            <w:pPr>
-              <w:jc w:val="left"/>
-            </w:pPr>
-            <w:r/>
-            <w:r>
-              <w:rPr>
-                <w:rFonts w:ascii="TH SarabunPSK" w:hAnsi="TH SarabunPSK" w:cs="TH SarabunPSK" w:eastAsia="TH SarabunPSK"/>
-                <w:b w:val="0"/>
-                <w:i w:val="0"/>
+            <w:r>
+              <w:rPr>
+                <w:rFonts w:ascii="TH SarabunPSK" w:eastAsia="TH SarabunPSK" w:hAnsi="TH SarabunPSK" w:cs="TH SarabunPSK"/>
                 <w:sz w:val="30"/>
               </w:rPr>
               <w:t>เทคโนโลยีและคอมพิวเตอร์</w:t>
@@ -15091,12 +14963,9 @@
             <w:pPr>
               <w:jc w:val="center"/>
             </w:pPr>
-            <w:r/>
-            <w:r>
-              <w:rPr>
-                <w:rFonts w:ascii="TH SarabunPSK" w:hAnsi="TH SarabunPSK" w:cs="TH SarabunPSK" w:eastAsia="TH SarabunPSK"/>
-                <w:b w:val="0"/>
-                <w:i w:val="0"/>
+            <w:r>
+              <w:rPr>
+                <w:rFonts w:ascii="TH SarabunPSK" w:eastAsia="TH SarabunPSK" w:hAnsi="TH SarabunPSK" w:cs="TH SarabunPSK"/>
                 <w:sz w:val="30"/>
               </w:rPr>
               <w:t>14 ออเดอร์</w:t>
@@ -15119,12 +14988,9 @@
             <w:pPr>
               <w:jc w:val="center"/>
             </w:pPr>
-            <w:r/>
-            <w:r>
-              <w:rPr>
-                <w:rFonts w:ascii="TH SarabunPSK" w:hAnsi="TH SarabunPSK" w:cs="TH SarabunPSK" w:eastAsia="TH SarabunPSK"/>
-                <w:b w:val="0"/>
-                <w:i w:val="0"/>
+            <w:r>
+              <w:rPr>
+                <w:rFonts w:ascii="TH SarabunPSK" w:eastAsia="TH SarabunPSK" w:hAnsi="TH SarabunPSK" w:cs="TH SarabunPSK"/>
                 <w:sz w:val="30"/>
               </w:rPr>
               <w:t>16 เล่ม</w:t>
@@ -15147,12 +15013,9 @@
             <w:pPr>
               <w:jc w:val="center"/>
             </w:pPr>
-            <w:r/>
-            <w:r>
-              <w:rPr>
-                <w:rFonts w:ascii="TH SarabunPSK" w:hAnsi="TH SarabunPSK" w:cs="TH SarabunPSK" w:eastAsia="TH SarabunPSK"/>
-                <w:b w:val="0"/>
-                <w:i w:val="0"/>
+            <w:r>
+              <w:rPr>
+                <w:rFonts w:ascii="TH SarabunPSK" w:eastAsia="TH SarabunPSK" w:hAnsi="TH SarabunPSK" w:cs="TH SarabunPSK"/>
                 <w:sz w:val="30"/>
               </w:rPr>
               <w:t>฿6,554.00</w:t>
@@ -15181,12 +15044,10 @@
             <w:pPr>
               <w:jc w:val="center"/>
             </w:pPr>
-            <w:r/>
-            <w:r>
-              <w:rPr>
-                <w:rFonts w:ascii="TH SarabunPSK" w:hAnsi="TH SarabunPSK" w:cs="TH SarabunPSK" w:eastAsia="TH SarabunPSK"/>
+            <w:r>
+              <w:rPr>
+                <w:rFonts w:ascii="TH SarabunPSK" w:eastAsia="TH SarabunPSK" w:hAnsi="TH SarabunPSK" w:cs="TH SarabunPSK"/>
                 <w:b/>
-                <w:i w:val="0"/>
                 <w:sz w:val="30"/>
               </w:rPr>
               <w:t>CAT-1</w:t>
@@ -15206,15 +15067,9 @@
             <w:vAlign w:val="center"/>
           </w:tcPr>
           <w:p>
-            <w:pPr>
-              <w:jc w:val="left"/>
-            </w:pPr>
-            <w:r/>
-            <w:r>
-              <w:rPr>
-                <w:rFonts w:ascii="TH SarabunPSK" w:hAnsi="TH SarabunPSK" w:cs="TH SarabunPSK" w:eastAsia="TH SarabunPSK"/>
-                <w:b w:val="0"/>
-                <w:i w:val="0"/>
+            <w:r>
+              <w:rPr>
+                <w:rFonts w:ascii="TH SarabunPSK" w:eastAsia="TH SarabunPSK" w:hAnsi="TH SarabunPSK" w:cs="TH SarabunPSK"/>
                 <w:sz w:val="30"/>
               </w:rPr>
               <w:t>นวนิยายและวรรณกรรม</w:t>
@@ -15237,12 +15092,9 @@
             <w:pPr>
               <w:jc w:val="center"/>
             </w:pPr>
-            <w:r/>
-            <w:r>
-              <w:rPr>
-                <w:rFonts w:ascii="TH SarabunPSK" w:hAnsi="TH SarabunPSK" w:cs="TH SarabunPSK" w:eastAsia="TH SarabunPSK"/>
-                <w:b w:val="0"/>
-                <w:i w:val="0"/>
+            <w:r>
+              <w:rPr>
+                <w:rFonts w:ascii="TH SarabunPSK" w:eastAsia="TH SarabunPSK" w:hAnsi="TH SarabunPSK" w:cs="TH SarabunPSK"/>
                 <w:sz w:val="30"/>
               </w:rPr>
               <w:t>12 ออเดอร์</w:t>
@@ -15265,12 +15117,9 @@
             <w:pPr>
               <w:jc w:val="center"/>
             </w:pPr>
-            <w:r/>
-            <w:r>
-              <w:rPr>
-                <w:rFonts w:ascii="TH SarabunPSK" w:hAnsi="TH SarabunPSK" w:cs="TH SarabunPSK" w:eastAsia="TH SarabunPSK"/>
-                <w:b w:val="0"/>
-                <w:i w:val="0"/>
+            <w:r>
+              <w:rPr>
+                <w:rFonts w:ascii="TH SarabunPSK" w:eastAsia="TH SarabunPSK" w:hAnsi="TH SarabunPSK" w:cs="TH SarabunPSK"/>
                 <w:sz w:val="30"/>
               </w:rPr>
               <w:t>12 เล่ม</w:t>
@@ -15293,12 +15142,9 @@
             <w:pPr>
               <w:jc w:val="center"/>
             </w:pPr>
-            <w:r/>
-            <w:r>
-              <w:rPr>
-                <w:rFonts w:ascii="TH SarabunPSK" w:hAnsi="TH SarabunPSK" w:cs="TH SarabunPSK" w:eastAsia="TH SarabunPSK"/>
-                <w:b w:val="0"/>
-                <w:i w:val="0"/>
+            <w:r>
+              <w:rPr>
+                <w:rFonts w:ascii="TH SarabunPSK" w:eastAsia="TH SarabunPSK" w:hAnsi="TH SarabunPSK" w:cs="TH SarabunPSK"/>
                 <w:sz w:val="30"/>
               </w:rPr>
               <w:t>฿3,088.00</w:t>
@@ -15327,12 +15173,10 @@
             <w:pPr>
               <w:jc w:val="center"/>
             </w:pPr>
-            <w:r/>
-            <w:r>
-              <w:rPr>
-                <w:rFonts w:ascii="TH SarabunPSK" w:hAnsi="TH SarabunPSK" w:cs="TH SarabunPSK" w:eastAsia="TH SarabunPSK"/>
+            <w:r>
+              <w:rPr>
+                <w:rFonts w:ascii="TH SarabunPSK" w:eastAsia="TH SarabunPSK" w:hAnsi="TH SarabunPSK" w:cs="TH SarabunPSK"/>
                 <w:b/>
-                <w:i w:val="0"/>
                 <w:sz w:val="30"/>
               </w:rPr>
               <w:t>CAT-4</w:t>
@@ -15352,15 +15196,9 @@
             <w:vAlign w:val="center"/>
           </w:tcPr>
           <w:p>
-            <w:pPr>
-              <w:jc w:val="left"/>
-            </w:pPr>
-            <w:r/>
-            <w:r>
-              <w:rPr>
-                <w:rFonts w:ascii="TH SarabunPSK" w:hAnsi="TH SarabunPSK" w:cs="TH SarabunPSK" w:eastAsia="TH SarabunPSK"/>
-                <w:b w:val="0"/>
-                <w:i w:val="0"/>
+            <w:r>
+              <w:rPr>
+                <w:rFonts w:ascii="TH SarabunPSK" w:eastAsia="TH SarabunPSK" w:hAnsi="TH SarabunPSK" w:cs="TH SarabunPSK"/>
                 <w:sz w:val="30"/>
               </w:rPr>
               <w:t>ศิลปะและการออกแบบ</w:t>
@@ -15383,12 +15221,9 @@
             <w:pPr>
               <w:jc w:val="center"/>
             </w:pPr>
-            <w:r/>
-            <w:r>
-              <w:rPr>
-                <w:rFonts w:ascii="TH SarabunPSK" w:hAnsi="TH SarabunPSK" w:cs="TH SarabunPSK" w:eastAsia="TH SarabunPSK"/>
-                <w:b w:val="0"/>
-                <w:i w:val="0"/>
+            <w:r>
+              <w:rPr>
+                <w:rFonts w:ascii="TH SarabunPSK" w:eastAsia="TH SarabunPSK" w:hAnsi="TH SarabunPSK" w:cs="TH SarabunPSK"/>
                 <w:sz w:val="30"/>
               </w:rPr>
               <w:t>3 ออเดอร์</w:t>
@@ -15411,12 +15246,9 @@
             <w:pPr>
               <w:jc w:val="center"/>
             </w:pPr>
-            <w:r/>
-            <w:r>
-              <w:rPr>
-                <w:rFonts w:ascii="TH SarabunPSK" w:hAnsi="TH SarabunPSK" w:cs="TH SarabunPSK" w:eastAsia="TH SarabunPSK"/>
-                <w:b w:val="0"/>
-                <w:i w:val="0"/>
+            <w:r>
+              <w:rPr>
+                <w:rFonts w:ascii="TH SarabunPSK" w:eastAsia="TH SarabunPSK" w:hAnsi="TH SarabunPSK" w:cs="TH SarabunPSK"/>
                 <w:sz w:val="30"/>
               </w:rPr>
               <w:t>5 เล่ม</w:t>
@@ -15439,12 +15271,9 @@
             <w:pPr>
               <w:jc w:val="center"/>
             </w:pPr>
-            <w:r/>
-            <w:r>
-              <w:rPr>
-                <w:rFonts w:ascii="TH SarabunPSK" w:hAnsi="TH SarabunPSK" w:cs="TH SarabunPSK" w:eastAsia="TH SarabunPSK"/>
-                <w:b w:val="0"/>
-                <w:i w:val="0"/>
+            <w:r>
+              <w:rPr>
+                <w:rFonts w:ascii="TH SarabunPSK" w:eastAsia="TH SarabunPSK" w:hAnsi="TH SarabunPSK" w:cs="TH SarabunPSK"/>
                 <w:sz w:val="30"/>
               </w:rPr>
               <w:t>฿1,555.00</w:t>
@@ -15473,12 +15302,10 @@
             <w:pPr>
               <w:jc w:val="center"/>
             </w:pPr>
-            <w:r/>
-            <w:r>
-              <w:rPr>
-                <w:rFonts w:ascii="TH SarabunPSK" w:hAnsi="TH SarabunPSK" w:cs="TH SarabunPSK" w:eastAsia="TH SarabunPSK"/>
+            <w:r>
+              <w:rPr>
+                <w:rFonts w:ascii="TH SarabunPSK" w:eastAsia="TH SarabunPSK" w:hAnsi="TH SarabunPSK" w:cs="TH SarabunPSK"/>
                 <w:b/>
-                <w:i w:val="0"/>
                 <w:sz w:val="30"/>
               </w:rPr>
               <w:t>CAT-3</w:t>
@@ -15498,15 +15325,9 @@
             <w:vAlign w:val="center"/>
           </w:tcPr>
           <w:p>
-            <w:pPr>
-              <w:jc w:val="left"/>
-            </w:pPr>
-            <w:r/>
-            <w:r>
-              <w:rPr>
-                <w:rFonts w:ascii="TH SarabunPSK" w:hAnsi="TH SarabunPSK" w:cs="TH SarabunPSK" w:eastAsia="TH SarabunPSK"/>
-                <w:b w:val="0"/>
-                <w:i w:val="0"/>
+            <w:r>
+              <w:rPr>
+                <w:rFonts w:ascii="TH SarabunPSK" w:eastAsia="TH SarabunPSK" w:hAnsi="TH SarabunPSK" w:cs="TH SarabunPSK"/>
                 <w:sz w:val="30"/>
               </w:rPr>
               <w:t>ประวัติศาสตร์และสารคดี</w:t>
@@ -15529,12 +15350,9 @@
             <w:pPr>
               <w:jc w:val="center"/>
             </w:pPr>
-            <w:r/>
-            <w:r>
-              <w:rPr>
-                <w:rFonts w:ascii="TH SarabunPSK" w:hAnsi="TH SarabunPSK" w:cs="TH SarabunPSK" w:eastAsia="TH SarabunPSK"/>
-                <w:b w:val="0"/>
-                <w:i w:val="0"/>
+            <w:r>
+              <w:rPr>
+                <w:rFonts w:ascii="TH SarabunPSK" w:eastAsia="TH SarabunPSK" w:hAnsi="TH SarabunPSK" w:cs="TH SarabunPSK"/>
                 <w:sz w:val="30"/>
               </w:rPr>
               <w:t>6 ออเดอร์</w:t>
@@ -15557,12 +15375,9 @@
             <w:pPr>
               <w:jc w:val="center"/>
             </w:pPr>
-            <w:r/>
-            <w:r>
-              <w:rPr>
-                <w:rFonts w:ascii="TH SarabunPSK" w:hAnsi="TH SarabunPSK" w:cs="TH SarabunPSK" w:eastAsia="TH SarabunPSK"/>
-                <w:b w:val="0"/>
-                <w:i w:val="0"/>
+            <w:r>
+              <w:rPr>
+                <w:rFonts w:ascii="TH SarabunPSK" w:eastAsia="TH SarabunPSK" w:hAnsi="TH SarabunPSK" w:cs="TH SarabunPSK"/>
                 <w:sz w:val="30"/>
               </w:rPr>
               <w:t>6 เล่ม</w:t>
@@ -15585,12 +15400,9 @@
             <w:pPr>
               <w:jc w:val="center"/>
             </w:pPr>
-            <w:r/>
-            <w:r>
-              <w:rPr>
-                <w:rFonts w:ascii="TH SarabunPSK" w:hAnsi="TH SarabunPSK" w:cs="TH SarabunPSK" w:eastAsia="TH SarabunPSK"/>
-                <w:b w:val="0"/>
-                <w:i w:val="0"/>
+            <w:r>
+              <w:rPr>
+                <w:rFonts w:ascii="TH SarabunPSK" w:eastAsia="TH SarabunPSK" w:hAnsi="TH SarabunPSK" w:cs="TH SarabunPSK"/>
                 <w:sz w:val="30"/>
               </w:rPr>
               <w:t>฿1,454.00</w:t>
@@ -15619,12 +15431,10 @@
             <w:pPr>
               <w:jc w:val="center"/>
             </w:pPr>
-            <w:r/>
-            <w:r>
-              <w:rPr>
-                <w:rFonts w:ascii="TH SarabunPSK" w:hAnsi="TH SarabunPSK" w:cs="TH SarabunPSK" w:eastAsia="TH SarabunPSK"/>
+            <w:r>
+              <w:rPr>
+                <w:rFonts w:ascii="TH SarabunPSK" w:eastAsia="TH SarabunPSK" w:hAnsi="TH SarabunPSK" w:cs="TH SarabunPSK"/>
                 <w:b/>
-                <w:i w:val="0"/>
                 <w:sz w:val="30"/>
               </w:rPr>
               <w:t>CAT-5</w:t>
@@ -15644,15 +15454,9 @@
             <w:vAlign w:val="center"/>
           </w:tcPr>
           <w:p>
-            <w:pPr>
-              <w:jc w:val="left"/>
-            </w:pPr>
-            <w:r/>
-            <w:r>
-              <w:rPr>
-                <w:rFonts w:ascii="TH SarabunPSK" w:hAnsi="TH SarabunPSK" w:cs="TH SarabunPSK" w:eastAsia="TH SarabunPSK"/>
-                <w:b w:val="0"/>
-                <w:i w:val="0"/>
+            <w:r>
+              <w:rPr>
+                <w:rFonts w:ascii="TH SarabunPSK" w:eastAsia="TH SarabunPSK" w:hAnsi="TH SarabunPSK" w:cs="TH SarabunPSK"/>
                 <w:sz w:val="30"/>
               </w:rPr>
               <w:t>ไลฟ์สไตล์และอาหาร</w:t>
@@ -15675,12 +15479,9 @@
             <w:pPr>
               <w:jc w:val="center"/>
             </w:pPr>
-            <w:r/>
-            <w:r>
-              <w:rPr>
-                <w:rFonts w:ascii="TH SarabunPSK" w:hAnsi="TH SarabunPSK" w:cs="TH SarabunPSK" w:eastAsia="TH SarabunPSK"/>
-                <w:b w:val="0"/>
-                <w:i w:val="0"/>
+            <w:r>
+              <w:rPr>
+                <w:rFonts w:ascii="TH SarabunPSK" w:eastAsia="TH SarabunPSK" w:hAnsi="TH SarabunPSK" w:cs="TH SarabunPSK"/>
                 <w:sz w:val="30"/>
               </w:rPr>
               <w:t>4 ออเดอร์</w:t>
@@ -15703,12 +15504,9 @@
             <w:pPr>
               <w:jc w:val="center"/>
             </w:pPr>
-            <w:r/>
-            <w:r>
-              <w:rPr>
-                <w:rFonts w:ascii="TH SarabunPSK" w:hAnsi="TH SarabunPSK" w:cs="TH SarabunPSK" w:eastAsia="TH SarabunPSK"/>
-                <w:b w:val="0"/>
-                <w:i w:val="0"/>
+            <w:r>
+              <w:rPr>
+                <w:rFonts w:ascii="TH SarabunPSK" w:eastAsia="TH SarabunPSK" w:hAnsi="TH SarabunPSK" w:cs="TH SarabunPSK"/>
                 <w:sz w:val="30"/>
               </w:rPr>
               <w:t>4 เล่ม</w:t>
@@ -15731,12 +15529,9 @@
             <w:pPr>
               <w:jc w:val="center"/>
             </w:pPr>
-            <w:r/>
-            <w:r>
-              <w:rPr>
-                <w:rFonts w:ascii="TH SarabunPSK" w:hAnsi="TH SarabunPSK" w:cs="TH SarabunPSK" w:eastAsia="TH SarabunPSK"/>
-                <w:b w:val="0"/>
-                <w:i w:val="0"/>
+            <w:r>
+              <w:rPr>
+                <w:rFonts w:ascii="TH SarabunPSK" w:eastAsia="TH SarabunPSK" w:hAnsi="TH SarabunPSK" w:cs="TH SarabunPSK"/>
                 <w:sz w:val="30"/>
               </w:rPr>
               <w:t>฿1,226.00</w:t>
@@ -15752,8 +15547,7 @@
       </w:pPr>
       <w:r>
         <w:rPr>
-          <w:rFonts w:ascii="TH SarabunPSK" w:hAnsi="TH SarabunPSK" w:cs="TH SarabunPSK" w:eastAsia="TH SarabunPSK"/>
-          <w:b w:val="0"/>
+          <w:rFonts w:ascii="TH SarabunPSK" w:eastAsia="TH SarabunPSK" w:hAnsi="TH SarabunPSK" w:cs="TH SarabunPSK"/>
           <w:i/>
           <w:sz w:val="32"/>
         </w:rPr>
@@ -15813,7 +15607,6 @@
           <w:b/>
           <w:sz w:val="36"/>
         </w:rPr>
-        <w:lastRenderedPageBreak/>
         <w:t>4.4 รายงานที่ 4: พฤติกรรมลูกค้าและยอดซื้อสะสม</w:t>
       </w:r>
     </w:p>
@@ -16268,15 +16061,10 @@
             <w:vAlign w:val="center"/>
           </w:tcPr>
           <w:p>
-            <w:pPr>
-              <w:jc w:val="left"/>
-            </w:pPr>
-            <w:r/>
-            <w:r>
-              <w:rPr>
-                <w:rFonts w:ascii="TH SarabunPSK" w:hAnsi="TH SarabunPSK" w:cs="TH SarabunPSK" w:eastAsia="TH SarabunPSK"/>
+            <w:r>
+              <w:rPr>
+                <w:rFonts w:ascii="TH SarabunPSK" w:eastAsia="TH SarabunPSK" w:hAnsi="TH SarabunPSK" w:cs="TH SarabunPSK"/>
                 <w:b/>
-                <w:i w:val="0"/>
                 <w:sz w:val="30"/>
               </w:rPr>
               <w:t>KANNITI YASO</w:t>
@@ -16296,15 +16084,9 @@
             <w:vAlign w:val="center"/>
           </w:tcPr>
           <w:p>
-            <w:pPr>
-              <w:jc w:val="left"/>
-            </w:pPr>
-            <w:r/>
-            <w:r>
-              <w:rPr>
-                <w:rFonts w:ascii="TH SarabunPSK" w:hAnsi="TH SarabunPSK" w:cs="TH SarabunPSK" w:eastAsia="TH SarabunPSK"/>
-                <w:b w:val="0"/>
-                <w:i w:val="0"/>
+            <w:r>
+              <w:rPr>
+                <w:rFonts w:ascii="TH SarabunPSK" w:eastAsia="TH SarabunPSK" w:hAnsi="TH SarabunPSK" w:cs="TH SarabunPSK"/>
                 <w:sz w:val="30"/>
               </w:rPr>
               <w:t>firts.zx99@gmail.com</w:t>
@@ -16327,12 +16109,9 @@
             <w:pPr>
               <w:jc w:val="center"/>
             </w:pPr>
-            <w:r/>
-            <w:r>
-              <w:rPr>
-                <w:rFonts w:ascii="TH SarabunPSK" w:hAnsi="TH SarabunPSK" w:cs="TH SarabunPSK" w:eastAsia="TH SarabunPSK"/>
-                <w:b w:val="0"/>
-                <w:i w:val="0"/>
+            <w:r>
+              <w:rPr>
+                <w:rFonts w:ascii="TH SarabunPSK" w:eastAsia="TH SarabunPSK" w:hAnsi="TH SarabunPSK" w:cs="TH SarabunPSK"/>
                 <w:sz w:val="30"/>
               </w:rPr>
               <w:t>10 ออเดอร์</w:t>
@@ -16355,12 +16134,9 @@
             <w:pPr>
               <w:jc w:val="center"/>
             </w:pPr>
-            <w:r/>
-            <w:r>
-              <w:rPr>
-                <w:rFonts w:ascii="TH SarabunPSK" w:hAnsi="TH SarabunPSK" w:cs="TH SarabunPSK" w:eastAsia="TH SarabunPSK"/>
-                <w:b w:val="0"/>
-                <w:i w:val="0"/>
+            <w:r>
+              <w:rPr>
+                <w:rFonts w:ascii="TH SarabunPSK" w:eastAsia="TH SarabunPSK" w:hAnsi="TH SarabunPSK" w:cs="TH SarabunPSK"/>
                 <w:sz w:val="30"/>
               </w:rPr>
               <w:t>฿3,937.00</w:t>
@@ -16383,12 +16159,9 @@
             <w:pPr>
               <w:jc w:val="center"/>
             </w:pPr>
-            <w:r/>
-            <w:r>
-              <w:rPr>
-                <w:rFonts w:ascii="TH SarabunPSK" w:hAnsi="TH SarabunPSK" w:cs="TH SarabunPSK" w:eastAsia="TH SarabunPSK"/>
-                <w:b w:val="0"/>
-                <w:i w:val="0"/>
+            <w:r>
+              <w:rPr>
+                <w:rFonts w:ascii="TH SarabunPSK" w:eastAsia="TH SarabunPSK" w:hAnsi="TH SarabunPSK" w:cs="TH SarabunPSK"/>
                 <w:sz w:val="30"/>
               </w:rPr>
               <w:t>9 ออเดอร์</w:t>
@@ -16411,12 +16184,9 @@
             <w:pPr>
               <w:jc w:val="center"/>
             </w:pPr>
-            <w:r/>
-            <w:r>
-              <w:rPr>
-                <w:rFonts w:ascii="TH SarabunPSK" w:hAnsi="TH SarabunPSK" w:cs="TH SarabunPSK" w:eastAsia="TH SarabunPSK"/>
-                <w:b w:val="0"/>
-                <w:i w:val="0"/>
+            <w:r>
+              <w:rPr>
+                <w:rFonts w:ascii="TH SarabunPSK" w:eastAsia="TH SarabunPSK" w:hAnsi="TH SarabunPSK" w:cs="TH SarabunPSK"/>
                 <w:sz w:val="30"/>
               </w:rPr>
               <w:t>1 ออเดอร์</w:t>
@@ -16439,12 +16209,9 @@
             <w:pPr>
               <w:jc w:val="center"/>
             </w:pPr>
-            <w:r/>
-            <w:r>
-              <w:rPr>
-                <w:rFonts w:ascii="TH SarabunPSK" w:hAnsi="TH SarabunPSK" w:cs="TH SarabunPSK" w:eastAsia="TH SarabunPSK"/>
-                <w:b w:val="0"/>
-                <w:i w:val="0"/>
+            <w:r>
+              <w:rPr>
+                <w:rFonts w:ascii="TH SarabunPSK" w:eastAsia="TH SarabunPSK" w:hAnsi="TH SarabunPSK" w:cs="TH SarabunPSK"/>
                 <w:sz w:val="30"/>
               </w:rPr>
               <w:t>0</w:t>
@@ -16470,15 +16237,10 @@
             <w:vAlign w:val="center"/>
           </w:tcPr>
           <w:p>
-            <w:pPr>
-              <w:jc w:val="left"/>
-            </w:pPr>
-            <w:r/>
-            <w:r>
-              <w:rPr>
-                <w:rFonts w:ascii="TH SarabunPSK" w:hAnsi="TH SarabunPSK" w:cs="TH SarabunPSK" w:eastAsia="TH SarabunPSK"/>
+            <w:r>
+              <w:rPr>
+                <w:rFonts w:ascii="TH SarabunPSK" w:eastAsia="TH SarabunPSK" w:hAnsi="TH SarabunPSK" w:cs="TH SarabunPSK"/>
                 <w:b/>
-                <w:i w:val="0"/>
                 <w:sz w:val="30"/>
               </w:rPr>
               <w:t>พีรณัฐ สายซอฟต์แวร์</w:t>
@@ -16498,15 +16260,9 @@
             <w:vAlign w:val="center"/>
           </w:tcPr>
           <w:p>
-            <w:pPr>
-              <w:jc w:val="left"/>
-            </w:pPr>
-            <w:r/>
-            <w:r>
-              <w:rPr>
-                <w:rFonts w:ascii="TH SarabunPSK" w:hAnsi="TH SarabunPSK" w:cs="TH SarabunPSK" w:eastAsia="TH SarabunPSK"/>
-                <w:b w:val="0"/>
-                <w:i w:val="0"/>
+            <w:r>
+              <w:rPr>
+                <w:rFonts w:ascii="TH SarabunPSK" w:eastAsia="TH SarabunPSK" w:hAnsi="TH SarabunPSK" w:cs="TH SarabunPSK"/>
                 <w:sz w:val="30"/>
               </w:rPr>
               <w:t>peerat.dev@outlook.com</w:t>
@@ -16529,12 +16285,9 @@
             <w:pPr>
               <w:jc w:val="center"/>
             </w:pPr>
-            <w:r/>
-            <w:r>
-              <w:rPr>
-                <w:rFonts w:ascii="TH SarabunPSK" w:hAnsi="TH SarabunPSK" w:cs="TH SarabunPSK" w:eastAsia="TH SarabunPSK"/>
-                <w:b w:val="0"/>
-                <w:i w:val="0"/>
+            <w:r>
+              <w:rPr>
+                <w:rFonts w:ascii="TH SarabunPSK" w:eastAsia="TH SarabunPSK" w:hAnsi="TH SarabunPSK" w:cs="TH SarabunPSK"/>
                 <w:sz w:val="30"/>
               </w:rPr>
               <w:t>5 ออเดอร์</w:t>
@@ -16557,12 +16310,9 @@
             <w:pPr>
               <w:jc w:val="center"/>
             </w:pPr>
-            <w:r/>
-            <w:r>
-              <w:rPr>
-                <w:rFonts w:ascii="TH SarabunPSK" w:hAnsi="TH SarabunPSK" w:cs="TH SarabunPSK" w:eastAsia="TH SarabunPSK"/>
-                <w:b w:val="0"/>
-                <w:i w:val="0"/>
+            <w:r>
+              <w:rPr>
+                <w:rFonts w:ascii="TH SarabunPSK" w:eastAsia="TH SarabunPSK" w:hAnsi="TH SarabunPSK" w:cs="TH SarabunPSK"/>
                 <w:sz w:val="30"/>
               </w:rPr>
               <w:t>฿2,524.00</w:t>
@@ -16585,12 +16335,9 @@
             <w:pPr>
               <w:jc w:val="center"/>
             </w:pPr>
-            <w:r/>
-            <w:r>
-              <w:rPr>
-                <w:rFonts w:ascii="TH SarabunPSK" w:hAnsi="TH SarabunPSK" w:cs="TH SarabunPSK" w:eastAsia="TH SarabunPSK"/>
-                <w:b w:val="0"/>
-                <w:i w:val="0"/>
+            <w:r>
+              <w:rPr>
+                <w:rFonts w:ascii="TH SarabunPSK" w:eastAsia="TH SarabunPSK" w:hAnsi="TH SarabunPSK" w:cs="TH SarabunPSK"/>
                 <w:sz w:val="30"/>
               </w:rPr>
               <w:t>5 ออเดอร์</w:t>
@@ -16613,12 +16360,9 @@
             <w:pPr>
               <w:jc w:val="center"/>
             </w:pPr>
-            <w:r/>
-            <w:r>
-              <w:rPr>
-                <w:rFonts w:ascii="TH SarabunPSK" w:hAnsi="TH SarabunPSK" w:cs="TH SarabunPSK" w:eastAsia="TH SarabunPSK"/>
-                <w:b w:val="0"/>
-                <w:i w:val="0"/>
+            <w:r>
+              <w:rPr>
+                <w:rFonts w:ascii="TH SarabunPSK" w:eastAsia="TH SarabunPSK" w:hAnsi="TH SarabunPSK" w:cs="TH SarabunPSK"/>
                 <w:sz w:val="30"/>
               </w:rPr>
               <w:t>0</w:t>
@@ -16641,12 +16385,9 @@
             <w:pPr>
               <w:jc w:val="center"/>
             </w:pPr>
-            <w:r/>
-            <w:r>
-              <w:rPr>
-                <w:rFonts w:ascii="TH SarabunPSK" w:hAnsi="TH SarabunPSK" w:cs="TH SarabunPSK" w:eastAsia="TH SarabunPSK"/>
-                <w:b w:val="0"/>
-                <w:i w:val="0"/>
+            <w:r>
+              <w:rPr>
+                <w:rFonts w:ascii="TH SarabunPSK" w:eastAsia="TH SarabunPSK" w:hAnsi="TH SarabunPSK" w:cs="TH SarabunPSK"/>
                 <w:sz w:val="30"/>
               </w:rPr>
               <w:t>0</w:t>
@@ -16672,17 +16413,13 @@
             <w:vAlign w:val="center"/>
           </w:tcPr>
           <w:p>
-            <w:pPr>
-              <w:jc w:val="left"/>
-            </w:pPr>
-            <w:r/>
-            <w:r>
-              <w:rPr>
-                <w:rFonts w:ascii="TH SarabunPSK" w:hAnsi="TH SarabunPSK" w:cs="TH SarabunPSK" w:eastAsia="TH SarabunPSK"/>
+            <w:r>
+              <w:rPr>
+                <w:rFonts w:ascii="TH SarabunPSK" w:eastAsia="TH SarabunPSK" w:hAnsi="TH SarabunPSK" w:cs="TH SarabunPSK"/>
                 <w:b/>
-                <w:i w:val="0"/>
-                <w:sz w:val="30"/>
-              </w:rPr>
+                <w:sz w:val="30"/>
+              </w:rPr>
+              <w:lastRenderedPageBreak/>
               <w:t>สมชาย สายโค้ด</w:t>
             </w:r>
           </w:p>
@@ -16700,15 +16437,9 @@
             <w:vAlign w:val="center"/>
           </w:tcPr>
           <w:p>
-            <w:pPr>
-              <w:jc w:val="left"/>
-            </w:pPr>
-            <w:r/>
-            <w:r>
-              <w:rPr>
-                <w:rFonts w:ascii="TH SarabunPSK" w:hAnsi="TH SarabunPSK" w:cs="TH SarabunPSK" w:eastAsia="TH SarabunPSK"/>
-                <w:b w:val="0"/>
-                <w:i w:val="0"/>
+            <w:r>
+              <w:rPr>
+                <w:rFonts w:ascii="TH SarabunPSK" w:eastAsia="TH SarabunPSK" w:hAnsi="TH SarabunPSK" w:cs="TH SarabunPSK"/>
                 <w:sz w:val="30"/>
               </w:rPr>
               <w:t>somchai.tech@gmail.com</w:t>
@@ -16731,12 +16462,9 @@
             <w:pPr>
               <w:jc w:val="center"/>
             </w:pPr>
-            <w:r/>
-            <w:r>
-              <w:rPr>
-                <w:rFonts w:ascii="TH SarabunPSK" w:hAnsi="TH SarabunPSK" w:cs="TH SarabunPSK" w:eastAsia="TH SarabunPSK"/>
-                <w:b w:val="0"/>
-                <w:i w:val="0"/>
+            <w:r>
+              <w:rPr>
+                <w:rFonts w:ascii="TH SarabunPSK" w:eastAsia="TH SarabunPSK" w:hAnsi="TH SarabunPSK" w:cs="TH SarabunPSK"/>
                 <w:sz w:val="30"/>
               </w:rPr>
               <w:t>6 ออเดอร์</w:t>
@@ -16759,12 +16487,9 @@
             <w:pPr>
               <w:jc w:val="center"/>
             </w:pPr>
-            <w:r/>
-            <w:r>
-              <w:rPr>
-                <w:rFonts w:ascii="TH SarabunPSK" w:hAnsi="TH SarabunPSK" w:cs="TH SarabunPSK" w:eastAsia="TH SarabunPSK"/>
-                <w:b w:val="0"/>
-                <w:i w:val="0"/>
+            <w:r>
+              <w:rPr>
+                <w:rFonts w:ascii="TH SarabunPSK" w:eastAsia="TH SarabunPSK" w:hAnsi="TH SarabunPSK" w:cs="TH SarabunPSK"/>
                 <w:sz w:val="30"/>
               </w:rPr>
               <w:t>฿2,035.00</w:t>
@@ -16787,12 +16512,9 @@
             <w:pPr>
               <w:jc w:val="center"/>
             </w:pPr>
-            <w:r/>
-            <w:r>
-              <w:rPr>
-                <w:rFonts w:ascii="TH SarabunPSK" w:hAnsi="TH SarabunPSK" w:cs="TH SarabunPSK" w:eastAsia="TH SarabunPSK"/>
-                <w:b w:val="0"/>
-                <w:i w:val="0"/>
+            <w:r>
+              <w:rPr>
+                <w:rFonts w:ascii="TH SarabunPSK" w:eastAsia="TH SarabunPSK" w:hAnsi="TH SarabunPSK" w:cs="TH SarabunPSK"/>
                 <w:sz w:val="30"/>
               </w:rPr>
               <w:t>4 ออเดอร์</w:t>
@@ -16815,12 +16537,9 @@
             <w:pPr>
               <w:jc w:val="center"/>
             </w:pPr>
-            <w:r/>
-            <w:r>
-              <w:rPr>
-                <w:rFonts w:ascii="TH SarabunPSK" w:hAnsi="TH SarabunPSK" w:cs="TH SarabunPSK" w:eastAsia="TH SarabunPSK"/>
-                <w:b w:val="0"/>
-                <w:i w:val="0"/>
+            <w:r>
+              <w:rPr>
+                <w:rFonts w:ascii="TH SarabunPSK" w:eastAsia="TH SarabunPSK" w:hAnsi="TH SarabunPSK" w:cs="TH SarabunPSK"/>
                 <w:sz w:val="30"/>
               </w:rPr>
               <w:t>1 ออเดอร์</w:t>
@@ -16843,12 +16562,9 @@
             <w:pPr>
               <w:jc w:val="center"/>
             </w:pPr>
-            <w:r/>
-            <w:r>
-              <w:rPr>
-                <w:rFonts w:ascii="TH SarabunPSK" w:hAnsi="TH SarabunPSK" w:cs="TH SarabunPSK" w:eastAsia="TH SarabunPSK"/>
-                <w:b w:val="0"/>
-                <w:i w:val="0"/>
+            <w:r>
+              <w:rPr>
+                <w:rFonts w:ascii="TH SarabunPSK" w:eastAsia="TH SarabunPSK" w:hAnsi="TH SarabunPSK" w:cs="TH SarabunPSK"/>
                 <w:sz w:val="30"/>
               </w:rPr>
               <w:t>1 ออเดอร์</w:t>
@@ -16874,15 +16590,10 @@
             <w:vAlign w:val="center"/>
           </w:tcPr>
           <w:p>
-            <w:pPr>
-              <w:jc w:val="left"/>
-            </w:pPr>
-            <w:r/>
-            <w:r>
-              <w:rPr>
-                <w:rFonts w:ascii="TH SarabunPSK" w:hAnsi="TH SarabunPSK" w:cs="TH SarabunPSK" w:eastAsia="TH SarabunPSK"/>
+            <w:r>
+              <w:rPr>
+                <w:rFonts w:ascii="TH SarabunPSK" w:eastAsia="TH SarabunPSK" w:hAnsi="TH SarabunPSK" w:cs="TH SarabunPSK"/>
                 <w:b/>
-                <w:i w:val="0"/>
                 <w:sz w:val="30"/>
               </w:rPr>
               <w:t>ธนวัฒน์ ศิลป์สว่าง</w:t>
@@ -16902,15 +16613,9 @@
             <w:vAlign w:val="center"/>
           </w:tcPr>
           <w:p>
-            <w:pPr>
-              <w:jc w:val="left"/>
-            </w:pPr>
-            <w:r/>
-            <w:r>
-              <w:rPr>
-                <w:rFonts w:ascii="TH SarabunPSK" w:hAnsi="TH SarabunPSK" w:cs="TH SarabunPSK" w:eastAsia="TH SarabunPSK"/>
-                <w:b w:val="0"/>
-                <w:i w:val="0"/>
+            <w:r>
+              <w:rPr>
+                <w:rFonts w:ascii="TH SarabunPSK" w:eastAsia="TH SarabunPSK" w:hAnsi="TH SarabunPSK" w:cs="TH SarabunPSK"/>
                 <w:sz w:val="30"/>
               </w:rPr>
               <w:t>tanawat.design@gmail.com</w:t>
@@ -16933,12 +16638,9 @@
             <w:pPr>
               <w:jc w:val="center"/>
             </w:pPr>
-            <w:r/>
-            <w:r>
-              <w:rPr>
-                <w:rFonts w:ascii="TH SarabunPSK" w:hAnsi="TH SarabunPSK" w:cs="TH SarabunPSK" w:eastAsia="TH SarabunPSK"/>
-                <w:b w:val="0"/>
-                <w:i w:val="0"/>
+            <w:r>
+              <w:rPr>
+                <w:rFonts w:ascii="TH SarabunPSK" w:eastAsia="TH SarabunPSK" w:hAnsi="TH SarabunPSK" w:cs="TH SarabunPSK"/>
                 <w:sz w:val="30"/>
               </w:rPr>
               <w:t>6 ออเดอร์</w:t>
@@ -16961,12 +16663,9 @@
             <w:pPr>
               <w:jc w:val="center"/>
             </w:pPr>
-            <w:r/>
-            <w:r>
-              <w:rPr>
-                <w:rFonts w:ascii="TH SarabunPSK" w:hAnsi="TH SarabunPSK" w:cs="TH SarabunPSK" w:eastAsia="TH SarabunPSK"/>
-                <w:b w:val="0"/>
-                <w:i w:val="0"/>
+            <w:r>
+              <w:rPr>
+                <w:rFonts w:ascii="TH SarabunPSK" w:eastAsia="TH SarabunPSK" w:hAnsi="TH SarabunPSK" w:cs="TH SarabunPSK"/>
                 <w:sz w:val="30"/>
               </w:rPr>
               <w:t>฿1,944.00</w:t>
@@ -16989,12 +16688,9 @@
             <w:pPr>
               <w:jc w:val="center"/>
             </w:pPr>
-            <w:r/>
-            <w:r>
-              <w:rPr>
-                <w:rFonts w:ascii="TH SarabunPSK" w:hAnsi="TH SarabunPSK" w:cs="TH SarabunPSK" w:eastAsia="TH SarabunPSK"/>
-                <w:b w:val="0"/>
-                <w:i w:val="0"/>
+            <w:r>
+              <w:rPr>
+                <w:rFonts w:ascii="TH SarabunPSK" w:eastAsia="TH SarabunPSK" w:hAnsi="TH SarabunPSK" w:cs="TH SarabunPSK"/>
                 <w:sz w:val="30"/>
               </w:rPr>
               <w:t>4 ออเดอร์</w:t>
@@ -17017,12 +16713,9 @@
             <w:pPr>
               <w:jc w:val="center"/>
             </w:pPr>
-            <w:r/>
-            <w:r>
-              <w:rPr>
-                <w:rFonts w:ascii="TH SarabunPSK" w:hAnsi="TH SarabunPSK" w:cs="TH SarabunPSK" w:eastAsia="TH SarabunPSK"/>
-                <w:b w:val="0"/>
-                <w:i w:val="0"/>
+            <w:r>
+              <w:rPr>
+                <w:rFonts w:ascii="TH SarabunPSK" w:eastAsia="TH SarabunPSK" w:hAnsi="TH SarabunPSK" w:cs="TH SarabunPSK"/>
                 <w:sz w:val="30"/>
               </w:rPr>
               <w:t>1 ออเดอร์</w:t>
@@ -17045,12 +16738,9 @@
             <w:pPr>
               <w:jc w:val="center"/>
             </w:pPr>
-            <w:r/>
-            <w:r>
-              <w:rPr>
-                <w:rFonts w:ascii="TH SarabunPSK" w:hAnsi="TH SarabunPSK" w:cs="TH SarabunPSK" w:eastAsia="TH SarabunPSK"/>
-                <w:b w:val="0"/>
-                <w:i w:val="0"/>
+            <w:r>
+              <w:rPr>
+                <w:rFonts w:ascii="TH SarabunPSK" w:eastAsia="TH SarabunPSK" w:hAnsi="TH SarabunPSK" w:cs="TH SarabunPSK"/>
                 <w:sz w:val="30"/>
               </w:rPr>
               <w:t>1 ออเดอร์</w:t>
@@ -17076,15 +16766,10 @@
             <w:vAlign w:val="center"/>
           </w:tcPr>
           <w:p>
-            <w:pPr>
-              <w:jc w:val="left"/>
-            </w:pPr>
-            <w:r/>
-            <w:r>
-              <w:rPr>
-                <w:rFonts w:ascii="TH SarabunPSK" w:hAnsi="TH SarabunPSK" w:cs="TH SarabunPSK" w:eastAsia="TH SarabunPSK"/>
+            <w:r>
+              <w:rPr>
+                <w:rFonts w:ascii="TH SarabunPSK" w:eastAsia="TH SarabunPSK" w:hAnsi="TH SarabunPSK" w:cs="TH SarabunPSK"/>
                 <w:b/>
-                <w:i w:val="0"/>
                 <w:sz w:val="30"/>
               </w:rPr>
               <w:t>วนิดา นักอ่านตัวยง</w:t>
@@ -17104,15 +16789,9 @@
             <w:vAlign w:val="center"/>
           </w:tcPr>
           <w:p>
-            <w:pPr>
-              <w:jc w:val="left"/>
-            </w:pPr>
-            <w:r/>
-            <w:r>
-              <w:rPr>
-                <w:rFonts w:ascii="TH SarabunPSK" w:hAnsi="TH SarabunPSK" w:cs="TH SarabunPSK" w:eastAsia="TH SarabunPSK"/>
-                <w:b w:val="0"/>
-                <w:i w:val="0"/>
+            <w:r>
+              <w:rPr>
+                <w:rFonts w:ascii="TH SarabunPSK" w:eastAsia="TH SarabunPSK" w:hAnsi="TH SarabunPSK" w:cs="TH SarabunPSK"/>
                 <w:sz w:val="30"/>
               </w:rPr>
               <w:t>wanida.read@hotmail.com</w:t>
@@ -17135,12 +16814,9 @@
             <w:pPr>
               <w:jc w:val="center"/>
             </w:pPr>
-            <w:r/>
-            <w:r>
-              <w:rPr>
-                <w:rFonts w:ascii="TH SarabunPSK" w:hAnsi="TH SarabunPSK" w:cs="TH SarabunPSK" w:eastAsia="TH SarabunPSK"/>
-                <w:b w:val="0"/>
-                <w:i w:val="0"/>
+            <w:r>
+              <w:rPr>
+                <w:rFonts w:ascii="TH SarabunPSK" w:eastAsia="TH SarabunPSK" w:hAnsi="TH SarabunPSK" w:cs="TH SarabunPSK"/>
                 <w:sz w:val="30"/>
               </w:rPr>
               <w:t>7 ออเดอร์</w:t>
@@ -17163,12 +16839,9 @@
             <w:pPr>
               <w:jc w:val="center"/>
             </w:pPr>
-            <w:r/>
-            <w:r>
-              <w:rPr>
-                <w:rFonts w:ascii="TH SarabunPSK" w:hAnsi="TH SarabunPSK" w:cs="TH SarabunPSK" w:eastAsia="TH SarabunPSK"/>
-                <w:b w:val="0"/>
-                <w:i w:val="0"/>
+            <w:r>
+              <w:rPr>
+                <w:rFonts w:ascii="TH SarabunPSK" w:eastAsia="TH SarabunPSK" w:hAnsi="TH SarabunPSK" w:cs="TH SarabunPSK"/>
                 <w:sz w:val="30"/>
               </w:rPr>
               <w:t>฿1,893.00</w:t>
@@ -17191,12 +16864,9 @@
             <w:pPr>
               <w:jc w:val="center"/>
             </w:pPr>
-            <w:r/>
-            <w:r>
-              <w:rPr>
-                <w:rFonts w:ascii="TH SarabunPSK" w:hAnsi="TH SarabunPSK" w:cs="TH SarabunPSK" w:eastAsia="TH SarabunPSK"/>
-                <w:b w:val="0"/>
-                <w:i w:val="0"/>
+            <w:r>
+              <w:rPr>
+                <w:rFonts w:ascii="TH SarabunPSK" w:eastAsia="TH SarabunPSK" w:hAnsi="TH SarabunPSK" w:cs="TH SarabunPSK"/>
                 <w:sz w:val="30"/>
               </w:rPr>
               <w:t>5 ออเดอร์</w:t>
@@ -17219,12 +16889,9 @@
             <w:pPr>
               <w:jc w:val="center"/>
             </w:pPr>
-            <w:r/>
-            <w:r>
-              <w:rPr>
-                <w:rFonts w:ascii="TH SarabunPSK" w:hAnsi="TH SarabunPSK" w:cs="TH SarabunPSK" w:eastAsia="TH SarabunPSK"/>
-                <w:b w:val="0"/>
-                <w:i w:val="0"/>
+            <w:r>
+              <w:rPr>
+                <w:rFonts w:ascii="TH SarabunPSK" w:eastAsia="TH SarabunPSK" w:hAnsi="TH SarabunPSK" w:cs="TH SarabunPSK"/>
                 <w:sz w:val="30"/>
               </w:rPr>
               <w:t>1 ออเดอร์</w:t>
@@ -17247,12 +16914,9 @@
             <w:pPr>
               <w:jc w:val="center"/>
             </w:pPr>
-            <w:r/>
-            <w:r>
-              <w:rPr>
-                <w:rFonts w:ascii="TH SarabunPSK" w:hAnsi="TH SarabunPSK" w:cs="TH SarabunPSK" w:eastAsia="TH SarabunPSK"/>
-                <w:b w:val="0"/>
-                <w:i w:val="0"/>
+            <w:r>
+              <w:rPr>
+                <w:rFonts w:ascii="TH SarabunPSK" w:eastAsia="TH SarabunPSK" w:hAnsi="TH SarabunPSK" w:cs="TH SarabunPSK"/>
                 <w:sz w:val="30"/>
               </w:rPr>
               <w:t>1 ออเดอร์</w:t>
@@ -17268,8 +16932,7 @@
       </w:pPr>
       <w:r>
         <w:rPr>
-          <w:rFonts w:ascii="TH SarabunPSK" w:hAnsi="TH SarabunPSK" w:cs="TH SarabunPSK" w:eastAsia="TH SarabunPSK"/>
-          <w:b w:val="0"/>
+          <w:rFonts w:ascii="TH SarabunPSK" w:eastAsia="TH SarabunPSK" w:hAnsi="TH SarabunPSK" w:cs="TH SarabunPSK"/>
           <w:i/>
           <w:sz w:val="32"/>
         </w:rPr>
@@ -17341,8 +17004,8 @@
       </w:pPr>
       <w:r>
         <w:drawing>
-          <wp:inline distT="0" distB="0" distL="0" distR="0" wp14:anchorId="01072380" wp14:editId="09E990D0">
-            <wp:extent cx="4754880" cy="2402205"/>
+          <wp:inline distT="0" distB="0" distL="0" distR="0" wp14:anchorId="0C16A530" wp14:editId="5BCBD5E9">
+            <wp:extent cx="4754880" cy="2436876"/>
             <wp:effectExtent l="0" t="0" r="0" b="0"/>
             <wp:docPr id="3" name="Picture 3"/>
             <wp:cNvGraphicFramePr>
@@ -17364,7 +17027,7 @@
                   <pic:spPr>
                     <a:xfrm>
                       <a:off x="0" y="0"/>
-                      <a:ext cx="4754880" cy="2402205"/>
+                      <a:ext cx="4754880" cy="2436876"/>
                     </a:xfrm>
                     <a:prstGeom prst="rect">
                       <a:avLst/>
@@ -17409,6 +17072,11 @@
       <w:pPr>
         <w:spacing w:after="80" w:line="240" w:lineRule="auto"/>
         <w:ind w:firstLine="720"/>
+        <w:rPr>
+          <w:rFonts w:hint="cs"/>
+          <w:cs/>
+          <w:lang w:bidi="th-TH"/>
+        </w:rPr>
       </w:pPr>
       <w:r>
         <w:rPr>
@@ -17426,8 +17094,8 @@
       </w:pPr>
       <w:r>
         <w:drawing>
-          <wp:inline distT="0" distB="0" distL="0" distR="0" wp14:anchorId="60652E97" wp14:editId="24B93096">
-            <wp:extent cx="4754880" cy="2402205"/>
+          <wp:inline distT="0" distB="0" distL="0" distR="0" wp14:anchorId="35DA43AE" wp14:editId="1163439B">
+            <wp:extent cx="4754880" cy="2436876"/>
             <wp:effectExtent l="0" t="0" r="0" b="0"/>
             <wp:docPr id="4" name="Picture 4"/>
             <wp:cNvGraphicFramePr>
@@ -17449,7 +17117,7 @@
                   <pic:spPr>
                     <a:xfrm>
                       <a:off x="0" y="0"/>
-                      <a:ext cx="4754880" cy="2402205"/>
+                      <a:ext cx="4754880" cy="2436876"/>
                     </a:xfrm>
                     <a:prstGeom prst="rect">
                       <a:avLst/>
@@ -17512,8 +17180,8 @@
       </w:pPr>
       <w:r>
         <w:drawing>
-          <wp:inline distT="0" distB="0" distL="0" distR="0" wp14:anchorId="6F899E7D" wp14:editId="0D9223DD">
-            <wp:extent cx="4754880" cy="2402205"/>
+          <wp:inline distT="0" distB="0" distL="0" distR="0" wp14:anchorId="2825392C" wp14:editId="370F18BD">
+            <wp:extent cx="4754880" cy="515112"/>
             <wp:effectExtent l="0" t="0" r="0" b="0"/>
             <wp:docPr id="5" name="Picture 5"/>
             <wp:cNvGraphicFramePr>
@@ -17535,7 +17203,7 @@
                   <pic:spPr>
                     <a:xfrm>
                       <a:off x="0" y="0"/>
-                      <a:ext cx="4754880" cy="2402205"/>
+                      <a:ext cx="4754880" cy="515112"/>
                     </a:xfrm>
                     <a:prstGeom prst="rect">
                       <a:avLst/>
@@ -17583,8 +17251,8 @@
       </w:pPr>
       <w:r>
         <w:drawing>
-          <wp:inline distT="0" distB="0" distL="0" distR="0" wp14:anchorId="3A7691E7" wp14:editId="71C822BB">
-            <wp:extent cx="4754880" cy="2402205"/>
+          <wp:inline distT="0" distB="0" distL="0" distR="0" wp14:anchorId="5934D6A3" wp14:editId="5B1B0C19">
+            <wp:extent cx="4754880" cy="2436876"/>
             <wp:effectExtent l="0" t="0" r="0" b="0"/>
             <wp:docPr id="6" name="Picture 6"/>
             <wp:cNvGraphicFramePr>
@@ -17606,7 +17274,7 @@
                   <pic:spPr>
                     <a:xfrm>
                       <a:off x="0" y="0"/>
-                      <a:ext cx="4754880" cy="2402205"/>
+                      <a:ext cx="4754880" cy="2436876"/>
                     </a:xfrm>
                     <a:prstGeom prst="rect">
                       <a:avLst/>
@@ -17685,8 +17353,8 @@
       </w:pPr>
       <w:r>
         <w:drawing>
-          <wp:inline distT="0" distB="0" distL="0" distR="0" wp14:anchorId="25E95BA4" wp14:editId="046D783A">
-            <wp:extent cx="4754880" cy="2402205"/>
+          <wp:inline distT="0" distB="0" distL="0" distR="0" wp14:anchorId="37ABEF9A" wp14:editId="5A13BC96">
+            <wp:extent cx="4754880" cy="515112"/>
             <wp:effectExtent l="0" t="0" r="0" b="0"/>
             <wp:docPr id="7" name="Picture 7"/>
             <wp:cNvGraphicFramePr>
@@ -17708,7 +17376,7 @@
                   <pic:spPr>
                     <a:xfrm>
                       <a:off x="0" y="0"/>
-                      <a:ext cx="4754880" cy="2402205"/>
+                      <a:ext cx="4754880" cy="515112"/>
                     </a:xfrm>
                     <a:prstGeom prst="rect">
                       <a:avLst/>
@@ -17770,8 +17438,8 @@
       </w:pPr>
       <w:r>
         <w:drawing>
-          <wp:inline distT="0" distB="0" distL="0" distR="0" wp14:anchorId="76A9EDC8" wp14:editId="70141201">
-            <wp:extent cx="4754880" cy="2402205"/>
+          <wp:inline distT="0" distB="0" distL="0" distR="0" wp14:anchorId="4236B7EF" wp14:editId="483B25D0">
+            <wp:extent cx="4754880" cy="2436876"/>
             <wp:effectExtent l="0" t="0" r="0" b="0"/>
             <wp:docPr id="8" name="Picture 8"/>
             <wp:cNvGraphicFramePr>
@@ -17793,7 +17461,7 @@
                   <pic:spPr>
                     <a:xfrm>
                       <a:off x="0" y="0"/>
-                      <a:ext cx="4754880" cy="2402205"/>
+                      <a:ext cx="4754880" cy="2436876"/>
                     </a:xfrm>
                     <a:prstGeom prst="rect">
                       <a:avLst/>
@@ -17862,8 +17530,8 @@
       </w:pPr>
       <w:r>
         <w:drawing>
-          <wp:inline distT="0" distB="0" distL="0" distR="0" wp14:anchorId="4D03B669" wp14:editId="2279B256">
-            <wp:extent cx="4754880" cy="2402205"/>
+          <wp:inline distT="0" distB="0" distL="0" distR="0" wp14:anchorId="20267C2C" wp14:editId="7F767521">
+            <wp:extent cx="4754880" cy="2436876"/>
             <wp:effectExtent l="0" t="0" r="0" b="0"/>
             <wp:docPr id="9" name="Picture 9"/>
             <wp:cNvGraphicFramePr>
@@ -17885,7 +17553,7 @@
                   <pic:spPr>
                     <a:xfrm>
                       <a:off x="0" y="0"/>
-                      <a:ext cx="4754880" cy="2402205"/>
+                      <a:ext cx="4754880" cy="2436876"/>
                     </a:xfrm>
                     <a:prstGeom prst="rect">
                       <a:avLst/>
@@ -19856,7 +19524,6 @@
             <w:pPr>
               <w:jc w:val="center"/>
             </w:pPr>
-            <w:r/>
             <w:r>
               <w:rPr>
                 <w:rFonts w:ascii="TH SarabunPSK" w:hAnsi="TH SarabunPSK" w:cs="TH SarabunPSK"/>
@@ -19883,11 +19550,9 @@
             <w:pPr>
               <w:jc w:val="center"/>
             </w:pPr>
-            <w:r/>
             <w:r>
               <w:rPr>
                 <w:rFonts w:ascii="TH SarabunPSK" w:hAnsi="TH SarabunPSK" w:cs="TH SarabunPSK"/>
-                <w:b w:val="0"/>
                 <w:sz w:val="28"/>
               </w:rPr>
               <w:t>Claude / Antigravity</w:t>
@@ -19907,14 +19572,9 @@
             <w:vAlign w:val="center"/>
           </w:tcPr>
           <w:p>
-            <w:pPr>
-              <w:jc w:val="left"/>
-            </w:pPr>
-            <w:r/>
             <w:r>
               <w:rPr>
                 <w:rFonts w:ascii="TH SarabunPSK" w:hAnsi="TH SarabunPSK" w:cs="TH SarabunPSK"/>
-                <w:b w:val="0"/>
                 <w:sz w:val="28"/>
               </w:rPr>
               <w:t>ช่วยออกแบบ ERD และโครงสร้าง 9 ตารางสำหรับร้านขาย E-Book ให้ตรงหลัก 3NF และมี Foreign Key ครบถ้วน</w:t>
@@ -19934,14 +19594,9 @@
             <w:vAlign w:val="center"/>
           </w:tcPr>
           <w:p>
-            <w:pPr>
-              <w:jc w:val="left"/>
-            </w:pPr>
-            <w:r/>
             <w:r>
               <w:rPr>
                 <w:rFonts w:ascii="TH SarabunPSK" w:hAnsi="TH SarabunPSK" w:cs="TH SarabunPSK"/>
-                <w:b w:val="0"/>
                 <w:sz w:val="28"/>
               </w:rPr>
               <w:t>นำโครงร่าง DDL และความสัมพันธ์ของตารางมาใช้เป็นจุดเริ่มต้น</w:t>
@@ -19961,14 +19616,9 @@
             <w:vAlign w:val="center"/>
           </w:tcPr>
           <w:p>
-            <w:pPr>
-              <w:jc w:val="left"/>
-            </w:pPr>
-            <w:r/>
             <w:r>
               <w:rPr>
                 <w:rFonts w:ascii="TH SarabunPSK" w:hAnsi="TH SarabunPSK" w:cs="TH SarabunPSK"/>
-                <w:b w:val="0"/>
                 <w:sz w:val="28"/>
               </w:rPr>
               <w:t>ตรวจสอบชนิดข้อมูล ปรับเงื่อนไขความปลอดภัย และทดสอบรันบน PostgreSQL บน Supabase Cloud จริง</w:t>
@@ -19997,7 +19647,6 @@
             <w:pPr>
               <w:jc w:val="center"/>
             </w:pPr>
-            <w:r/>
             <w:r>
               <w:rPr>
                 <w:rFonts w:ascii="TH SarabunPSK" w:hAnsi="TH SarabunPSK" w:cs="TH SarabunPSK"/>
@@ -20024,11 +19673,9 @@
             <w:pPr>
               <w:jc w:val="center"/>
             </w:pPr>
-            <w:r/>
             <w:r>
               <w:rPr>
                 <w:rFonts w:ascii="TH SarabunPSK" w:hAnsi="TH SarabunPSK" w:cs="TH SarabunPSK"/>
-                <w:b w:val="0"/>
                 <w:sz w:val="28"/>
               </w:rPr>
               <w:t>Claude / Antigravity</w:t>
@@ -20048,14 +19695,9 @@
             <w:vAlign w:val="center"/>
           </w:tcPr>
           <w:p>
-            <w:pPr>
-              <w:jc w:val="left"/>
-            </w:pPr>
-            <w:r/>
             <w:r>
               <w:rPr>
                 <w:rFonts w:ascii="TH SarabunPSK" w:hAnsi="TH SarabunPSK" w:cs="TH SarabunPSK"/>
-                <w:b w:val="0"/>
                 <w:sz w:val="28"/>
               </w:rPr>
               <w:t>ช่วยเขียน SQL Query รายงาน 4 ด้านตามเกณฑ์อาจารย์ประภาส ที่ใช้ JOIN, GROUP BY, HAVING, CASE WHEN, SUM, COUNT, AVG, LIMIT</w:t>
@@ -20075,14 +19717,9 @@
             <w:vAlign w:val="center"/>
           </w:tcPr>
           <w:p>
-            <w:pPr>
-              <w:jc w:val="left"/>
-            </w:pPr>
-            <w:r/>
             <w:r>
               <w:rPr>
                 <w:rFonts w:ascii="TH SarabunPSK" w:hAnsi="TH SarabunPSK" w:cs="TH SarabunPSK"/>
-                <w:b w:val="0"/>
                 <w:sz w:val="28"/>
               </w:rPr>
               <w:t>นำคำสั่ง SQL ทั้ง 4 ข้อมาปรับแต่ง</w:t>
@@ -20102,14 +19739,9 @@
             <w:vAlign w:val="center"/>
           </w:tcPr>
           <w:p>
-            <w:pPr>
-              <w:jc w:val="left"/>
-            </w:pPr>
-            <w:r/>
             <w:r>
               <w:rPr>
                 <w:rFonts w:ascii="TH SarabunPSK" w:hAnsi="TH SarabunPSK" w:cs="TH SarabunPSK"/>
-                <w:b w:val="0"/>
                 <w:sz w:val="28"/>
               </w:rPr>
               <w:t>รัน Query ใน SQL Editor บน Supabase เทียบกับข้อมูลตัวอย่างคำสั่งซื้อ ยืนยันความถูกต้องของผลรวม</w:t>
@@ -20138,7 +19770,6 @@
             <w:pPr>
               <w:jc w:val="center"/>
             </w:pPr>
-            <w:r/>
             <w:r>
               <w:rPr>
                 <w:rFonts w:ascii="TH SarabunPSK" w:hAnsi="TH SarabunPSK" w:cs="TH SarabunPSK"/>
@@ -20165,11 +19796,9 @@
             <w:pPr>
               <w:jc w:val="center"/>
             </w:pPr>
-            <w:r/>
             <w:r>
               <w:rPr>
                 <w:rFonts w:ascii="TH SarabunPSK" w:hAnsi="TH SarabunPSK" w:cs="TH SarabunPSK"/>
-                <w:b w:val="0"/>
                 <w:sz w:val="28"/>
               </w:rPr>
               <w:t>Claude / Antigravity</w:t>
@@ -20189,14 +19818,9 @@
             <w:vAlign w:val="center"/>
           </w:tcPr>
           <w:p>
-            <w:pPr>
-              <w:jc w:val="left"/>
-            </w:pPr>
-            <w:r/>
             <w:r>
               <w:rPr>
                 <w:rFonts w:ascii="TH SarabunPSK" w:hAnsi="TH SarabunPSK" w:cs="TH SarabunPSK"/>
-                <w:b w:val="0"/>
                 <w:sz w:val="28"/>
               </w:rPr>
               <w:t>ช่วยปรับแต่งสไตล์หน้าเว็บให้เป็นมินิมอล และทำ Route Guard หน้า 403</w:t>
@@ -20216,14 +19840,9 @@
             <w:vAlign w:val="center"/>
           </w:tcPr>
           <w:p>
-            <w:pPr>
-              <w:jc w:val="left"/>
-            </w:pPr>
-            <w:r/>
             <w:r>
               <w:rPr>
                 <w:rFonts w:ascii="TH SarabunPSK" w:hAnsi="TH SarabunPSK" w:cs="TH SarabunPSK"/>
-                <w:b w:val="0"/>
                 <w:sz w:val="28"/>
               </w:rPr>
               <w:t>ได้โครงร่างโค้ด CSS และฟังก์ชันตรวจสอบสิทธิ์ใน React</w:t>
@@ -20243,14 +19862,9 @@
             <w:vAlign w:val="center"/>
           </w:tcPr>
           <w:p>
-            <w:pPr>
-              <w:jc w:val="left"/>
-            </w:pPr>
-            <w:r/>
             <w:r>
               <w:rPr>
                 <w:rFonts w:ascii="TH SarabunPSK" w:hAnsi="TH SarabunPSK" w:cs="TH SarabunPSK"/>
-                <w:b w:val="0"/>
                 <w:sz w:val="28"/>
               </w:rPr>
               <w:t>ตรวจสอบการแสดงผลบนหน้าจอคอมพิวเตอร์และมือถือ ยืนยันว่าปุ่มหลังบ้านถูกซ่อนจากลูกค้าจริง</w:t>
@@ -20259,15 +19873,17 @@
         </w:tc>
       </w:tr>
       <w:tr>
-        <w:tc>
-          <w:tcPr>
-            <w:tcW w:type="dxa" w:w="1152"/>
+        <w:trPr>
+          <w:jc w:val="center"/>
+        </w:trPr>
+        <w:tc>
+          <w:tcPr>
+            <w:tcW w:w="1152" w:type="dxa"/>
           </w:tcPr>
           <w:p>
             <w:pPr>
               <w:jc w:val="center"/>
             </w:pPr>
-            <w:r/>
             <w:r>
               <w:rPr>
                 <w:rFonts w:ascii="TH SarabunPSK" w:hAnsi="TH SarabunPSK" w:cs="TH SarabunPSK"/>
@@ -20280,77 +19896,95 @@
         </w:tc>
         <w:tc>
           <w:tcPr>
-            <w:tcW w:type="dxa" w:w="1728"/>
+            <w:tcW w:w="1728" w:type="dxa"/>
           </w:tcPr>
           <w:p>
             <w:pPr>
               <w:jc w:val="center"/>
             </w:pPr>
-            <w:r/>
             <w:r>
               <w:rPr>
                 <w:rFonts w:ascii="TH SarabunPSK" w:hAnsi="TH SarabunPSK" w:cs="TH SarabunPSK"/>
-                <w:b w:val="0"/>
                 <w:sz w:val="28"/>
               </w:rPr>
-              <w:t>Claude / Antigravity</w:t>
-            </w:r>
-          </w:p>
-        </w:tc>
-        <w:tc>
-          <w:tcPr>
-            <w:tcW w:type="dxa" w:w="2160"/>
-          </w:tcPr>
-          <w:p>
-            <w:pPr>
-              <w:jc w:val="left"/>
-            </w:pPr>
-            <w:r/>
+              <w:t xml:space="preserve">Claude / </w:t>
+            </w:r>
             <w:r>
               <w:rPr>
                 <w:rFonts w:ascii="TH SarabunPSK" w:hAnsi="TH SarabunPSK" w:cs="TH SarabunPSK"/>
-                <w:b w:val="0"/>
                 <w:sz w:val="28"/>
               </w:rPr>
-              <w:t>ช่วยออกแบบ Test Matrix 8 กรณี ทั้ง Happy Path และ Negative Constraint Validation</w:t>
-            </w:r>
-          </w:p>
-        </w:tc>
-        <w:tc>
-          <w:tcPr>
-            <w:tcW w:type="dxa" w:w="1728"/>
-          </w:tcPr>
-          <w:p>
-            <w:pPr>
-              <w:jc w:val="left"/>
-            </w:pPr>
-            <w:r/>
+              <w:lastRenderedPageBreak/>
+              <w:t>Antigravity</w:t>
+            </w:r>
+          </w:p>
+        </w:tc>
+        <w:tc>
+          <w:tcPr>
+            <w:tcW w:w="2160" w:type="dxa"/>
+          </w:tcPr>
+          <w:p>
             <w:r>
               <w:rPr>
                 <w:rFonts w:ascii="TH SarabunPSK" w:hAnsi="TH SarabunPSK" w:cs="TH SarabunPSK"/>
-                <w:b w:val="0"/>
                 <w:sz w:val="28"/>
               </w:rPr>
-              <w:t>หัวข้อตารางกรณีทดสอบทั้ง 8 กรณี</w:t>
-            </w:r>
-          </w:p>
-        </w:tc>
-        <w:tc>
-          <w:tcPr>
-            <w:tcW w:type="dxa" w:w="1872"/>
-          </w:tcPr>
-          <w:p>
-            <w:pPr>
-              <w:jc w:val="left"/>
-            </w:pPr>
-            <w:r/>
+              <w:lastRenderedPageBreak/>
+              <w:t xml:space="preserve">ช่วยออกแบบ Test Matrix 8 กรณี ทั้ง Happy </w:t>
+            </w:r>
             <w:r>
               <w:rPr>
                 <w:rFonts w:ascii="TH SarabunPSK" w:hAnsi="TH SarabunPSK" w:cs="TH SarabunPSK"/>
-                <w:b w:val="0"/>
                 <w:sz w:val="28"/>
               </w:rPr>
-              <w:t>ลงมือทดสอบยิง Query ข้อมูลผิดรูปแบบจริงในฐานข้อมูลเพื่อยืนยันว่า Database Constraint สกัดกั้นได้จริง</w:t>
+              <w:lastRenderedPageBreak/>
+              <w:t>Path และ Negative Constraint Validation</w:t>
+            </w:r>
+          </w:p>
+        </w:tc>
+        <w:tc>
+          <w:tcPr>
+            <w:tcW w:w="1728" w:type="dxa"/>
+          </w:tcPr>
+          <w:p>
+            <w:r>
+              <w:rPr>
+                <w:rFonts w:ascii="TH SarabunPSK" w:hAnsi="TH SarabunPSK" w:cs="TH SarabunPSK"/>
+                <w:sz w:val="28"/>
+              </w:rPr>
+              <w:lastRenderedPageBreak/>
+              <w:t>หัวข้อตารางกรณีทด</w:t>
+            </w:r>
+            <w:r>
+              <w:rPr>
+                <w:rFonts w:ascii="TH SarabunPSK" w:hAnsi="TH SarabunPSK" w:cs="TH SarabunPSK"/>
+                <w:sz w:val="28"/>
+              </w:rPr>
+              <w:lastRenderedPageBreak/>
+              <w:t>สอบทั้ง 8 กรณี</w:t>
+            </w:r>
+          </w:p>
+        </w:tc>
+        <w:tc>
+          <w:tcPr>
+            <w:tcW w:w="1872" w:type="dxa"/>
+          </w:tcPr>
+          <w:p>
+            <w:r>
+              <w:rPr>
+                <w:rFonts w:ascii="TH SarabunPSK" w:hAnsi="TH SarabunPSK" w:cs="TH SarabunPSK"/>
+                <w:sz w:val="28"/>
+              </w:rPr>
+              <w:lastRenderedPageBreak/>
+              <w:t xml:space="preserve">ลงมือทดสอบยิง Query </w:t>
+            </w:r>
+            <w:r>
+              <w:rPr>
+                <w:rFonts w:ascii="TH SarabunPSK" w:hAnsi="TH SarabunPSK" w:cs="TH SarabunPSK"/>
+                <w:sz w:val="28"/>
+              </w:rPr>
+              <w:lastRenderedPageBreak/>
+              <w:t>ข้อมูลผิดรูปแบบจริงในฐานข้อมูลเพื่อยืนยันว่า Database Constraint สกัดกั้นได้จริง</w:t>
             </w:r>
           </w:p>
         </w:tc>
@@ -20367,6 +20001,7 @@
           <w:b/>
           <w:sz w:val="36"/>
         </w:rPr>
+        <w:lastRenderedPageBreak/>
         <w:t>7.2 ข้อเสนอแนะของ AI ที่ตัดสินใจปฏิเสธ</w:t>
       </w:r>
     </w:p>
@@ -20380,15 +20015,7 @@
           <w:rFonts w:ascii="TH SarabunPSK" w:eastAsia="TH SarabunPSK" w:hAnsi="TH SarabunPSK" w:cs="TH SarabunPSK"/>
           <w:sz w:val="32"/>
         </w:rPr>
-        <w:t xml:space="preserve">1. การเก็บข้อมูลสลิปเป็น Base64 ในตาราง payments: AI เสนอให้แปลงไฟล์สลิปเป็น Base64 แล้วเซฟลงฐานข้อมูลตรงๆ </w:t>
-      </w:r>
-      <w:r>
-        <w:rPr>
-          <w:rFonts w:ascii="TH SarabunPSK" w:eastAsia="TH SarabunPSK" w:hAnsi="TH SarabunPSK" w:cs="TH SarabunPSK"/>
-          <w:sz w:val="32"/>
-        </w:rPr>
-        <w:lastRenderedPageBreak/>
-        <w:t>แต่นักศึกษาปฏิเสธเนื่องจากจะทำให้ฐานข้อมูลมีขนาดใหญ่เกินความจำเป็นและลดประสิทธิภาพ จึงเลือกเก็บเป็น URL ชี้ไปยัง Cloud Storage แทน</w:t>
+        <w:t>1. การเก็บข้อมูลสลิปเป็น Base64 ในตาราง payments: AI เสนอให้แปลงไฟล์สลิปเป็น Base64 แล้วเซฟลงฐานข้อมูลตรงๆ แต่นักศึกษาปฏิเสธเนื่องจากจะทำให้ฐานข้อมูลมีขนาดใหญ่เกินความจำเป็นและลดประสิทธิภาพ จึงเลือกเก็บเป็น URL ชี้ไปยัง Cloud Storage แทน</w:t>
       </w:r>
     </w:p>
     <w:p>

</xml_diff>

<commit_message>
docs & reports: sync user document formatting adjustments for submission
</commit_message>
<xml_diff>
--- a/รายงาน_Mini_Project_Database_ร้านขาย_E-Book_2026.docx
+++ b/รายงาน_Mini_Project_Database_ร้านขาย_E-Book_2026.docx
@@ -9,9 +9,9 @@
       </w:pPr>
       <w:r>
         <w:drawing>
-          <wp:inline distT="0" distB="0" distL="0" distR="0" wp14:anchorId="05E17C93" wp14:editId="3674C694">
-            <wp:extent cx="1325880" cy="515112"/>
-            <wp:effectExtent l="0" t="0" r="0" b="0"/>
+          <wp:inline distT="0" distB="0" distL="0" distR="0" wp14:anchorId="05E17C93" wp14:editId="47B9B3FB">
+            <wp:extent cx="1438910" cy="2242893"/>
+            <wp:effectExtent l="0" t="0" r="0" b="5080"/>
             <wp:docPr id="1" name="Picture 1"/>
             <wp:cNvGraphicFramePr>
               <a:graphicFrameLocks xmlns:a="http://schemas.openxmlformats.org/drawingml/2006/main" noChangeAspect="1"/>
@@ -32,7 +32,7 @@
                   <pic:spPr>
                     <a:xfrm>
                       <a:off x="0" y="0"/>
-                      <a:ext cx="1325880" cy="515112"/>
+                      <a:ext cx="1452079" cy="2263420"/>
                     </a:xfrm>
                     <a:prstGeom prst="rect">
                       <a:avLst/>
@@ -70,7 +70,7 @@
           <w:b/>
           <w:sz w:val="40"/>
         </w:rPr>
-        <w:t>เรื่อง การวิเคราะห์และพัฒนาระบบร้านขายหนังสือและอีบุ๊กออนไลน์</w:t>
+        <w:t>เรื่อง ระบบร้านขายหนังสือและอีบุ๊กออนไลน์</w:t>
       </w:r>
       <w:r>
         <w:rPr>
@@ -78,9 +78,22 @@
           <w:b/>
           <w:sz w:val="40"/>
         </w:rPr>
-        <w:br/>
-        <w:t>ร้านหนังสือ Lampara Books</w:t>
-      </w:r>
+        <w:t xml:space="preserve"> </w:t>
+      </w:r>
+      <w:r>
+        <w:rPr>
+          <w:rFonts w:ascii="TH SarabunPSK" w:eastAsia="TH SarabunPSK" w:hAnsi="TH SarabunPSK" w:cs="TH SarabunPSK"/>
+          <w:b/>
+          <w:sz w:val="40"/>
+        </w:rPr>
+        <w:t>Lampara Books</w:t>
+      </w:r>
+    </w:p>
+    <w:p>
+      <w:pPr>
+        <w:spacing w:after="600"/>
+        <w:jc w:val="center"/>
+      </w:pPr>
     </w:p>
     <w:p>
       <w:pPr>
@@ -115,9 +128,22 @@
           <w:b/>
           <w:sz w:val="36"/>
         </w:rPr>
-        <w:br/>
-        <w:t>รหัสนักศึกษา 67332110223-9</w:t>
-      </w:r>
+        <w:t xml:space="preserve"> </w:t>
+      </w:r>
+      <w:r>
+        <w:rPr>
+          <w:rFonts w:ascii="TH SarabunPSK" w:eastAsia="TH SarabunPSK" w:hAnsi="TH SarabunPSK" w:cs="TH SarabunPSK"/>
+          <w:b/>
+          <w:sz w:val="36"/>
+        </w:rPr>
+        <w:t>67332110223-9</w:t>
+      </w:r>
+    </w:p>
+    <w:p>
+      <w:pPr>
+        <w:spacing w:after="560"/>
+        <w:jc w:val="center"/>
+      </w:pPr>
     </w:p>
     <w:p>
       <w:pPr>
@@ -3051,11 +3077,10 @@
         <w:jc w:val="center"/>
       </w:pPr>
       <w:r>
-        <w:lastRenderedPageBreak/>
         <w:drawing>
-          <wp:inline distT="0" distB="0" distL="0" distR="0" wp14:anchorId="38F2F7EE" wp14:editId="5C1E28F8">
-            <wp:extent cx="5303520" cy="515112"/>
-            <wp:effectExtent l="0" t="0" r="0" b="0"/>
+          <wp:inline distT="0" distB="0" distL="0" distR="0" wp14:anchorId="38F2F7EE" wp14:editId="647881EC">
+            <wp:extent cx="5301584" cy="3957145"/>
+            <wp:effectExtent l="0" t="0" r="0" b="5715"/>
             <wp:docPr id="2" name="Picture 2"/>
             <wp:cNvGraphicFramePr>
               <a:graphicFrameLocks xmlns:a="http://schemas.openxmlformats.org/drawingml/2006/main" noChangeAspect="1"/>
@@ -3076,7 +3101,7 @@
                   <pic:spPr>
                     <a:xfrm>
                       <a:off x="0" y="0"/>
-                      <a:ext cx="5303520" cy="515112"/>
+                      <a:ext cx="5364828" cy="4004350"/>
                     </a:xfrm>
                     <a:prstGeom prst="rect">
                       <a:avLst/>
@@ -3114,6 +3139,7 @@
           <w:b/>
           <w:sz w:val="36"/>
         </w:rPr>
+        <w:lastRenderedPageBreak/>
         <w:t>2.2 การจัดรูปแบบบรรทัดฐานระดับ 3NF</w:t>
       </w:r>
     </w:p>
@@ -4075,6 +4101,7 @@
                 <w:rFonts w:ascii="TH SarabunPSK" w:eastAsia="TH SarabunPSK" w:hAnsi="TH SarabunPSK" w:cs="TH SarabunPSK"/>
                 <w:sz w:val="30"/>
               </w:rPr>
+              <w:lastRenderedPageBreak/>
               <w:t>role_id</w:t>
             </w:r>
           </w:p>
@@ -4928,7 +4955,6 @@
                 <w:rFonts w:ascii="TH SarabunPSK" w:eastAsia="TH SarabunPSK" w:hAnsi="TH SarabunPSK" w:cs="TH SarabunPSK"/>
                 <w:sz w:val="30"/>
               </w:rPr>
-              <w:lastRenderedPageBreak/>
               <w:t>created_at</w:t>
             </w:r>
           </w:p>
@@ -6631,7 +6657,6 @@
           <w:b/>
           <w:sz w:val="32"/>
         </w:rPr>
-        <w:lastRenderedPageBreak/>
         <w:t>ตารางที่ 2.5 ตาราง books: ข้อมูลหนังสือดิจิทัล E-Book</w:t>
       </w:r>
     </w:p>
@@ -7826,6 +7851,7 @@
                 <w:rFonts w:ascii="TH SarabunPSK" w:eastAsia="TH SarabunPSK" w:hAnsi="TH SarabunPSK" w:cs="TH SarabunPSK"/>
                 <w:sz w:val="30"/>
               </w:rPr>
+              <w:lastRenderedPageBreak/>
               <w:t>is_active</w:t>
             </w:r>
           </w:p>
@@ -8638,7 +8664,6 @@
                 <w:rFonts w:ascii="TH SarabunPSK" w:eastAsia="TH SarabunPSK" w:hAnsi="TH SarabunPSK" w:cs="TH SarabunPSK"/>
                 <w:sz w:val="30"/>
               </w:rPr>
-              <w:lastRenderedPageBreak/>
               <w:t>total</w:t>
             </w:r>
           </w:p>
@@ -9773,6 +9798,7 @@
                 <w:rFonts w:ascii="TH SarabunPSK" w:eastAsia="TH SarabunPSK" w:hAnsi="TH SarabunPSK" w:cs="TH SarabunPSK"/>
                 <w:sz w:val="30"/>
               </w:rPr>
+              <w:lastRenderedPageBreak/>
               <w:t>price_at_time</w:t>
             </w:r>
           </w:p>
@@ -10511,7 +10537,6 @@
                 <w:rFonts w:ascii="TH SarabunPSK" w:eastAsia="TH SarabunPSK" w:hAnsi="TH SarabunPSK" w:cs="TH SarabunPSK"/>
                 <w:sz w:val="30"/>
               </w:rPr>
-              <w:lastRenderedPageBreak/>
               <w:t>amount</w:t>
             </w:r>
           </w:p>
@@ -11539,6 +11564,7 @@
                 <w:rFonts w:ascii="TH SarabunPSK" w:eastAsia="TH SarabunPSK" w:hAnsi="TH SarabunPSK" w:cs="TH SarabunPSK"/>
                 <w:sz w:val="30"/>
               </w:rPr>
+              <w:lastRenderedPageBreak/>
               <w:t>download_count</w:t>
             </w:r>
           </w:p>
@@ -14486,36 +14512,6 @@
     </w:p>
     <w:p>
       <w:pPr>
-        <w:spacing w:line="240" w:lineRule="auto"/>
-        <w:ind w:left="504" w:hanging="504"/>
-      </w:pPr>
-    </w:p>
-    <w:p>
-      <w:pPr>
-        <w:spacing w:line="240" w:lineRule="auto"/>
-        <w:ind w:left="504" w:hanging="504"/>
-      </w:pPr>
-    </w:p>
-    <w:p>
-      <w:pPr>
-        <w:spacing w:line="240" w:lineRule="auto"/>
-        <w:ind w:left="504" w:hanging="504"/>
-      </w:pPr>
-    </w:p>
-    <w:p>
-      <w:pPr>
-        <w:spacing w:line="240" w:lineRule="auto"/>
-        <w:ind w:left="504" w:hanging="504"/>
-      </w:pPr>
-    </w:p>
-    <w:p>
-      <w:pPr>
-        <w:spacing w:line="240" w:lineRule="auto"/>
-        <w:ind w:left="504" w:hanging="504"/>
-      </w:pPr>
-    </w:p>
-    <w:p>
-      <w:pPr>
         <w:keepNext/>
         <w:spacing w:before="200" w:after="80" w:line="240" w:lineRule="auto"/>
       </w:pPr>
@@ -14525,6 +14521,7 @@
           <w:b/>
           <w:sz w:val="36"/>
         </w:rPr>
+        <w:lastRenderedPageBreak/>
         <w:t>4.3 รายงานที่ 3: ยอดขายตามหมวดหมู่หนังสือ</w:t>
       </w:r>
     </w:p>
@@ -15556,48 +15553,6 @@
     </w:p>
     <w:p>
       <w:pPr>
-        <w:spacing w:line="240" w:lineRule="auto"/>
-        <w:ind w:left="504" w:hanging="504"/>
-      </w:pPr>
-    </w:p>
-    <w:p>
-      <w:pPr>
-        <w:spacing w:line="240" w:lineRule="auto"/>
-        <w:ind w:left="504" w:hanging="504"/>
-      </w:pPr>
-    </w:p>
-    <w:p>
-      <w:pPr>
-        <w:spacing w:line="240" w:lineRule="auto"/>
-        <w:ind w:left="504" w:hanging="504"/>
-      </w:pPr>
-    </w:p>
-    <w:p>
-      <w:pPr>
-        <w:spacing w:line="240" w:lineRule="auto"/>
-        <w:ind w:left="504" w:hanging="504"/>
-      </w:pPr>
-    </w:p>
-    <w:p>
-      <w:pPr>
-        <w:spacing w:line="240" w:lineRule="auto"/>
-        <w:ind w:left="504" w:hanging="504"/>
-      </w:pPr>
-    </w:p>
-    <w:p>
-      <w:pPr>
-        <w:spacing w:line="240" w:lineRule="auto"/>
-        <w:ind w:left="504" w:hanging="504"/>
-      </w:pPr>
-    </w:p>
-    <w:p>
-      <w:pPr>
-        <w:spacing w:line="240" w:lineRule="auto"/>
-        <w:ind w:left="504" w:hanging="504"/>
-      </w:pPr>
-    </w:p>
-    <w:p>
-      <w:pPr>
         <w:keepNext/>
         <w:spacing w:before="200" w:after="80" w:line="240" w:lineRule="auto"/>
       </w:pPr>
@@ -15696,6 +15651,14 @@
                 <w:sz w:val="19"/>
               </w:rPr>
               <w:br/>
+            </w:r>
+            <w:r>
+              <w:rPr>
+                <w:rFonts w:ascii="Consolas" w:eastAsia="Consolas" w:hAnsi="Consolas" w:cs="Consolas"/>
+                <w:color w:val="0F172A"/>
+                <w:sz w:val="19"/>
+              </w:rPr>
+              <w:lastRenderedPageBreak/>
               <w:t xml:space="preserve">    u.full_name,</w:t>
             </w:r>
             <w:r>
@@ -16419,7 +16382,6 @@
                 <w:b/>
                 <w:sz w:val="30"/>
               </w:rPr>
-              <w:lastRenderedPageBreak/>
               <w:t>สมชาย สายโค้ด</w:t>
             </w:r>
           </w:p>
@@ -17073,7 +17035,6 @@
         <w:spacing w:after="80" w:line="240" w:lineRule="auto"/>
         <w:ind w:firstLine="720"/>
         <w:rPr>
-          <w:rFonts w:hint="cs"/>
           <w:cs/>
           <w:lang w:bidi="th-TH"/>
         </w:rPr>
@@ -17303,45 +17264,20 @@
     </w:p>
     <w:p>
       <w:pPr>
+        <w:spacing w:before="40" w:after="120"/>
+        <w:jc w:val="center"/>
+      </w:pPr>
+    </w:p>
+    <w:p>
+      <w:pPr>
         <w:spacing w:after="80" w:line="240" w:lineRule="auto"/>
         <w:ind w:firstLine="720"/>
+      </w:pPr>
+      <w:r>
         <w:rPr>
           <w:rFonts w:ascii="TH SarabunPSK" w:eastAsia="TH SarabunPSK" w:hAnsi="TH SarabunPSK" w:cs="TH SarabunPSK"/>
           <w:sz w:val="32"/>
         </w:rPr>
-      </w:pPr>
-    </w:p>
-    <w:p>
-      <w:pPr>
-        <w:spacing w:after="80" w:line="240" w:lineRule="auto"/>
-        <w:ind w:firstLine="720"/>
-        <w:rPr>
-          <w:rFonts w:ascii="TH SarabunPSK" w:eastAsia="TH SarabunPSK" w:hAnsi="TH SarabunPSK" w:cs="TH SarabunPSK"/>
-          <w:sz w:val="32"/>
-        </w:rPr>
-      </w:pPr>
-    </w:p>
-    <w:p>
-      <w:pPr>
-        <w:spacing w:after="80" w:line="240" w:lineRule="auto"/>
-        <w:ind w:firstLine="720"/>
-        <w:rPr>
-          <w:rFonts w:ascii="TH SarabunPSK" w:eastAsia="TH SarabunPSK" w:hAnsi="TH SarabunPSK" w:cs="TH SarabunPSK"/>
-          <w:sz w:val="32"/>
-        </w:rPr>
-      </w:pPr>
-    </w:p>
-    <w:p>
-      <w:pPr>
-        <w:spacing w:after="80" w:line="240" w:lineRule="auto"/>
-        <w:ind w:firstLine="720"/>
-      </w:pPr>
-      <w:r>
-        <w:rPr>
-          <w:rFonts w:ascii="TH SarabunPSK" w:eastAsia="TH SarabunPSK" w:hAnsi="TH SarabunPSK" w:cs="TH SarabunPSK"/>
-          <w:sz w:val="32"/>
-        </w:rPr>
-        <w:lastRenderedPageBreak/>
         <w:t>ในทางกลับกัน เมื่อเข้าสู่ระบบด้วยสิทธิ์ผู้ดูแลระบบ แถบเมนูด้านบนจะแสดงปุ่มหลังบ้านพร้อมสถานะสิทธิ์อย่างเด่นชัด ทำให้ผู้ดูแลระบบสามารถเข้าถึงเมนูจัดการร้านค้าได้อย่างสะดวก ดังแสดงในภาพที่ 5.5</w:t>
       </w:r>
     </w:p>
@@ -17414,6 +17350,7 @@
           <w:b/>
           <w:sz w:val="36"/>
         </w:rPr>
+        <w:lastRenderedPageBreak/>
         <w:t>5.4 การจัดการหมวดหมู่และการจัดการร้านค้าหลังบ้าน</w:t>
       </w:r>
     </w:p>
@@ -17505,7 +17442,6 @@
           <w:b/>
           <w:sz w:val="36"/>
         </w:rPr>
-        <w:lastRenderedPageBreak/>
         <w:t>5.5 หน้าจอรายงานวิเคราะห์ธุรกิจและการส่งออกไฟล์ CSV</w:t>
       </w:r>
     </w:p>
@@ -19326,6 +19262,24 @@
     </w:p>
     <w:p>
       <w:pPr>
+        <w:spacing w:after="80" w:line="240" w:lineRule="auto"/>
+        <w:ind w:firstLine="720"/>
+      </w:pPr>
+    </w:p>
+    <w:p>
+      <w:pPr>
+        <w:spacing w:after="80" w:line="240" w:lineRule="auto"/>
+        <w:ind w:firstLine="720"/>
+      </w:pPr>
+    </w:p>
+    <w:p>
+      <w:pPr>
+        <w:spacing w:after="80" w:line="240" w:lineRule="auto"/>
+        <w:ind w:firstLine="720"/>
+      </w:pPr>
+    </w:p>
+    <w:p>
+      <w:pPr>
         <w:spacing w:after="40" w:line="240" w:lineRule="auto"/>
       </w:pPr>
       <w:r>
@@ -19776,6 +19730,7 @@
                 <w:b/>
                 <w:sz w:val="28"/>
               </w:rPr>
+              <w:lastRenderedPageBreak/>
               <w:t>14 ก.ย. 69</w:t>
             </w:r>
           </w:p>
@@ -19907,21 +19862,27 @@
                 <w:rFonts w:ascii="TH SarabunPSK" w:hAnsi="TH SarabunPSK" w:cs="TH SarabunPSK"/>
                 <w:sz w:val="28"/>
               </w:rPr>
-              <w:t xml:space="preserve">Claude / </w:t>
-            </w:r>
+              <w:t>Claude / Antigravity</w:t>
+            </w:r>
+          </w:p>
+        </w:tc>
+        <w:tc>
+          <w:tcPr>
+            <w:tcW w:w="2160" w:type="dxa"/>
+          </w:tcPr>
+          <w:p>
             <w:r>
               <w:rPr>
                 <w:rFonts w:ascii="TH SarabunPSK" w:hAnsi="TH SarabunPSK" w:cs="TH SarabunPSK"/>
                 <w:sz w:val="28"/>
               </w:rPr>
-              <w:lastRenderedPageBreak/>
-              <w:t>Antigravity</w:t>
-            </w:r>
-          </w:p>
-        </w:tc>
-        <w:tc>
-          <w:tcPr>
-            <w:tcW w:w="2160" w:type="dxa"/>
+              <w:t>ช่วยออกแบบ Test Matrix 8 กรณี ทั้ง Happy Path และ Negative Constraint Validation</w:t>
+            </w:r>
+          </w:p>
+        </w:tc>
+        <w:tc>
+          <w:tcPr>
+            <w:tcW w:w="1728" w:type="dxa"/>
           </w:tcPr>
           <w:p>
             <w:r>
@@ -19929,62 +19890,21 @@
                 <w:rFonts w:ascii="TH SarabunPSK" w:hAnsi="TH SarabunPSK" w:cs="TH SarabunPSK"/>
                 <w:sz w:val="28"/>
               </w:rPr>
-              <w:lastRenderedPageBreak/>
-              <w:t xml:space="preserve">ช่วยออกแบบ Test Matrix 8 กรณี ทั้ง Happy </w:t>
-            </w:r>
+              <w:t>หัวข้อตารางกรณีทดสอบทั้ง 8 กรณี</w:t>
+            </w:r>
+          </w:p>
+        </w:tc>
+        <w:tc>
+          <w:tcPr>
+            <w:tcW w:w="1872" w:type="dxa"/>
+          </w:tcPr>
+          <w:p>
             <w:r>
               <w:rPr>
                 <w:rFonts w:ascii="TH SarabunPSK" w:hAnsi="TH SarabunPSK" w:cs="TH SarabunPSK"/>
                 <w:sz w:val="28"/>
               </w:rPr>
-              <w:lastRenderedPageBreak/>
-              <w:t>Path และ Negative Constraint Validation</w:t>
-            </w:r>
-          </w:p>
-        </w:tc>
-        <w:tc>
-          <w:tcPr>
-            <w:tcW w:w="1728" w:type="dxa"/>
-          </w:tcPr>
-          <w:p>
-            <w:r>
-              <w:rPr>
-                <w:rFonts w:ascii="TH SarabunPSK" w:hAnsi="TH SarabunPSK" w:cs="TH SarabunPSK"/>
-                <w:sz w:val="28"/>
-              </w:rPr>
-              <w:lastRenderedPageBreak/>
-              <w:t>หัวข้อตารางกรณีทด</w:t>
-            </w:r>
-            <w:r>
-              <w:rPr>
-                <w:rFonts w:ascii="TH SarabunPSK" w:hAnsi="TH SarabunPSK" w:cs="TH SarabunPSK"/>
-                <w:sz w:val="28"/>
-              </w:rPr>
-              <w:lastRenderedPageBreak/>
-              <w:t>สอบทั้ง 8 กรณี</w:t>
-            </w:r>
-          </w:p>
-        </w:tc>
-        <w:tc>
-          <w:tcPr>
-            <w:tcW w:w="1872" w:type="dxa"/>
-          </w:tcPr>
-          <w:p>
-            <w:r>
-              <w:rPr>
-                <w:rFonts w:ascii="TH SarabunPSK" w:hAnsi="TH SarabunPSK" w:cs="TH SarabunPSK"/>
-                <w:sz w:val="28"/>
-              </w:rPr>
-              <w:lastRenderedPageBreak/>
-              <w:t xml:space="preserve">ลงมือทดสอบยิง Query </w:t>
-            </w:r>
-            <w:r>
-              <w:rPr>
-                <w:rFonts w:ascii="TH SarabunPSK" w:hAnsi="TH SarabunPSK" w:cs="TH SarabunPSK"/>
-                <w:sz w:val="28"/>
-              </w:rPr>
-              <w:lastRenderedPageBreak/>
-              <w:t>ข้อมูลผิดรูปแบบจริงในฐานข้อมูลเพื่อยืนยันว่า Database Constraint สกัดกั้นได้จริง</w:t>
+              <w:t>ลงมือทดสอบยิง Query ข้อมูลผิดรูปแบบจริงในฐานข้อมูลเพื่อยืนยันว่า Database Constraint สกัดกั้นได้จริง</w:t>
             </w:r>
           </w:p>
         </w:tc>
@@ -20001,7 +19921,6 @@
           <w:b/>
           <w:sz w:val="36"/>
         </w:rPr>
-        <w:lastRenderedPageBreak/>
         <w:t>7.2 ข้อเสนอแนะของ AI ที่ตัดสินใจปฏิเสธ</w:t>
       </w:r>
     </w:p>
@@ -20069,11 +19988,6 @@
           <w:sz w:val="32"/>
         </w:rPr>
         <w:t>ในการจัดทำโครงงานนี้ ไม่มีการนำข้อมูลส่วนบุคคลจริง เบอร์โทรศัพท์จริง หรือสลิปธนาคารจริงของบุคคลภายนอกมาใช้งานในระบบ ข้อมูลทั้งหมดในฐานข้อมูลเป็นข้อมูลตัวอย่างจำลองทั้งสิ้น เพื่อรักษาจริยธรรมการใช้งานข้อมูลและปฏิบัติตามกฎหมายคุ้มครองข้อมูลส่วนบุคคล</w:t>
-      </w:r>
-    </w:p>
-    <w:p>
-      <w:r>
-        <w:br w:type="page"/>
       </w:r>
     </w:p>
     <w:p>

</xml_diff>